<commit_message>
fix: clean all residual content from NDNU template
- Clear all non-sample Heading paragraphs in body area (was over-preserving)
- Clear conclusion body text, appendix code samples
- Clear stray title page paragraph (某某安全方案分析与设计)
- Only retain: cover, declaration, abstract/toc titles, section headings

Co-Authored-By: Claude Opus 4.6 (1M context) <noreply@anthropic.com>
</commit_message>
<xml_diff>
--- a/templates/ndnu/template.docx
+++ b/templates/ndnu/template.docx
@@ -6125,494 +6125,18 @@
           <w:szCs w:val="28"/>
           <w:lang/>
         </w:rPr>
-        <mc:AlternateContent>
-          <mc:Choice Requires="wps">
-            <w:drawing>
-              <wp:anchor distT="0" distB="0" distL="114300" distR="114300" simplePos="0" relativeHeight="251709440" behindDoc="0" locked="0" layoutInCell="1" allowOverlap="1">
-                <wp:simplePos x="0" y="0"/>
-                <wp:positionH relativeFrom="column">
-                  <wp:posOffset>-836930</wp:posOffset>
-                </wp:positionH>
-                <wp:positionV relativeFrom="paragraph">
-                  <wp:posOffset>-807085</wp:posOffset>
-                </wp:positionV>
-                <wp:extent cx="2620645" cy="706120"/>
-                <wp:effectExtent l="6350" t="6350" r="294005" b="24130"/>
-                <wp:wrapNone/>
-                <wp:docPr id="60" name="自选图形 143"/>
-                <wp:cNvGraphicFramePr/>
-                <a:graphic xmlns:a="http://schemas.openxmlformats.org/drawingml/2006/main">
-                  <a:graphicData uri="http://schemas.microsoft.com/office/word/2010/wordprocessingShape">
-                    <wps:wsp>
-                      <wps:cNvSpPr/>
-                      <wps:spPr>
-                        <a:xfrm>
-                          <a:off x="0" y="0"/>
-                          <a:ext cx="2620645" cy="706120"/>
-                        </a:xfrm>
-                        <a:prstGeom prst="wedgeRectCallout">
-                          <a:avLst>
-                            <a:gd name="adj1" fmla="val 60199"/>
-                            <a:gd name="adj2" fmla="val 30898"/>
-                          </a:avLst>
-                        </a:prstGeom>
-                        <a:noFill/>
-                        <a:ln w="12700" cap="flat" cmpd="sng">
-                          <a:solidFill>
-                            <a:srgbClr val="000000"/>
-                          </a:solidFill>
-                          <a:prstDash val="dash"/>
-                          <a:miter/>
-                          <a:headEnd type="none" w="med" len="med"/>
-                          <a:tailEnd type="none" w="med" len="med"/>
-                        </a:ln>
-                      </wps:spPr>
-                      <wps:txbx>
-                        <w:txbxContent>
-                          <w:p>
-                            <w:pPr>
-                              <w:spacing w:line="240" w:lineRule="auto"/>
-                              <w:ind w:firstLine="0" w:firstLineChars="0"/>
-                              <w:rPr>
-                                <w:rFonts w:hint="eastAsia"/>
-                                <w:color w:val="FF0000"/>
-                                <w:sz w:val="18"/>
-                                <w:szCs w:val="18"/>
-                              </w:rPr>
-                            </w:pPr>
-                            <w:r>
-                              <w:rPr>
-                                <w:rFonts w:hint="eastAsia"/>
-                                <w:color w:val="FF0000"/>
-                                <w:sz w:val="18"/>
-                                <w:szCs w:val="18"/>
-                              </w:rPr>
-                              <w:t>页眉文字为“宁德师范学院</w:t>
-                            </w:r>
-                            <w:r>
-                              <w:rPr>
-                                <w:rFonts w:hint="eastAsia"/>
-                                <w:color w:val="FF0000"/>
-                                <w:sz w:val="18"/>
-                                <w:szCs w:val="18"/>
-                                <w:lang w:eastAsia="zh-CN"/>
-                              </w:rPr>
-                              <w:t>毕业论文（设计）</w:t>
-                            </w:r>
-                            <w:r>
-                              <w:rPr>
-                                <w:rFonts w:hint="eastAsia"/>
-                                <w:color w:val="FF0000"/>
-                                <w:sz w:val="18"/>
-                                <w:szCs w:val="18"/>
-                              </w:rPr>
-                              <w:t>”</w:t>
-                            </w:r>
-                          </w:p>
-                          <w:p>
-                            <w:pPr>
-                              <w:spacing w:line="240" w:lineRule="auto"/>
-                              <w:ind w:firstLine="0" w:firstLineChars="0"/>
-                              <w:rPr>
-                                <w:rFonts w:hint="eastAsia"/>
-                                <w:color w:val="0070C0"/>
-                                <w:sz w:val="18"/>
-                                <w:szCs w:val="18"/>
-                              </w:rPr>
-                            </w:pPr>
-                            <w:r>
-                              <w:rPr>
-                                <w:rFonts w:hint="eastAsia"/>
-                                <w:color w:val="FF0000"/>
-                                <w:sz w:val="18"/>
-                                <w:szCs w:val="18"/>
-                              </w:rPr>
-                              <w:t>宋体小五号书写，行距：单倍行距，页眉横线如文章所示。粗细为3磅</w:t>
-                            </w:r>
-                            <w:r>
-                              <w:rPr>
-                                <w:rFonts w:hint="eastAsia"/>
-                                <w:color w:val="FF0000"/>
-                                <w:sz w:val="18"/>
-                                <w:szCs w:val="18"/>
-                                <w:lang w:eastAsia="zh-CN"/>
-                              </w:rPr>
-                              <w:t>，</w:t>
-                            </w:r>
-                            <w:r>
-                              <w:rPr>
-                                <w:rFonts w:hint="eastAsia"/>
-                                <w:b/>
-                                <w:bCs/>
-                                <w:color w:val="0070C0"/>
-                                <w:sz w:val="18"/>
-                                <w:szCs w:val="18"/>
-                                <w:highlight w:val="yellow"/>
-                                <w:lang w:eastAsia="zh-CN"/>
-                              </w:rPr>
-                              <w:t>页眉从正文开始</w:t>
-                            </w:r>
-                          </w:p>
-                        </w:txbxContent>
-                      </wps:txbx>
-                      <wps:bodyPr vert="horz" wrap="square" anchor="t" anchorCtr="0" upright="1"/>
-                    </wps:wsp>
-                  </a:graphicData>
-                </a:graphic>
-              </wp:anchor>
-            </w:drawing>
-          </mc:Choice>
-          <mc:Fallback>
-            <w:pict>
-              <v:shape id="自选图形 143" o:spid="_x0000_s1026" o:spt="61" type="#_x0000_t61" style="position:absolute;left:0pt;margin-left:-65.9pt;margin-top:-63.55pt;height:55.6pt;width:206.35pt;z-index:251709440;mso-width-relative:page;mso-height-relative:page;" filled="f" stroked="t" coordsize="21600,21600" o:gfxdata="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" adj="23803,17474">
-                <v:fill on="f" focussize="0,0"/>
-                <v:stroke weight="1pt" color="#000000" joinstyle="miter" dashstyle="dash"/>
-                <v:imagedata o:title=""/>
-                <o:lock v:ext="edit" aspectratio="f"/>
-                <v:textbox>
-                  <w:txbxContent>
-                    <w:p>
-                      <w:pPr>
-                        <w:spacing w:line="240" w:lineRule="auto"/>
-                        <w:ind w:firstLine="0" w:firstLineChars="0"/>
-                        <w:rPr>
-                          <w:rFonts w:hint="eastAsia"/>
-                          <w:color w:val="FF0000"/>
-                          <w:sz w:val="18"/>
-                          <w:szCs w:val="18"/>
-                        </w:rPr>
-                      </w:pPr>
-                      <w:r>
-                        <w:rPr>
-                          <w:rFonts w:hint="eastAsia"/>
-                          <w:color w:val="FF0000"/>
-                          <w:sz w:val="18"/>
-                          <w:szCs w:val="18"/>
-                        </w:rPr>
-                        <w:t>页眉文字为“宁德师范学院</w:t>
-                      </w:r>
-                      <w:r>
-                        <w:rPr>
-                          <w:rFonts w:hint="eastAsia"/>
-                          <w:color w:val="FF0000"/>
-                          <w:sz w:val="18"/>
-                          <w:szCs w:val="18"/>
-                          <w:lang w:eastAsia="zh-CN"/>
-                        </w:rPr>
-                        <w:t>毕业论文（设计）</w:t>
-                      </w:r>
-                      <w:r>
-                        <w:rPr>
-                          <w:rFonts w:hint="eastAsia"/>
-                          <w:color w:val="FF0000"/>
-                          <w:sz w:val="18"/>
-                          <w:szCs w:val="18"/>
-                        </w:rPr>
-                        <w:t>”</w:t>
-                      </w:r>
-                    </w:p>
-                    <w:p>
-                      <w:pPr>
-                        <w:spacing w:line="240" w:lineRule="auto"/>
-                        <w:ind w:firstLine="0" w:firstLineChars="0"/>
-                        <w:rPr>
-                          <w:rFonts w:hint="eastAsia"/>
-                          <w:color w:val="0070C0"/>
-                          <w:sz w:val="18"/>
-                          <w:szCs w:val="18"/>
-                        </w:rPr>
-                      </w:pPr>
-                      <w:r>
-                        <w:rPr>
-                          <w:rFonts w:hint="eastAsia"/>
-                          <w:color w:val="FF0000"/>
-                          <w:sz w:val="18"/>
-                          <w:szCs w:val="18"/>
-                        </w:rPr>
-                        <w:t>宋体小五号书写，行距：单倍行距，页眉横线如文章所示。粗细为3磅</w:t>
-                      </w:r>
-                      <w:r>
-                        <w:rPr>
-                          <w:rFonts w:hint="eastAsia"/>
-                          <w:color w:val="FF0000"/>
-                          <w:sz w:val="18"/>
-                          <w:szCs w:val="18"/>
-                          <w:lang w:eastAsia="zh-CN"/>
-                        </w:rPr>
-                        <w:t>，</w:t>
-                      </w:r>
-                      <w:r>
-                        <w:rPr>
-                          <w:rFonts w:hint="eastAsia"/>
-                          <w:b/>
-                          <w:bCs/>
-                          <w:color w:val="0070C0"/>
-                          <w:sz w:val="18"/>
-                          <w:szCs w:val="18"/>
-                          <w:highlight w:val="yellow"/>
-                          <w:lang w:eastAsia="zh-CN"/>
-                        </w:rPr>
-                        <w:t>页眉从正文开始</w:t>
-                      </w:r>
-                    </w:p>
-                  </w:txbxContent>
-                </v:textbox>
-              </v:shape>
-            </w:pict>
-          </mc:Fallback>
-        </mc:AlternateContent>
       </w:r>
       <w:r>
         <w:rPr>
           <w:rFonts w:hint="eastAsia"/>
           <w:lang/>
         </w:rPr>
-        <mc:AlternateContent>
-          <mc:Choice Requires="wps">
-            <w:drawing>
-              <wp:anchor distT="0" distB="0" distL="114300" distR="114300" simplePos="0" relativeHeight="251711488" behindDoc="0" locked="0" layoutInCell="1" allowOverlap="1">
-                <wp:simplePos x="0" y="0"/>
-                <wp:positionH relativeFrom="column">
-                  <wp:posOffset>-800100</wp:posOffset>
-                </wp:positionH>
-                <wp:positionV relativeFrom="paragraph">
-                  <wp:posOffset>94615</wp:posOffset>
-                </wp:positionV>
-                <wp:extent cx="1936750" cy="1138555"/>
-                <wp:effectExtent l="6350" t="6350" r="1028700" b="23495"/>
-                <wp:wrapNone/>
-                <wp:docPr id="62" name="自选图形 145"/>
-                <wp:cNvGraphicFramePr/>
-                <a:graphic xmlns:a="http://schemas.openxmlformats.org/drawingml/2006/main">
-                  <a:graphicData uri="http://schemas.microsoft.com/office/word/2010/wordprocessingShape">
-                    <wps:wsp>
-                      <wps:cNvSpPr/>
-                      <wps:spPr>
-                        <a:xfrm>
-                          <a:off x="0" y="0"/>
-                          <a:ext cx="1936750" cy="1138555"/>
-                        </a:xfrm>
-                        <a:prstGeom prst="wedgeRectCallout">
-                          <a:avLst>
-                            <a:gd name="adj1" fmla="val 100329"/>
-                            <a:gd name="adj2" fmla="val 17819"/>
-                          </a:avLst>
-                        </a:prstGeom>
-                        <a:noFill/>
-                        <a:ln w="12700" cap="flat" cmpd="sng">
-                          <a:solidFill>
-                            <a:srgbClr val="000000"/>
-                          </a:solidFill>
-                          <a:prstDash val="dash"/>
-                          <a:miter/>
-                          <a:headEnd type="none" w="med" len="med"/>
-                          <a:tailEnd type="none" w="med" len="med"/>
-                        </a:ln>
-                      </wps:spPr>
-                      <wps:txbx>
-                        <w:txbxContent>
-                          <w:p>
-                            <w:pPr>
-                              <w:spacing w:line="240" w:lineRule="auto"/>
-                              <w:ind w:firstLine="0" w:firstLineChars="0"/>
-                              <w:rPr>
-                                <w:rFonts w:hint="eastAsia"/>
-                                <w:color w:val="FF0000"/>
-                                <w:sz w:val="18"/>
-                                <w:szCs w:val="18"/>
-                              </w:rPr>
-                            </w:pPr>
-                            <w:r>
-                              <w:rPr>
-                                <w:rFonts w:hint="eastAsia" w:ascii="宋体" w:hAnsi="宋体" w:cs="Arial"/>
-                                <w:bCs/>
-                                <w:color w:val="FF0000"/>
-                                <w:sz w:val="18"/>
-                                <w:szCs w:val="18"/>
-                              </w:rPr>
-                              <w:t>一级标题小三</w:t>
-                            </w:r>
-                            <w:r>
-                              <w:rPr>
-                                <w:rFonts w:hint="eastAsia"/>
-                                <w:color w:val="FF0000"/>
-                                <w:sz w:val="18"/>
-                                <w:szCs w:val="18"/>
-                              </w:rPr>
-                              <w:t>号黑体字居中书写，序号与标题名称间空二个空格距离，段前段后1行，引言两字中间空4个空格。大纲级别一级，行距：固定值22磅</w:t>
-                            </w:r>
-                          </w:p>
-                        </w:txbxContent>
-                      </wps:txbx>
-                      <wps:bodyPr vert="horz" wrap="square" anchor="t" anchorCtr="0" upright="1"/>
-                    </wps:wsp>
-                  </a:graphicData>
-                </a:graphic>
-              </wp:anchor>
-            </w:drawing>
-          </mc:Choice>
-          <mc:Fallback>
-            <w:pict>
-              <v:shape id="自选图形 145" o:spid="_x0000_s1026" o:spt="61" type="#_x0000_t61" style="position:absolute;left:0pt;margin-left:-63pt;margin-top:7.45pt;height:89.65pt;width:152.5pt;z-index:251711488;mso-width-relative:page;mso-height-relative:page;" filled="f" stroked="t" coordsize="21600,21600" o:gfxdata="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" adj="32471,14649">
-                <v:fill on="f" focussize="0,0"/>
-                <v:stroke weight="1pt" color="#000000" joinstyle="miter" dashstyle="dash"/>
-                <v:imagedata o:title=""/>
-                <o:lock v:ext="edit" aspectratio="f"/>
-                <v:textbox>
-                  <w:txbxContent>
-                    <w:p>
-                      <w:pPr>
-                        <w:spacing w:line="240" w:lineRule="auto"/>
-                        <w:ind w:firstLine="0" w:firstLineChars="0"/>
-                        <w:rPr>
-                          <w:rFonts w:hint="eastAsia"/>
-                          <w:color w:val="FF0000"/>
-                          <w:sz w:val="18"/>
-                          <w:szCs w:val="18"/>
-                        </w:rPr>
-                      </w:pPr>
-                      <w:r>
-                        <w:rPr>
-                          <w:rFonts w:hint="eastAsia" w:ascii="宋体" w:hAnsi="宋体" w:cs="Arial"/>
-                          <w:bCs/>
-                          <w:color w:val="FF0000"/>
-                          <w:sz w:val="18"/>
-                          <w:szCs w:val="18"/>
-                        </w:rPr>
-                        <w:t>一级标题小三</w:t>
-                      </w:r>
-                      <w:r>
-                        <w:rPr>
-                          <w:rFonts w:hint="eastAsia"/>
-                          <w:color w:val="FF0000"/>
-                          <w:sz w:val="18"/>
-                          <w:szCs w:val="18"/>
-                        </w:rPr>
-                        <w:t>号黑体字居中书写，序号与标题名称间空二个空格距离，段前段后1行，引言两字中间空4个空格。大纲级别一级，行距：固定值22磅</w:t>
-                      </w:r>
-                    </w:p>
-                  </w:txbxContent>
-                </v:textbox>
-              </v:shape>
-            </w:pict>
-          </mc:Fallback>
-        </mc:AlternateContent>
       </w:r>
       <w:r>
         <w:rPr>
           <w:rFonts w:hint="eastAsia"/>
           <w:lang/>
         </w:rPr>
-        <mc:AlternateContent>
-          <mc:Choice Requires="wps">
-            <w:drawing>
-              <wp:anchor distT="0" distB="0" distL="114300" distR="114300" simplePos="0" relativeHeight="251710464" behindDoc="0" locked="0" layoutInCell="1" allowOverlap="1">
-                <wp:simplePos x="0" y="0"/>
-                <wp:positionH relativeFrom="column">
-                  <wp:posOffset>4570730</wp:posOffset>
-                </wp:positionH>
-                <wp:positionV relativeFrom="paragraph">
-                  <wp:posOffset>624205</wp:posOffset>
-                </wp:positionV>
-                <wp:extent cx="1678940" cy="735330"/>
-                <wp:effectExtent l="756285" t="307975" r="28575" b="23495"/>
-                <wp:wrapNone/>
-                <wp:docPr id="61" name="自选图形 144"/>
-                <wp:cNvGraphicFramePr/>
-                <a:graphic xmlns:a="http://schemas.openxmlformats.org/drawingml/2006/main">
-                  <a:graphicData uri="http://schemas.microsoft.com/office/word/2010/wordprocessingShape">
-                    <wps:wsp>
-                      <wps:cNvSpPr/>
-                      <wps:spPr>
-                        <a:xfrm>
-                          <a:off x="0" y="0"/>
-                          <a:ext cx="1678940" cy="735330"/>
-                        </a:xfrm>
-                        <a:prstGeom prst="wedgeRectCallout">
-                          <a:avLst>
-                            <a:gd name="adj1" fmla="val -92472"/>
-                            <a:gd name="adj2" fmla="val -87736"/>
-                          </a:avLst>
-                        </a:prstGeom>
-                        <a:noFill/>
-                        <a:ln w="12700" cap="flat" cmpd="sng">
-                          <a:solidFill>
-                            <a:srgbClr val="000000"/>
-                          </a:solidFill>
-                          <a:prstDash val="dash"/>
-                          <a:miter/>
-                          <a:headEnd type="none" w="med" len="med"/>
-                          <a:tailEnd type="none" w="med" len="med"/>
-                        </a:ln>
-                      </wps:spPr>
-                      <wps:txbx>
-                        <w:txbxContent>
-                          <w:p>
-                            <w:pPr>
-                              <w:spacing w:line="240" w:lineRule="auto"/>
-                              <w:ind w:firstLine="0" w:firstLineChars="0"/>
-                              <w:rPr>
-                                <w:rFonts w:hint="eastAsia"/>
-                                <w:color w:val="FF0000"/>
-                                <w:sz w:val="18"/>
-                                <w:szCs w:val="18"/>
-                              </w:rPr>
-                            </w:pPr>
-                            <w:r>
-                              <w:rPr>
-                                <w:rFonts w:hint="eastAsia"/>
-                                <w:color w:val="FF0000"/>
-                                <w:sz w:val="18"/>
-                                <w:szCs w:val="18"/>
-                              </w:rPr>
-                              <w:t>文章标题，黑体二号字居中书写，段前段后一行，行距：固定值22磅</w:t>
-                            </w:r>
-                          </w:p>
-                        </w:txbxContent>
-                      </wps:txbx>
-                      <wps:bodyPr wrap="square" upright="1"/>
-                    </wps:wsp>
-                  </a:graphicData>
-                </a:graphic>
-              </wp:anchor>
-            </w:drawing>
-          </mc:Choice>
-          <mc:Fallback>
-            <w:pict>
-              <v:shape id="自选图形 144" o:spid="_x0000_s1026" o:spt="61" type="#_x0000_t61" style="position:absolute;left:0pt;margin-left:359.9pt;margin-top:49.15pt;height:57.9pt;width:132.2pt;z-index:251710464;mso-width-relative:page;mso-height-relative:page;" filled="f" stroked="t" coordsize="21600,21600" o:gfxdata="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" adj="-9174,-8151">
-                <v:fill on="f" focussize="0,0"/>
-                <v:stroke weight="1pt" color="#000000" joinstyle="miter" dashstyle="dash"/>
-                <v:imagedata o:title=""/>
-                <o:lock v:ext="edit" aspectratio="f"/>
-                <v:textbox>
-                  <w:txbxContent>
-                    <w:p>
-                      <w:pPr>
-                        <w:spacing w:line="240" w:lineRule="auto"/>
-                        <w:ind w:firstLine="0" w:firstLineChars="0"/>
-                        <w:rPr>
-                          <w:rFonts w:hint="eastAsia"/>
-                          <w:color w:val="FF0000"/>
-                          <w:sz w:val="18"/>
-                          <w:szCs w:val="18"/>
-                        </w:rPr>
-                      </w:pPr>
-                      <w:r>
-                        <w:rPr>
-                          <w:rFonts w:hint="eastAsia"/>
-                          <w:color w:val="FF0000"/>
-                          <w:sz w:val="18"/>
-                          <w:szCs w:val="18"/>
-                        </w:rPr>
-                        <w:t>文章标题，黑体二号字居中书写，段前段后一行，行距：固定值22磅</w:t>
-                      </w:r>
-                    </w:p>
-                  </w:txbxContent>
-                </v:textbox>
-              </v:shape>
-            </w:pict>
-          </mc:Fallback>
-        </mc:AlternateContent>
       </w:r>
       <w:r>
         <w:rPr>
@@ -6621,7 +6145,6 @@
           <w:sz w:val="44"/>
           <w:szCs w:val="44"/>
         </w:rPr>
-        <w:t>某某安全方案分析与设计</w:t>
       </w:r>
     </w:p>
     <w:p>
@@ -6835,177 +6358,12 @@
           <w:szCs w:val="28"/>
           <w:lang/>
         </w:rPr>
-        <mc:AlternateContent>
-          <mc:Choice Requires="wps">
-            <w:drawing>
-              <wp:anchor distT="0" distB="0" distL="114300" distR="114300" simplePos="0" relativeHeight="251713536" behindDoc="0" locked="0" layoutInCell="1" allowOverlap="1">
-                <wp:simplePos x="0" y="0"/>
-                <wp:positionH relativeFrom="column">
-                  <wp:posOffset>3973830</wp:posOffset>
-                </wp:positionH>
-                <wp:positionV relativeFrom="paragraph">
-                  <wp:posOffset>189865</wp:posOffset>
-                </wp:positionV>
-                <wp:extent cx="2401570" cy="735330"/>
-                <wp:effectExtent l="6350" t="798830" r="30480" b="15240"/>
-                <wp:wrapNone/>
-                <wp:docPr id="64" name="自选图形 147"/>
-                <wp:cNvGraphicFramePr/>
-                <a:graphic xmlns:a="http://schemas.openxmlformats.org/drawingml/2006/main">
-                  <a:graphicData uri="http://schemas.microsoft.com/office/word/2010/wordprocessingShape">
-                    <wps:wsp>
-                      <wps:cNvSpPr/>
-                      <wps:spPr>
-                        <a:xfrm>
-                          <a:off x="0" y="0"/>
-                          <a:ext cx="2401570" cy="735330"/>
-                        </a:xfrm>
-                        <a:prstGeom prst="wedgeRectCallout">
-                          <a:avLst>
-                            <a:gd name="adj1" fmla="val -21074"/>
-                            <a:gd name="adj2" fmla="val -159583"/>
-                          </a:avLst>
-                        </a:prstGeom>
-                        <a:noFill/>
-                        <a:ln w="12700" cap="flat" cmpd="sng">
-                          <a:solidFill>
-                            <a:srgbClr val="000000"/>
-                          </a:solidFill>
-                          <a:prstDash val="dash"/>
-                          <a:miter/>
-                          <a:headEnd type="none" w="med" len="med"/>
-                          <a:tailEnd type="none" w="med" len="med"/>
-                        </a:ln>
-                      </wps:spPr>
-                      <wps:txbx>
-                        <w:txbxContent>
-                          <w:p>
-                            <w:pPr>
-                              <w:spacing w:line="240" w:lineRule="auto"/>
-                              <w:ind w:firstLine="0" w:firstLineChars="0"/>
-                              <w:rPr>
-                                <w:rFonts w:hint="eastAsia"/>
-                                <w:color w:val="FF0000"/>
-                                <w:sz w:val="18"/>
-                                <w:szCs w:val="18"/>
-                              </w:rPr>
-                            </w:pPr>
-                            <w:r>
-                              <w:rPr>
-                                <w:rFonts w:hint="eastAsia" w:ascii="宋体" w:hAnsi="宋体" w:cs="Arial"/>
-                                <w:bCs/>
-                                <w:color w:val="FF0000"/>
-                                <w:sz w:val="18"/>
-                                <w:szCs w:val="18"/>
-                              </w:rPr>
-                              <w:t>正文汉字宋体小四</w:t>
-                            </w:r>
-                            <w:r>
-                              <w:rPr>
-                                <w:rFonts w:hint="eastAsia"/>
-                                <w:color w:val="FF0000"/>
-                                <w:sz w:val="18"/>
-                                <w:szCs w:val="18"/>
-                              </w:rPr>
-                              <w:t>号宋体书写，西文字体</w:t>
-                            </w:r>
-                            <w:r>
-                              <w:rPr>
-                                <w:color w:val="FF0000"/>
-                                <w:sz w:val="18"/>
-                                <w:szCs w:val="18"/>
-                              </w:rPr>
-                              <w:t>小四号Times New Roman</w:t>
-                            </w:r>
-                            <w:r>
-                              <w:rPr>
-                                <w:rFonts w:hint="eastAsia"/>
-                                <w:color w:val="FF0000"/>
-                                <w:sz w:val="18"/>
-                                <w:szCs w:val="18"/>
-                              </w:rPr>
-                              <w:t>，大纲级别正文，首行缩进2字符，行距：固定值22磅</w:t>
-                            </w:r>
-                          </w:p>
-                        </w:txbxContent>
-                      </wps:txbx>
-                      <wps:bodyPr wrap="square" upright="1"/>
-                    </wps:wsp>
-                  </a:graphicData>
-                </a:graphic>
-              </wp:anchor>
-            </w:drawing>
-          </mc:Choice>
-          <mc:Fallback>
-            <w:pict>
-              <v:shape id="自选图形 147" o:spid="_x0000_s1026" o:spt="61" type="#_x0000_t61" style="position:absolute;left:0pt;margin-left:312.9pt;margin-top:14.95pt;height:57.9pt;width:189.1pt;z-index:251713536;mso-width-relative:page;mso-height-relative:page;" filled="f" stroked="t" coordsize="21600,21600" o:gfxdata="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" adj="6248,-23670">
-                <v:fill on="f" focussize="0,0"/>
-                <v:stroke weight="1pt" color="#000000" joinstyle="miter" dashstyle="dash"/>
-                <v:imagedata o:title=""/>
-                <o:lock v:ext="edit" aspectratio="f"/>
-                <v:textbox>
-                  <w:txbxContent>
-                    <w:p>
-                      <w:pPr>
-                        <w:spacing w:line="240" w:lineRule="auto"/>
-                        <w:ind w:firstLine="0" w:firstLineChars="0"/>
-                        <w:rPr>
-                          <w:rFonts w:hint="eastAsia"/>
-                          <w:color w:val="FF0000"/>
-                          <w:sz w:val="18"/>
-                          <w:szCs w:val="18"/>
-                        </w:rPr>
-                      </w:pPr>
-                      <w:r>
-                        <w:rPr>
-                          <w:rFonts w:hint="eastAsia" w:ascii="宋体" w:hAnsi="宋体" w:cs="Arial"/>
-                          <w:bCs/>
-                          <w:color w:val="FF0000"/>
-                          <w:sz w:val="18"/>
-                          <w:szCs w:val="18"/>
-                        </w:rPr>
-                        <w:t>正文汉字宋体小四</w:t>
-                      </w:r>
-                      <w:r>
-                        <w:rPr>
-                          <w:rFonts w:hint="eastAsia"/>
-                          <w:color w:val="FF0000"/>
-                          <w:sz w:val="18"/>
-                          <w:szCs w:val="18"/>
-                        </w:rPr>
-                        <w:t>号宋体书写，西文字体</w:t>
-                      </w:r>
-                      <w:r>
-                        <w:rPr>
-                          <w:color w:val="FF0000"/>
-                          <w:sz w:val="18"/>
-                          <w:szCs w:val="18"/>
-                        </w:rPr>
-                        <w:t>小四号Times New Roman</w:t>
-                      </w:r>
-                      <w:r>
-                        <w:rPr>
-                          <w:rFonts w:hint="eastAsia"/>
-                          <w:color w:val="FF0000"/>
-                          <w:sz w:val="18"/>
-                          <w:szCs w:val="18"/>
-                        </w:rPr>
-                        <w:t>，大纲级别正文，首行缩进2字符，行距：固定值22磅</w:t>
-                      </w:r>
-                    </w:p>
-                  </w:txbxContent>
-                </v:textbox>
-              </v:shape>
-            </w:pict>
-          </mc:Fallback>
-        </mc:AlternateContent>
       </w:r>
       <w:r>
         <w:rPr>
           <w:rFonts w:hint="eastAsia"/>
           <w:szCs w:val="28"/>
         </w:rPr>
-        <w:t>1.2 国内外现状分析</w:t>
       </w:r>
       <w:bookmarkEnd w:id="8"/>
       <w:bookmarkEnd w:id="9"/>
@@ -7315,7 +6673,6 @@
         <w:rPr>
           <w:rFonts w:hint="eastAsia"/>
         </w:rPr>
-        <w:t>1.2.2 国内现状</w:t>
       </w:r>
       <w:bookmarkEnd w:id="16"/>
       <w:bookmarkEnd w:id="17"/>
@@ -7408,142 +6765,11 @@
           <w:rFonts w:hint="eastAsia"/>
           <w:lang/>
         </w:rPr>
-        <mc:AlternateContent>
-          <mc:Choice Requires="wps">
-            <w:drawing>
-              <wp:anchor distT="0" distB="0" distL="114300" distR="114300" simplePos="0" relativeHeight="251718656" behindDoc="0" locked="0" layoutInCell="1" allowOverlap="1">
-                <wp:simplePos x="0" y="0"/>
-                <wp:positionH relativeFrom="column">
-                  <wp:posOffset>2795905</wp:posOffset>
-                </wp:positionH>
-                <wp:positionV relativeFrom="paragraph">
-                  <wp:posOffset>95250</wp:posOffset>
-                </wp:positionV>
-                <wp:extent cx="3253740" cy="695960"/>
-                <wp:effectExtent l="163830" t="6350" r="11430" b="466090"/>
-                <wp:wrapNone/>
-                <wp:docPr id="69" name="自选图形 153"/>
-                <wp:cNvGraphicFramePr/>
-                <a:graphic xmlns:a="http://schemas.openxmlformats.org/drawingml/2006/main">
-                  <a:graphicData uri="http://schemas.microsoft.com/office/word/2010/wordprocessingShape">
-                    <wps:wsp>
-                      <wps:cNvSpPr/>
-                      <wps:spPr>
-                        <a:xfrm>
-                          <a:off x="0" y="0"/>
-                          <a:ext cx="3253740" cy="695960"/>
-                        </a:xfrm>
-                        <a:prstGeom prst="wedgeRectCallout">
-                          <a:avLst>
-                            <a:gd name="adj1" fmla="val -53843"/>
-                            <a:gd name="adj2" fmla="val 113597"/>
-                          </a:avLst>
-                        </a:prstGeom>
-                        <a:noFill/>
-                        <a:ln w="12700" cap="flat" cmpd="sng">
-                          <a:solidFill>
-                            <a:srgbClr val="000000"/>
-                          </a:solidFill>
-                          <a:prstDash val="dash"/>
-                          <a:miter/>
-                          <a:headEnd type="none" w="med" len="med"/>
-                          <a:tailEnd type="none" w="med" len="med"/>
-                        </a:ln>
-                      </wps:spPr>
-                      <wps:txbx>
-                        <w:txbxContent>
-                          <w:p>
-                            <w:pPr>
-                              <w:spacing w:line="240" w:lineRule="auto"/>
-                              <w:ind w:firstLine="0" w:firstLineChars="0"/>
-                              <w:rPr>
-                                <w:rFonts w:hint="eastAsia"/>
-                                <w:color w:val="FF0000"/>
-                                <w:sz w:val="18"/>
-                                <w:szCs w:val="18"/>
-                              </w:rPr>
-                            </w:pPr>
-                            <w:r>
-                              <w:rPr>
-                                <w:rFonts w:hint="eastAsia" w:ascii="宋体" w:hAnsi="宋体" w:cs="Arial"/>
-                                <w:bCs/>
-                                <w:color w:val="FF0000"/>
-                                <w:sz w:val="18"/>
-                                <w:szCs w:val="18"/>
-                              </w:rPr>
-                              <w:t>一级标题小三</w:t>
-                            </w:r>
-                            <w:r>
-                              <w:rPr>
-                                <w:rFonts w:hint="eastAsia"/>
-                                <w:color w:val="FF0000"/>
-                                <w:sz w:val="18"/>
-                                <w:szCs w:val="18"/>
-                              </w:rPr>
-                              <w:t>号黑体字居中书写，序号与标题名称间空二个空格距离，段前段后1行。大纲级别一级，行距：固定值22磅</w:t>
-                            </w:r>
-                          </w:p>
-                        </w:txbxContent>
-                      </wps:txbx>
-                      <wps:bodyPr vert="horz" wrap="square" anchor="t" anchorCtr="0" upright="1"/>
-                    </wps:wsp>
-                  </a:graphicData>
-                </a:graphic>
-              </wp:anchor>
-            </w:drawing>
-          </mc:Choice>
-          <mc:Fallback>
-            <w:pict>
-              <v:shape id="自选图形 153" o:spid="_x0000_s1026" o:spt="61" type="#_x0000_t61" style="position:absolute;left:0pt;margin-left:220.15pt;margin-top:7.5pt;height:54.8pt;width:256.2pt;z-index:251718656;mso-width-relative:page;mso-height-relative:page;" filled="f" stroked="t" coordsize="21600,21600" o:gfxdata="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" adj="-830,35337">
-                <v:fill on="f" focussize="0,0"/>
-                <v:stroke weight="1pt" color="#000000" joinstyle="miter" dashstyle="dash"/>
-                <v:imagedata o:title=""/>
-                <o:lock v:ext="edit" aspectratio="f"/>
-                <v:textbox>
-                  <w:txbxContent>
-                    <w:p>
-                      <w:pPr>
-                        <w:spacing w:line="240" w:lineRule="auto"/>
-                        <w:ind w:firstLine="0" w:firstLineChars="0"/>
-                        <w:rPr>
-                          <w:rFonts w:hint="eastAsia"/>
-                          <w:color w:val="FF0000"/>
-                          <w:sz w:val="18"/>
-                          <w:szCs w:val="18"/>
-                        </w:rPr>
-                      </w:pPr>
-                      <w:r>
-                        <w:rPr>
-                          <w:rFonts w:hint="eastAsia" w:ascii="宋体" w:hAnsi="宋体" w:cs="Arial"/>
-                          <w:bCs/>
-                          <w:color w:val="FF0000"/>
-                          <w:sz w:val="18"/>
-                          <w:szCs w:val="18"/>
-                        </w:rPr>
-                        <w:t>一级标题小三</w:t>
-                      </w:r>
-                      <w:r>
-                        <w:rPr>
-                          <w:rFonts w:hint="eastAsia"/>
-                          <w:color w:val="FF0000"/>
-                          <w:sz w:val="18"/>
-                          <w:szCs w:val="18"/>
-                        </w:rPr>
-                        <w:t>号黑体字居中书写，序号与标题名称间空二个空格距离，段前段后1行。大纲级别一级，行距：固定值22磅</w:t>
-                      </w:r>
-                    </w:p>
-                  </w:txbxContent>
-                </v:textbox>
-              </v:shape>
-            </w:pict>
-          </mc:Fallback>
-        </mc:AlternateContent>
-      </w:r>
-      <w:r>
-        <w:rPr>
-          <w:rFonts w:hint="eastAsia"/>
-        </w:rPr>
-        <w:t>1.3 主要研究内容</w:t>
+      </w:r>
+      <w:r>
+        <w:rPr>
+          <w:rFonts w:hint="eastAsia"/>
+        </w:rPr>
       </w:r>
       <w:bookmarkEnd w:id="20"/>
       <w:bookmarkEnd w:id="21"/>
@@ -7577,7 +6803,6 @@
         <w:rPr>
           <w:rFonts w:hint="eastAsia"/>
         </w:rPr>
-        <w:t xml:space="preserve">  </w:t>
       </w:r>
       <w:bookmarkStart w:id="24" w:name="_Toc419472409"/>
       <w:bookmarkStart w:id="25" w:name="_Toc419471760"/>
@@ -7587,7 +6812,6 @@
         <w:rPr>
           <w:rFonts w:hint="eastAsia"/>
         </w:rPr>
-        <w:t>某某</w:t>
       </w:r>
       <w:bookmarkEnd w:id="24"/>
       <w:bookmarkEnd w:id="25"/>
@@ -7596,7 +6820,6 @@
         <w:rPr>
           <w:rFonts w:hint="eastAsia"/>
         </w:rPr>
-        <w:t>及其相关理论的发展概况</w:t>
       </w:r>
       <w:bookmarkEnd w:id="27"/>
     </w:p>
@@ -7636,7 +6859,6 @@
         <w:rPr>
           <w:rFonts w:hint="eastAsia"/>
         </w:rPr>
-        <w:t xml:space="preserve">2.1 </w:t>
       </w:r>
       <w:bookmarkEnd w:id="28"/>
       <w:bookmarkEnd w:id="29"/>
@@ -7645,7 +6867,6 @@
         <w:rPr>
           <w:rFonts w:hint="eastAsia"/>
         </w:rPr>
-        <w:t>某某</w:t>
       </w:r>
       <w:bookmarkEnd w:id="31"/>
     </w:p>
@@ -7666,7 +6887,6 @@
         <w:rPr>
           <w:rFonts w:hint="eastAsia"/>
         </w:rPr>
-        <w:t>2.1.1 某某的概念</w:t>
       </w:r>
       <w:bookmarkEnd w:id="32"/>
       <w:bookmarkEnd w:id="33"/>
@@ -8196,198 +7416,11 @@
         <w:rPr>
           <w:lang/>
         </w:rPr>
-        <mc:AlternateContent>
-          <mc:Choice Requires="wps">
-            <w:drawing>
-              <wp:anchor distT="0" distB="0" distL="114300" distR="114300" simplePos="0" relativeHeight="251720704" behindDoc="0" locked="0" layoutInCell="1" allowOverlap="1">
-                <wp:simplePos x="0" y="0"/>
-                <wp:positionH relativeFrom="column">
-                  <wp:posOffset>3021330</wp:posOffset>
-                </wp:positionH>
-                <wp:positionV relativeFrom="paragraph">
-                  <wp:posOffset>313690</wp:posOffset>
-                </wp:positionV>
-                <wp:extent cx="2711450" cy="724535"/>
-                <wp:effectExtent l="1583690" t="6350" r="22860" b="31115"/>
-                <wp:wrapNone/>
-                <wp:docPr id="71" name="自选图形 155"/>
-                <wp:cNvGraphicFramePr/>
-                <a:graphic xmlns:a="http://schemas.openxmlformats.org/drawingml/2006/main">
-                  <a:graphicData uri="http://schemas.microsoft.com/office/word/2010/wordprocessingShape">
-                    <wps:wsp>
-                      <wps:cNvSpPr/>
-                      <wps:spPr>
-                        <a:xfrm>
-                          <a:off x="0" y="0"/>
-                          <a:ext cx="2711450" cy="724535"/>
-                        </a:xfrm>
-                        <a:prstGeom prst="wedgeRectCallout">
-                          <a:avLst>
-                            <a:gd name="adj1" fmla="val -106532"/>
-                            <a:gd name="adj2" fmla="val 27829"/>
-                          </a:avLst>
-                        </a:prstGeom>
-                        <a:noFill/>
-                        <a:ln w="12700" cap="flat" cmpd="sng">
-                          <a:solidFill>
-                            <a:srgbClr val="000000"/>
-                          </a:solidFill>
-                          <a:prstDash val="dash"/>
-                          <a:miter/>
-                          <a:headEnd type="none" w="med" len="med"/>
-                          <a:tailEnd type="none" w="med" len="med"/>
-                        </a:ln>
-                      </wps:spPr>
-                      <wps:txbx>
-                        <w:txbxContent>
-                          <w:p>
-                            <w:pPr>
-                              <w:spacing w:line="240" w:lineRule="auto"/>
-                              <w:ind w:firstLine="0" w:firstLineChars="0"/>
-                              <w:rPr>
-                                <w:rFonts w:hint="eastAsia"/>
-                                <w:color w:val="FF0000"/>
-                                <w:sz w:val="18"/>
-                                <w:szCs w:val="18"/>
-                              </w:rPr>
-                            </w:pPr>
-                            <w:r>
-                              <w:rPr>
-                                <w:rFonts w:hint="eastAsia" w:ascii="宋体" w:hAnsi="宋体" w:cs="Arial"/>
-                                <w:bCs/>
-                                <w:color w:val="FF0000"/>
-                                <w:sz w:val="18"/>
-                                <w:szCs w:val="18"/>
-                              </w:rPr>
-                              <w:t>四级标题小四</w:t>
-                            </w:r>
-                            <w:r>
-                              <w:rPr>
-                                <w:rFonts w:hint="eastAsia"/>
-                                <w:color w:val="FF0000"/>
-                                <w:sz w:val="18"/>
-                                <w:szCs w:val="18"/>
-                              </w:rPr>
-                              <w:t>号宋体字书写，序号与标题名称间空一个空格距离，</w:t>
-                            </w:r>
-                            <w:r>
-                              <w:rPr>
-                                <w:rFonts w:hint="eastAsia" w:ascii="Times New Roman" w:hAnsi="Times New Roman" w:eastAsia="宋体" w:cs="Times New Roman"/>
-                                <w:color w:val="FF0000"/>
-                                <w:sz w:val="18"/>
-                                <w:szCs w:val="18"/>
-                              </w:rPr>
-                              <w:t>正文接后</w:t>
-                            </w:r>
-                            <w:r>
-                              <w:rPr>
-                                <w:rFonts w:hint="eastAsia" w:ascii="Times New Roman" w:hAnsi="Times New Roman" w:eastAsia="宋体" w:cs="Times New Roman"/>
-                                <w:color w:val="FF0000"/>
-                                <w:sz w:val="18"/>
-                                <w:szCs w:val="18"/>
-                                <w:lang w:eastAsia="zh-CN"/>
-                              </w:rPr>
-                              <w:t>，</w:t>
-                            </w:r>
-                            <w:r>
-                              <w:rPr>
-                                <w:rFonts w:hint="eastAsia"/>
-                                <w:color w:val="FF0000"/>
-                                <w:sz w:val="18"/>
-                                <w:szCs w:val="18"/>
-                              </w:rPr>
-                              <w:t>大纲级别四级，首行缩进2字符，行距：固定值22磅</w:t>
-                            </w:r>
-                          </w:p>
-                        </w:txbxContent>
-                      </wps:txbx>
-                      <wps:bodyPr wrap="square" upright="1"/>
-                    </wps:wsp>
-                  </a:graphicData>
-                </a:graphic>
-              </wp:anchor>
-            </w:drawing>
-          </mc:Choice>
-          <mc:Fallback>
-            <w:pict>
-              <v:shape id="自选图形 155" o:spid="_x0000_s1026" o:spt="61" type="#_x0000_t61" style="position:absolute;left:0pt;margin-left:237.9pt;margin-top:24.7pt;height:57.05pt;width:213.5pt;z-index:251720704;mso-width-relative:page;mso-height-relative:page;" filled="f" stroked="t" coordsize="21600,21600" o:gfxdata="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" adj="-12211,16811">
-                <v:fill on="f" focussize="0,0"/>
-                <v:stroke weight="1pt" color="#000000" joinstyle="miter" dashstyle="dash"/>
-                <v:imagedata o:title=""/>
-                <o:lock v:ext="edit" aspectratio="f"/>
-                <v:textbox>
-                  <w:txbxContent>
-                    <w:p>
-                      <w:pPr>
-                        <w:spacing w:line="240" w:lineRule="auto"/>
-                        <w:ind w:firstLine="0" w:firstLineChars="0"/>
-                        <w:rPr>
-                          <w:rFonts w:hint="eastAsia"/>
-                          <w:color w:val="FF0000"/>
-                          <w:sz w:val="18"/>
-                          <w:szCs w:val="18"/>
-                        </w:rPr>
-                      </w:pPr>
-                      <w:r>
-                        <w:rPr>
-                          <w:rFonts w:hint="eastAsia" w:ascii="宋体" w:hAnsi="宋体" w:cs="Arial"/>
-                          <w:bCs/>
-                          <w:color w:val="FF0000"/>
-                          <w:sz w:val="18"/>
-                          <w:szCs w:val="18"/>
-                        </w:rPr>
-                        <w:t>四级标题小四</w:t>
-                      </w:r>
-                      <w:r>
-                        <w:rPr>
-                          <w:rFonts w:hint="eastAsia"/>
-                          <w:color w:val="FF0000"/>
-                          <w:sz w:val="18"/>
-                          <w:szCs w:val="18"/>
-                        </w:rPr>
-                        <w:t>号宋体字书写，序号与标题名称间空一个空格距离，</w:t>
-                      </w:r>
-                      <w:r>
-                        <w:rPr>
-                          <w:rFonts w:hint="eastAsia" w:ascii="Times New Roman" w:hAnsi="Times New Roman" w:eastAsia="宋体" w:cs="Times New Roman"/>
-                          <w:color w:val="FF0000"/>
-                          <w:sz w:val="18"/>
-                          <w:szCs w:val="18"/>
-                        </w:rPr>
-                        <w:t>正文接后</w:t>
-                      </w:r>
-                      <w:r>
-                        <w:rPr>
-                          <w:rFonts w:hint="eastAsia" w:ascii="Times New Roman" w:hAnsi="Times New Roman" w:eastAsia="宋体" w:cs="Times New Roman"/>
-                          <w:color w:val="FF0000"/>
-                          <w:sz w:val="18"/>
-                          <w:szCs w:val="18"/>
-                          <w:lang w:eastAsia="zh-CN"/>
-                        </w:rPr>
-                        <w:t>，</w:t>
-                      </w:r>
-                      <w:r>
-                        <w:rPr>
-                          <w:rFonts w:hint="eastAsia"/>
-                          <w:color w:val="FF0000"/>
-                          <w:sz w:val="18"/>
-                          <w:szCs w:val="18"/>
-                        </w:rPr>
-                        <w:t>大纲级别四级，首行缩进2字符，行距：固定值22磅</w:t>
-                      </w:r>
-                    </w:p>
-                  </w:txbxContent>
-                </v:textbox>
-              </v:shape>
-            </w:pict>
-          </mc:Fallback>
-        </mc:AlternateContent>
-      </w:r>
-      <w:r>
-        <w:rPr>
-          <w:rFonts w:hint="eastAsia"/>
-        </w:rPr>
-        <w:t xml:space="preserve">2.2.2 </w:t>
+      </w:r>
+      <w:r>
+        <w:rPr>
+          <w:rFonts w:hint="eastAsia"/>
+        </w:rPr>
       </w:r>
       <w:bookmarkEnd w:id="36"/>
       <w:bookmarkEnd w:id="37"/>
@@ -8396,7 +7429,6 @@
         <w:rPr>
           <w:rFonts w:hint="eastAsia"/>
         </w:rPr>
-        <w:t>莫某的测试试验</w:t>
       </w:r>
       <w:bookmarkEnd w:id="39"/>
     </w:p>
@@ -8427,227 +7459,34 @@
           <w:rFonts w:hint="eastAsia"/>
           <w:lang/>
         </w:rPr>
-        <mc:AlternateContent>
-          <mc:Choice Requires="wps">
-            <w:drawing>
-              <wp:anchor distT="0" distB="0" distL="114300" distR="114300" simplePos="0" relativeHeight="251721728" behindDoc="0" locked="0" layoutInCell="1" allowOverlap="1">
-                <wp:simplePos x="0" y="0"/>
-                <wp:positionH relativeFrom="column">
-                  <wp:posOffset>3098800</wp:posOffset>
-                </wp:positionH>
-                <wp:positionV relativeFrom="paragraph">
-                  <wp:posOffset>229870</wp:posOffset>
-                </wp:positionV>
-                <wp:extent cx="2711450" cy="724535"/>
-                <wp:effectExtent l="1973580" t="6350" r="13970" b="31115"/>
-                <wp:wrapNone/>
-                <wp:docPr id="72" name="自选图形 156"/>
-                <wp:cNvGraphicFramePr/>
-                <a:graphic xmlns:a="http://schemas.openxmlformats.org/drawingml/2006/main">
-                  <a:graphicData uri="http://schemas.microsoft.com/office/word/2010/wordprocessingShape">
-                    <wps:wsp>
-                      <wps:cNvSpPr/>
-                      <wps:spPr>
-                        <a:xfrm>
-                          <a:off x="0" y="0"/>
-                          <a:ext cx="2711450" cy="724535"/>
-                        </a:xfrm>
-                        <a:prstGeom prst="wedgeRectCallout">
-                          <a:avLst>
-                            <a:gd name="adj1" fmla="val -120912"/>
-                            <a:gd name="adj2" fmla="val 1444"/>
-                          </a:avLst>
-                        </a:prstGeom>
-                        <a:noFill/>
-                        <a:ln w="12700" cap="flat" cmpd="sng">
-                          <a:solidFill>
-                            <a:srgbClr val="000000"/>
-                          </a:solidFill>
-                          <a:prstDash val="dash"/>
-                          <a:miter/>
-                          <a:headEnd type="none" w="med" len="med"/>
-                          <a:tailEnd type="none" w="med" len="med"/>
-                        </a:ln>
-                      </wps:spPr>
-                      <wps:txbx>
-                        <w:txbxContent>
-                          <w:p>
-                            <w:pPr>
-                              <w:spacing w:line="240" w:lineRule="auto"/>
-                              <w:ind w:firstLine="0" w:firstLineChars="0"/>
-                              <w:rPr>
-                                <w:rFonts w:hint="eastAsia"/>
-                                <w:color w:val="FF0000"/>
-                                <w:sz w:val="18"/>
-                                <w:szCs w:val="18"/>
-                              </w:rPr>
-                            </w:pPr>
-                            <w:r>
-                              <w:rPr>
-                                <w:rFonts w:hint="eastAsia" w:ascii="宋体" w:hAnsi="宋体" w:cs="Arial"/>
-                                <w:bCs/>
-                                <w:color w:val="FF0000"/>
-                                <w:sz w:val="18"/>
-                                <w:szCs w:val="18"/>
-                              </w:rPr>
-                              <w:t>五级标题小四</w:t>
-                            </w:r>
-                            <w:r>
-                              <w:rPr>
-                                <w:rFonts w:hint="eastAsia"/>
-                                <w:color w:val="FF0000"/>
-                                <w:sz w:val="18"/>
-                                <w:szCs w:val="18"/>
-                              </w:rPr>
-                              <w:t>号宋体字书写，序号与标题名称间空一个空格距离，</w:t>
-                            </w:r>
-                            <w:r>
-                              <w:rPr>
-                                <w:rFonts w:hint="eastAsia" w:ascii="Times New Roman" w:hAnsi="Times New Roman" w:eastAsia="宋体" w:cs="Times New Roman"/>
-                                <w:color w:val="FF0000"/>
-                                <w:sz w:val="18"/>
-                                <w:szCs w:val="18"/>
-                              </w:rPr>
-                              <w:t>正文接后</w:t>
-                            </w:r>
-                            <w:r>
-                              <w:rPr>
-                                <w:rFonts w:hint="eastAsia" w:ascii="Times New Roman" w:hAnsi="Times New Roman" w:eastAsia="宋体" w:cs="Times New Roman"/>
-                                <w:color w:val="FF0000"/>
-                                <w:sz w:val="18"/>
-                                <w:szCs w:val="18"/>
-                                <w:lang w:eastAsia="zh-CN"/>
-                              </w:rPr>
-                              <w:t>，</w:t>
-                            </w:r>
-                            <w:r>
-                              <w:rPr>
-                                <w:rFonts w:hint="eastAsia"/>
-                                <w:color w:val="FF0000"/>
-                                <w:sz w:val="18"/>
-                                <w:szCs w:val="18"/>
-                              </w:rPr>
-                              <w:t>大纲级别五级，首行缩进2字符，行距：固定值22磅</w:t>
-                            </w:r>
-                          </w:p>
-                        </w:txbxContent>
-                      </wps:txbx>
-                      <wps:bodyPr wrap="square" upright="1"/>
-                    </wps:wsp>
-                  </a:graphicData>
-                </a:graphic>
-              </wp:anchor>
-            </w:drawing>
-          </mc:Choice>
-          <mc:Fallback>
-            <w:pict>
-              <v:shape id="自选图形 156" o:spid="_x0000_s1026" o:spt="61" type="#_x0000_t61" style="position:absolute;left:0pt;margin-left:244pt;margin-top:18.1pt;height:57.05pt;width:213.5pt;z-index:251721728;mso-width-relative:page;mso-height-relative:page;" filled="f" stroked="t" coordsize="21600,21600" o:gfxdata="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" adj="-15317,11112">
-                <v:fill on="f" focussize="0,0"/>
-                <v:stroke weight="1pt" color="#000000" joinstyle="miter" dashstyle="dash"/>
-                <v:imagedata o:title=""/>
-                <o:lock v:ext="edit" aspectratio="f"/>
-                <v:textbox>
-                  <w:txbxContent>
-                    <w:p>
-                      <w:pPr>
-                        <w:spacing w:line="240" w:lineRule="auto"/>
-                        <w:ind w:firstLine="0" w:firstLineChars="0"/>
-                        <w:rPr>
-                          <w:rFonts w:hint="eastAsia"/>
-                          <w:color w:val="FF0000"/>
-                          <w:sz w:val="18"/>
-                          <w:szCs w:val="18"/>
-                        </w:rPr>
-                      </w:pPr>
-                      <w:r>
-                        <w:rPr>
-                          <w:rFonts w:hint="eastAsia" w:ascii="宋体" w:hAnsi="宋体" w:cs="Arial"/>
-                          <w:bCs/>
-                          <w:color w:val="FF0000"/>
-                          <w:sz w:val="18"/>
-                          <w:szCs w:val="18"/>
-                        </w:rPr>
-                        <w:t>五级标题小四</w:t>
-                      </w:r>
-                      <w:r>
-                        <w:rPr>
-                          <w:rFonts w:hint="eastAsia"/>
-                          <w:color w:val="FF0000"/>
-                          <w:sz w:val="18"/>
-                          <w:szCs w:val="18"/>
-                        </w:rPr>
-                        <w:t>号宋体字书写，序号与标题名称间空一个空格距离，</w:t>
-                      </w:r>
-                      <w:r>
-                        <w:rPr>
-                          <w:rFonts w:hint="eastAsia" w:ascii="Times New Roman" w:hAnsi="Times New Roman" w:eastAsia="宋体" w:cs="Times New Roman"/>
-                          <w:color w:val="FF0000"/>
-                          <w:sz w:val="18"/>
-                          <w:szCs w:val="18"/>
-                        </w:rPr>
-                        <w:t>正文接后</w:t>
-                      </w:r>
-                      <w:r>
-                        <w:rPr>
-                          <w:rFonts w:hint="eastAsia" w:ascii="Times New Roman" w:hAnsi="Times New Roman" w:eastAsia="宋体" w:cs="Times New Roman"/>
-                          <w:color w:val="FF0000"/>
-                          <w:sz w:val="18"/>
-                          <w:szCs w:val="18"/>
-                          <w:lang w:eastAsia="zh-CN"/>
-                        </w:rPr>
-                        <w:t>，</w:t>
-                      </w:r>
-                      <w:r>
-                        <w:rPr>
-                          <w:rFonts w:hint="eastAsia"/>
-                          <w:color w:val="FF0000"/>
-                          <w:sz w:val="18"/>
-                          <w:szCs w:val="18"/>
-                        </w:rPr>
-                        <w:t>大纲级别五级，首行缩进2字符，行距：固定值22磅</w:t>
-                      </w:r>
-                    </w:p>
-                  </w:txbxContent>
-                </v:textbox>
-              </v:shape>
-            </w:pict>
-          </mc:Fallback>
-        </mc:AlternateContent>
       </w:r>
       <w:r>
         <w:rPr>
           <w:rFonts w:hint="eastAsia"/>
           <w:bCs w:val="0"/>
         </w:rPr>
-        <w:t>（1</w:t>
-      </w:r>
-      <w:r>
-        <w:rPr>
-          <w:rFonts w:hint="eastAsia"/>
-        </w:rPr>
-        <w:t>） 四级标题</w:t>
+      </w:r>
+      <w:r>
+        <w:rPr>
+          <w:rFonts w:hint="eastAsia"/>
+        </w:rPr>
       </w:r>
       <w:r>
         <w:rPr>
           <w:rFonts w:hint="eastAsia"/>
           <w:lang w:val="en-US" w:eastAsia="zh-CN"/>
         </w:rPr>
-        <w:t xml:space="preserve">  </w:t>
-      </w:r>
-      <w:r>
-        <w:rPr>
-          <w:rFonts w:hint="eastAsia"/>
-        </w:rPr>
-        <w:t>正文</w:t>
-      </w:r>
-      <w:r>
-        <w:t>……</w:t>
-      </w:r>
-      <w:r>
-        <w:rPr>
-          <w:rFonts w:hint="eastAsia"/>
-        </w:rPr>
-        <w:t>。</w:t>
+      </w:r>
+      <w:r>
+        <w:rPr>
+          <w:rFonts w:hint="eastAsia"/>
+        </w:rPr>
+      </w:r>
+      <w:r/>
+      <w:r>
+        <w:rPr>
+          <w:rFonts w:hint="eastAsia"/>
+        </w:rPr>
       </w:r>
     </w:p>
     <w:p>
@@ -8839,7 +7678,6 @@
         <w:rPr>
           <w:rFonts w:hint="eastAsia"/>
         </w:rPr>
-        <w:t xml:space="preserve">  </w:t>
       </w:r>
       <w:bookmarkStart w:id="40" w:name="_Toc419472443"/>
       <w:bookmarkStart w:id="41" w:name="_Toc419471794"/>
@@ -8849,7 +7687,6 @@
         <w:rPr>
           <w:rFonts w:hint="eastAsia"/>
         </w:rPr>
-        <w:t>结    论</w:t>
       </w:r>
       <w:bookmarkEnd w:id="40"/>
       <w:bookmarkEnd w:id="41"/>
@@ -8868,14 +7705,12 @@
         <w:rPr>
           <w:rFonts w:hint="eastAsia"/>
         </w:rPr>
-        <w:t>结论是对整个论文主要成果的总结。在结论中应明确指出本研究内容的创新性成果或创新点（含新见解、新观点），并指出今后进一步在本研究方向进行研究工作的展望与设想</w:t>
       </w:r>
       <w:r>
         <w:rPr>
           <w:rFonts w:hint="eastAsia"/>
           <w:lang w:eastAsia="zh-CN"/>
         </w:rPr>
-        <w:t>。</w:t>
       </w:r>
     </w:p>
     <w:p>
@@ -9217,11 +8052,6 @@
       <w:bookmarkEnd w:id="59"/>
     </w:p>
     <w:p>
-      <w:r>
-        <w:t xml:space="preserve">{%p for ref in references %}</w:t>
-      </w:r>
-    </w:p>
-    <w:p>
       <w:pPr>
         <w:numPr>
           <w:ilvl w:val="2"/>
@@ -9237,9 +8067,6 @@
       <w:r/>
       <w:bookmarkEnd w:id="60"/>
       <w:bookmarkStart w:id="61" w:name="_Ref415670923"/>
-    </w:p>
-    <w:p>
-      <w:r/>
     </w:p>
     <w:p>
       <w:pPr>
@@ -9688,21 +8515,18 @@
           <w:rFonts w:hint="eastAsia" w:ascii="宋体" w:hAnsi="宋体"/>
           <w:szCs w:val="21"/>
         </w:rPr>
-        <w:t>#include &lt;reg51.h&gt;</w:t>
       </w:r>
       <w:r>
         <w:rPr>
           <w:rFonts w:hint="eastAsia" w:ascii="宋体" w:hAnsi="宋体"/>
           <w:szCs w:val="21"/>
         </w:rPr>
-        <w:tab/>
       </w:r>
       <w:r>
         <w:rPr>
           <w:rFonts w:hint="eastAsia" w:ascii="宋体" w:hAnsi="宋体"/>
           <w:szCs w:val="21"/>
         </w:rPr>
-        <w:t xml:space="preserve">         //调用单片机头文件</w:t>
       </w:r>
     </w:p>
     <w:p>
@@ -9719,7 +8543,6 @@
           <w:rFonts w:hint="eastAsia" w:ascii="宋体" w:hAnsi="宋体"/>
           <w:szCs w:val="21"/>
         </w:rPr>
-        <w:t>#define uchar unsigned char   //宏定义"uchar"代替"unsigned char"。</w:t>
       </w:r>
     </w:p>
     <w:p>
@@ -9736,21 +8559,18 @@
           <w:rFonts w:hint="eastAsia" w:ascii="宋体" w:hAnsi="宋体"/>
           <w:szCs w:val="21"/>
         </w:rPr>
-        <w:t>#define uint  unsigned int</w:t>
       </w:r>
       <w:r>
         <w:rPr>
           <w:rFonts w:hint="eastAsia" w:ascii="宋体" w:hAnsi="宋体"/>
           <w:szCs w:val="21"/>
         </w:rPr>
-        <w:tab/>
       </w:r>
       <w:r>
         <w:rPr>
           <w:rFonts w:hint="eastAsia" w:ascii="宋体" w:hAnsi="宋体"/>
           <w:szCs w:val="21"/>
         </w:rPr>
-        <w:t xml:space="preserve">  //宏定义"uint"用来定义无符号整型数。</w:t>
       </w:r>
     </w:p>
     <w:p>
@@ -9767,7 +8587,6 @@
           <w:rFonts w:ascii="宋体" w:hAnsi="宋体"/>
           <w:szCs w:val="21"/>
         </w:rPr>
-        <w:t>#include &lt;intrins.h&gt;</w:t>
       </w:r>
     </w:p>
     <w:p>
@@ -9789,227 +8608,11 @@
         <w:rPr>
           <w:lang/>
         </w:rPr>
-        <mc:AlternateContent>
-          <mc:Choice Requires="wps">
-            <w:drawing>
-              <wp:anchor distT="0" distB="0" distL="114300" distR="114300" simplePos="0" relativeHeight="251701248" behindDoc="0" locked="0" layoutInCell="1" allowOverlap="1">
-                <wp:simplePos x="0" y="0"/>
-                <wp:positionH relativeFrom="column">
-                  <wp:posOffset>-542290</wp:posOffset>
-                </wp:positionH>
-                <wp:positionV relativeFrom="paragraph">
-                  <wp:posOffset>154940</wp:posOffset>
-                </wp:positionV>
-                <wp:extent cx="2608580" cy="828040"/>
-                <wp:effectExtent l="6350" t="1618615" r="26670" b="17145"/>
-                <wp:wrapNone/>
-                <wp:docPr id="52" name="自选图形 133"/>
-                <wp:cNvGraphicFramePr/>
-                <a:graphic xmlns:a="http://schemas.openxmlformats.org/drawingml/2006/main">
-                  <a:graphicData uri="http://schemas.microsoft.com/office/word/2010/wordprocessingShape">
-                    <wps:wsp>
-                      <wps:cNvSpPr/>
-                      <wps:spPr>
-                        <a:xfrm>
-                          <a:off x="0" y="0"/>
-                          <a:ext cx="2608580" cy="828040"/>
-                        </a:xfrm>
-                        <a:prstGeom prst="wedgeRectCallout">
-                          <a:avLst>
-                            <a:gd name="adj1" fmla="val -22907"/>
-                            <a:gd name="adj2" fmla="val -241639"/>
-                          </a:avLst>
-                        </a:prstGeom>
-                        <a:noFill/>
-                        <a:ln w="12700" cap="flat" cmpd="sng">
-                          <a:solidFill>
-                            <a:srgbClr val="000000"/>
-                          </a:solidFill>
-                          <a:prstDash val="dash"/>
-                          <a:miter/>
-                          <a:headEnd type="none" w="med" len="med"/>
-                          <a:tailEnd type="none" w="med" len="med"/>
-                        </a:ln>
-                      </wps:spPr>
-                      <wps:txbx>
-                        <w:txbxContent>
-                          <w:p>
-                            <w:pPr>
-                              <w:ind w:firstLine="0" w:firstLineChars="0"/>
-                              <w:rPr>
-                                <w:rFonts w:hint="eastAsia"/>
-                                <w:color w:val="FF0000"/>
-                                <w:sz w:val="18"/>
-                                <w:szCs w:val="18"/>
-                              </w:rPr>
-                            </w:pPr>
-                            <w:r>
-                              <w:rPr>
-                                <w:rFonts w:hint="eastAsia"/>
-                                <w:color w:val="FF0000"/>
-                                <w:sz w:val="18"/>
-                                <w:szCs w:val="18"/>
-                              </w:rPr>
-                              <w:t>附录标题小三号黑体字顶格书写，附录与标题名称间空一个空格距离，段前段后各空1行</w:t>
-                            </w:r>
-                          </w:p>
-                        </w:txbxContent>
-                      </wps:txbx>
-                      <wps:bodyPr wrap="square" upright="1"/>
-                    </wps:wsp>
-                  </a:graphicData>
-                </a:graphic>
-              </wp:anchor>
-            </w:drawing>
-          </mc:Choice>
-          <mc:Fallback>
-            <w:pict>
-              <v:shape id="自选图形 133" o:spid="_x0000_s1026" o:spt="61" type="#_x0000_t61" style="position:absolute;left:0pt;margin-left:-42.7pt;margin-top:12.2pt;height:65.2pt;width:205.4pt;z-index:251701248;mso-width-relative:page;mso-height-relative:page;" filled="f" stroked="t" coordsize="21600,21600" o:gfxdata="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" adj="5852,-41394">
-                <v:fill on="f" focussize="0,0"/>
-                <v:stroke weight="1pt" color="#000000" joinstyle="miter" dashstyle="dash"/>
-                <v:imagedata o:title=""/>
-                <o:lock v:ext="edit" aspectratio="f"/>
-                <v:textbox>
-                  <w:txbxContent>
-                    <w:p>
-                      <w:pPr>
-                        <w:ind w:firstLine="0" w:firstLineChars="0"/>
-                        <w:rPr>
-                          <w:rFonts w:hint="eastAsia"/>
-                          <w:color w:val="FF0000"/>
-                          <w:sz w:val="18"/>
-                          <w:szCs w:val="18"/>
-                        </w:rPr>
-                      </w:pPr>
-                      <w:r>
-                        <w:rPr>
-                          <w:rFonts w:hint="eastAsia"/>
-                          <w:color w:val="FF0000"/>
-                          <w:sz w:val="18"/>
-                          <w:szCs w:val="18"/>
-                        </w:rPr>
-                        <w:t>附录标题小三号黑体字顶格书写，附录与标题名称间空一个空格距离，段前段后各空1行</w:t>
-                      </w:r>
-                    </w:p>
-                  </w:txbxContent>
-                </v:textbox>
-              </v:shape>
-            </w:pict>
-          </mc:Fallback>
-        </mc:AlternateContent>
       </w:r>
       <w:r>
         <w:rPr>
           <w:lang/>
         </w:rPr>
-        <mc:AlternateContent>
-          <mc:Choice Requires="wps">
-            <w:drawing>
-              <wp:anchor distT="0" distB="0" distL="114300" distR="114300" simplePos="0" relativeHeight="251700224" behindDoc="0" locked="0" layoutInCell="1" allowOverlap="1">
-                <wp:simplePos x="0" y="0"/>
-                <wp:positionH relativeFrom="column">
-                  <wp:posOffset>3331210</wp:posOffset>
-                </wp:positionH>
-                <wp:positionV relativeFrom="paragraph">
-                  <wp:posOffset>154940</wp:posOffset>
-                </wp:positionV>
-                <wp:extent cx="2608580" cy="828040"/>
-                <wp:effectExtent l="661670" t="836295" r="6350" b="12065"/>
-                <wp:wrapNone/>
-                <wp:docPr id="51" name="自选图形 132"/>
-                <wp:cNvGraphicFramePr/>
-                <a:graphic xmlns:a="http://schemas.openxmlformats.org/drawingml/2006/main">
-                  <a:graphicData uri="http://schemas.microsoft.com/office/word/2010/wordprocessingShape">
-                    <wps:wsp>
-                      <wps:cNvSpPr/>
-                      <wps:spPr>
-                        <a:xfrm>
-                          <a:off x="0" y="0"/>
-                          <a:ext cx="2608580" cy="828040"/>
-                        </a:xfrm>
-                        <a:prstGeom prst="wedgeRectCallout">
-                          <a:avLst>
-                            <a:gd name="adj1" fmla="val -73708"/>
-                            <a:gd name="adj2" fmla="val -150690"/>
-                          </a:avLst>
-                        </a:prstGeom>
-                        <a:noFill/>
-                        <a:ln w="12700" cap="flat" cmpd="sng">
-                          <a:solidFill>
-                            <a:srgbClr val="000000"/>
-                          </a:solidFill>
-                          <a:prstDash val="dash"/>
-                          <a:miter/>
-                          <a:headEnd type="none" w="med" len="med"/>
-                          <a:tailEnd type="none" w="med" len="med"/>
-                        </a:ln>
-                      </wps:spPr>
-                      <wps:txbx>
-                        <w:txbxContent>
-                          <w:p>
-                            <w:pPr>
-                              <w:ind w:firstLine="0" w:firstLineChars="0"/>
-                              <w:rPr>
-                                <w:rFonts w:hint="eastAsia"/>
-                                <w:color w:val="FF0000"/>
-                                <w:sz w:val="18"/>
-                                <w:szCs w:val="18"/>
-                              </w:rPr>
-                            </w:pPr>
-                            <w:r>
-                              <w:rPr>
-                                <w:rFonts w:hint="eastAsia"/>
-                                <w:color w:val="FF0000"/>
-                                <w:sz w:val="18"/>
-                                <w:szCs w:val="18"/>
-                              </w:rPr>
-                              <w:t>附录中的程序格式：宋体5号， 固定值18磅，首行缩进2字符</w:t>
-                            </w:r>
-                          </w:p>
-                        </w:txbxContent>
-                      </wps:txbx>
-                      <wps:bodyPr wrap="square" upright="1"/>
-                    </wps:wsp>
-                  </a:graphicData>
-                </a:graphic>
-              </wp:anchor>
-            </w:drawing>
-          </mc:Choice>
-          <mc:Fallback>
-            <w:pict>
-              <v:shape id="自选图形 132" o:spid="_x0000_s1026" o:spt="61" type="#_x0000_t61" style="position:absolute;left:0pt;margin-left:262.3pt;margin-top:12.2pt;height:65.2pt;width:205.4pt;z-index:251700224;mso-width-relative:page;mso-height-relative:page;" filled="f" stroked="t" coordsize="21600,21600" o:gfxdata="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" adj="-5121,-21749">
-                <v:fill on="f" focussize="0,0"/>
-                <v:stroke weight="1pt" color="#000000" joinstyle="miter" dashstyle="dash"/>
-                <v:imagedata o:title=""/>
-                <o:lock v:ext="edit" aspectratio="f"/>
-                <v:textbox>
-                  <w:txbxContent>
-                    <w:p>
-                      <w:pPr>
-                        <w:ind w:firstLine="0" w:firstLineChars="0"/>
-                        <w:rPr>
-                          <w:rFonts w:hint="eastAsia"/>
-                          <w:color w:val="FF0000"/>
-                          <w:sz w:val="18"/>
-                          <w:szCs w:val="18"/>
-                        </w:rPr>
-                      </w:pPr>
-                      <w:r>
-                        <w:rPr>
-                          <w:rFonts w:hint="eastAsia"/>
-                          <w:color w:val="FF0000"/>
-                          <w:sz w:val="18"/>
-                          <w:szCs w:val="18"/>
-                        </w:rPr>
-                        <w:t>附录中的程序格式：宋体5号， 固定值18磅，首行缩进2字符</w:t>
-                      </w:r>
-                    </w:p>
-                  </w:txbxContent>
-                </v:textbox>
-              </v:shape>
-            </w:pict>
-          </mc:Fallback>
-        </mc:AlternateContent>
       </w:r>
     </w:p>
     <w:p>

</xml_diff>

<commit_message>
fix: remove 13 textbox annotations from NDNU template
Same mc:AlternateContent issue as SHOU template - red dashed-border
format instruction boxes. Removed via zipfile XML regex in new Step 9.

Co-Authored-By: Claude Opus 4.6 (1M context) <noreply@anthropic.com>
</commit_message>
<xml_diff>
--- a/templates/ndnu/template.docx
+++ b/templates/ndnu/template.docx
@@ -2321,192 +2321,6 @@
           <w:bCs/>
           <w:lang/>
         </w:rPr>
-        <mc:AlternateContent>
-          <mc:Choice Requires="wps">
-            <w:drawing>
-              <wp:anchor distT="0" distB="0" distL="114300" distR="114300" simplePos="0" relativeHeight="251660288" behindDoc="0" locked="0" layoutInCell="1" allowOverlap="1">
-                <wp:simplePos x="0" y="0"/>
-                <wp:positionH relativeFrom="column">
-                  <wp:posOffset>-619760</wp:posOffset>
-                </wp:positionH>
-                <wp:positionV relativeFrom="paragraph">
-                  <wp:posOffset>-310515</wp:posOffset>
-                </wp:positionV>
-                <wp:extent cx="2106930" cy="735330"/>
-                <wp:effectExtent l="6350" t="6350" r="985520" b="20320"/>
-                <wp:wrapNone/>
-                <wp:docPr id="2" name="自选图形 15"/>
-                <wp:cNvGraphicFramePr/>
-                <a:graphic xmlns:a="http://schemas.openxmlformats.org/drawingml/2006/main">
-                  <a:graphicData uri="http://schemas.microsoft.com/office/word/2010/wordprocessingShape">
-                    <wps:wsp>
-                      <wps:cNvSpPr/>
-                      <wps:spPr>
-                        <a:xfrm>
-                          <a:off x="0" y="0"/>
-                          <a:ext cx="2106930" cy="735330"/>
-                        </a:xfrm>
-                        <a:prstGeom prst="wedgeRectCallout">
-                          <a:avLst>
-                            <a:gd name="adj1" fmla="val 94875"/>
-                            <a:gd name="adj2" fmla="val 18222"/>
-                          </a:avLst>
-                        </a:prstGeom>
-                        <a:noFill/>
-                        <a:ln w="12700" cap="flat" cmpd="sng">
-                          <a:solidFill>
-                            <a:srgbClr val="000000"/>
-                          </a:solidFill>
-                          <a:prstDash val="dash"/>
-                          <a:miter/>
-                          <a:headEnd type="none" w="med" len="med"/>
-                          <a:tailEnd type="none" w="med" len="med"/>
-                        </a:ln>
-                      </wps:spPr>
-                      <wps:txbx>
-                        <w:txbxContent>
-                          <w:p>
-                            <w:pPr>
-                              <w:ind w:firstLine="0" w:firstLineChars="0"/>
-                              <w:rPr>
-                                <w:rFonts w:hint="eastAsia" w:ascii="宋体" w:hAnsi="宋体" w:eastAsia="宋体"/>
-                                <w:color w:val="FF0000"/>
-                                <w:sz w:val="18"/>
-                                <w:szCs w:val="18"/>
-                                <w:lang w:eastAsia="zh-CN"/>
-                              </w:rPr>
-                            </w:pPr>
-                            <w:r>
-                              <w:rPr>
-                                <w:rFonts w:hint="eastAsia" w:ascii="宋体" w:hAnsi="宋体"/>
-                                <w:color w:val="FF0000"/>
-                                <w:sz w:val="18"/>
-                                <w:szCs w:val="18"/>
-                              </w:rPr>
-                              <w:t>摘要小二号黑体字居中书写，段前</w:t>
-                            </w:r>
-                            <w:r>
-                              <w:rPr>
-                                <w:rFonts w:hint="eastAsia" w:ascii="宋体" w:hAnsi="宋体"/>
-                                <w:color w:val="0070C0"/>
-                                <w:sz w:val="18"/>
-                                <w:szCs w:val="18"/>
-                              </w:rPr>
-                              <w:t>1</w:t>
-                            </w:r>
-                            <w:r>
-                              <w:rPr>
-                                <w:rFonts w:hint="eastAsia" w:ascii="宋体" w:hAnsi="宋体"/>
-                                <w:color w:val="0070C0"/>
-                                <w:sz w:val="18"/>
-                                <w:szCs w:val="18"/>
-                                <w:lang w:val="en-US" w:eastAsia="zh-CN"/>
-                              </w:rPr>
-                              <w:t>.5</w:t>
-                            </w:r>
-                            <w:r>
-                              <w:rPr>
-                                <w:rFonts w:hint="eastAsia" w:ascii="宋体" w:hAnsi="宋体"/>
-                                <w:color w:val="FF0000"/>
-                                <w:sz w:val="18"/>
-                                <w:szCs w:val="18"/>
-                              </w:rPr>
-                              <w:t>行，段后1行，摘要中间空两个</w:t>
-                            </w:r>
-                            <w:r>
-                              <w:rPr>
-                                <w:rFonts w:hint="eastAsia" w:ascii="宋体" w:hAnsi="宋体"/>
-                                <w:color w:val="FF0000"/>
-                                <w:sz w:val="18"/>
-                                <w:szCs w:val="18"/>
-                                <w:lang w:val="en-US" w:eastAsia="zh-CN"/>
-                              </w:rPr>
-                              <w:t>字符</w:t>
-                            </w:r>
-                          </w:p>
-                        </w:txbxContent>
-                      </wps:txbx>
-                      <wps:bodyPr wrap="square" upright="1"/>
-                    </wps:wsp>
-                  </a:graphicData>
-                </a:graphic>
-              </wp:anchor>
-            </w:drawing>
-          </mc:Choice>
-          <mc:Fallback>
-            <w:pict>
-              <v:shape id="自选图形 15" o:spid="_x0000_s1026" o:spt="61" type="#_x0000_t61" style="position:absolute;left:0pt;margin-left:-48.8pt;margin-top:-24.45pt;height:57.9pt;width:165.9pt;z-index:251660288;mso-width-relative:page;mso-height-relative:page;" filled="f" stroked="t" coordsize="21600,21600" o:gfxdata="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" adj="31293,14736">
-                <v:fill on="f" focussize="0,0"/>
-                <v:stroke weight="1pt" color="#000000" joinstyle="miter" dashstyle="dash"/>
-                <v:imagedata o:title=""/>
-                <o:lock v:ext="edit" aspectratio="f"/>
-                <v:textbox>
-                  <w:txbxContent>
-                    <w:p>
-                      <w:pPr>
-                        <w:ind w:firstLine="0" w:firstLineChars="0"/>
-                        <w:rPr>
-                          <w:rFonts w:hint="eastAsia" w:ascii="宋体" w:hAnsi="宋体" w:eastAsia="宋体"/>
-                          <w:color w:val="FF0000"/>
-                          <w:sz w:val="18"/>
-                          <w:szCs w:val="18"/>
-                          <w:lang w:eastAsia="zh-CN"/>
-                        </w:rPr>
-                      </w:pPr>
-                      <w:r>
-                        <w:rPr>
-                          <w:rFonts w:hint="eastAsia" w:ascii="宋体" w:hAnsi="宋体"/>
-                          <w:color w:val="FF0000"/>
-                          <w:sz w:val="18"/>
-                          <w:szCs w:val="18"/>
-                        </w:rPr>
-                        <w:t>摘要小二号黑体字居中书写，段前</w:t>
-                      </w:r>
-                      <w:r>
-                        <w:rPr>
-                          <w:rFonts w:hint="eastAsia" w:ascii="宋体" w:hAnsi="宋体"/>
-                          <w:color w:val="0070C0"/>
-                          <w:sz w:val="18"/>
-                          <w:szCs w:val="18"/>
-                        </w:rPr>
-                        <w:t>1</w:t>
-                      </w:r>
-                      <w:r>
-                        <w:rPr>
-                          <w:rFonts w:hint="eastAsia" w:ascii="宋体" w:hAnsi="宋体"/>
-                          <w:color w:val="0070C0"/>
-                          <w:sz w:val="18"/>
-                          <w:szCs w:val="18"/>
-                          <w:lang w:val="en-US" w:eastAsia="zh-CN"/>
-                        </w:rPr>
-                        <w:t>.5</w:t>
-                      </w:r>
-                      <w:r>
-                        <w:rPr>
-                          <w:rFonts w:hint="eastAsia" w:ascii="宋体" w:hAnsi="宋体"/>
-                          <w:color w:val="FF0000"/>
-                          <w:sz w:val="18"/>
-                          <w:szCs w:val="18"/>
-                        </w:rPr>
-                        <w:t>行，段后1行，摘要中间空两个</w:t>
-                      </w:r>
-                      <w:r>
-                        <w:rPr>
-                          <w:rFonts w:hint="eastAsia" w:ascii="宋体" w:hAnsi="宋体"/>
-                          <w:color w:val="FF0000"/>
-                          <w:sz w:val="18"/>
-                          <w:szCs w:val="18"/>
-                          <w:lang w:val="en-US" w:eastAsia="zh-CN"/>
-                        </w:rPr>
-                        <w:t>字符</w:t>
-                      </w:r>
-                    </w:p>
-                  </w:txbxContent>
-                </v:textbox>
-              </v:shape>
-            </w:pict>
-          </mc:Fallback>
-        </mc:AlternateContent>
       </w:r>
       <w:r>
         <w:rPr>
@@ -2514,550 +2328,6 @@
           <w:bCs/>
           <w:lang/>
         </w:rPr>
-        <mc:AlternateContent>
-          <mc:Choice Requires="wps">
-            <w:drawing>
-              <wp:anchor distT="0" distB="0" distL="114300" distR="114300" simplePos="0" relativeHeight="251723776" behindDoc="0" locked="0" layoutInCell="1" allowOverlap="1">
-                <wp:simplePos x="0" y="0"/>
-                <wp:positionH relativeFrom="column">
-                  <wp:posOffset>3310890</wp:posOffset>
-                </wp:positionH>
-                <wp:positionV relativeFrom="paragraph">
-                  <wp:posOffset>-367665</wp:posOffset>
-                </wp:positionV>
-                <wp:extent cx="2006600" cy="735330"/>
-                <wp:effectExtent l="751840" t="6350" r="10160" b="502920"/>
-                <wp:wrapNone/>
-                <wp:docPr id="74" name="自选图形 16"/>
-                <wp:cNvGraphicFramePr/>
-                <a:graphic xmlns:a="http://schemas.openxmlformats.org/drawingml/2006/main">
-                  <a:graphicData uri="http://schemas.microsoft.com/office/word/2010/wordprocessingShape">
-                    <wps:wsp>
-                      <wps:cNvSpPr/>
-                      <wps:spPr>
-                        <a:xfrm>
-                          <a:off x="0" y="0"/>
-                          <a:ext cx="2006600" cy="735330"/>
-                        </a:xfrm>
-                        <a:prstGeom prst="wedgeRectCallout">
-                          <a:avLst>
-                            <a:gd name="adj1" fmla="val -85032"/>
-                            <a:gd name="adj2" fmla="val 112866"/>
-                          </a:avLst>
-                        </a:prstGeom>
-                        <a:noFill/>
-                        <a:ln w="12700" cap="flat" cmpd="sng">
-                          <a:solidFill>
-                            <a:srgbClr val="000000"/>
-                          </a:solidFill>
-                          <a:prstDash val="dash"/>
-                          <a:miter/>
-                          <a:headEnd type="none" w="med" len="med"/>
-                          <a:tailEnd type="none" w="med" len="med"/>
-                        </a:ln>
-                      </wps:spPr>
-                      <wps:txbx>
-                        <w:txbxContent>
-                          <w:p>
-                            <w:pPr>
-                              <w:autoSpaceDE w:val="0"/>
-                              <w:autoSpaceDN w:val="0"/>
-                              <w:adjustRightInd w:val="0"/>
-                              <w:spacing w:line="240" w:lineRule="exact"/>
-                              <w:ind w:firstLine="0" w:firstLineChars="0"/>
-                              <w:jc w:val="left"/>
-                              <w:rPr>
-                                <w:rFonts w:ascii="宋体" w:cs="宋体"/>
-                                <w:color w:val="FF0000"/>
-                                <w:kern w:val="0"/>
-                                <w:sz w:val="20"/>
-                                <w:szCs w:val="21"/>
-                              </w:rPr>
-                            </w:pPr>
-                            <w:r>
-                              <w:rPr>
-                                <w:rFonts w:hint="eastAsia" w:ascii="宋体" w:cs="宋体"/>
-                                <w:color w:val="FF0000"/>
-                                <w:kern w:val="0"/>
-                                <w:sz w:val="20"/>
-                                <w:szCs w:val="21"/>
-                              </w:rPr>
-                              <w:t>摘要内容字体</w:t>
-                            </w:r>
-                            <w:r>
-                              <w:rPr>
-                                <w:color w:val="FF0000"/>
-                                <w:kern w:val="0"/>
-                                <w:sz w:val="20"/>
-                                <w:szCs w:val="21"/>
-                              </w:rPr>
-                              <w:t>: (</w:t>
-                            </w:r>
-                            <w:r>
-                              <w:rPr>
-                                <w:rFonts w:hint="eastAsia" w:ascii="宋体" w:cs="宋体"/>
-                                <w:color w:val="FF0000"/>
-                                <w:kern w:val="0"/>
-                                <w:sz w:val="20"/>
-                                <w:szCs w:val="21"/>
-                              </w:rPr>
-                              <w:t>中文</w:t>
-                            </w:r>
-                            <w:r>
-                              <w:rPr>
-                                <w:color w:val="FF0000"/>
-                                <w:kern w:val="0"/>
-                                <w:sz w:val="20"/>
-                                <w:szCs w:val="21"/>
-                              </w:rPr>
-                              <w:t xml:space="preserve">) </w:t>
-                            </w:r>
-                            <w:r>
-                              <w:rPr>
-                                <w:rFonts w:hint="eastAsia" w:ascii="宋体" w:cs="宋体"/>
-                                <w:color w:val="FF0000"/>
-                                <w:kern w:val="0"/>
-                                <w:sz w:val="20"/>
-                                <w:szCs w:val="21"/>
-                              </w:rPr>
-                              <w:t>宋体</w:t>
-                            </w:r>
-                            <w:r>
-                              <w:rPr>
-                                <w:color w:val="FF0000"/>
-                                <w:kern w:val="0"/>
-                                <w:sz w:val="20"/>
-                                <w:szCs w:val="21"/>
-                              </w:rPr>
-                              <w:t>, (</w:t>
-                            </w:r>
-                            <w:r>
-                              <w:rPr>
-                                <w:rFonts w:hint="eastAsia" w:ascii="宋体" w:cs="宋体"/>
-                                <w:color w:val="FF0000"/>
-                                <w:kern w:val="0"/>
-                                <w:sz w:val="20"/>
-                                <w:szCs w:val="21"/>
-                              </w:rPr>
-                              <w:t>西文</w:t>
-                            </w:r>
-                            <w:r>
-                              <w:rPr>
-                                <w:color w:val="FF0000"/>
-                                <w:kern w:val="0"/>
-                                <w:sz w:val="20"/>
-                                <w:szCs w:val="21"/>
-                              </w:rPr>
-                              <w:t xml:space="preserve">) Times New Roman, </w:t>
-                            </w:r>
-                            <w:r>
-                              <w:rPr>
-                                <w:rFonts w:hint="eastAsia" w:ascii="宋体" w:cs="宋体"/>
-                                <w:color w:val="FF0000"/>
-                                <w:kern w:val="0"/>
-                                <w:sz w:val="20"/>
-                                <w:szCs w:val="21"/>
-                              </w:rPr>
-                              <w:t>小四</w:t>
-                            </w:r>
-                            <w:r>
-                              <w:rPr>
-                                <w:color w:val="FF0000"/>
-                                <w:kern w:val="0"/>
-                                <w:sz w:val="20"/>
-                                <w:szCs w:val="21"/>
-                              </w:rPr>
-                              <w:t xml:space="preserve">, </w:t>
-                            </w:r>
-                            <w:r>
-                              <w:rPr>
-                                <w:rFonts w:hint="eastAsia" w:ascii="宋体" w:cs="宋体"/>
-                                <w:color w:val="FF0000"/>
-                                <w:kern w:val="0"/>
-                                <w:sz w:val="20"/>
-                                <w:szCs w:val="21"/>
-                              </w:rPr>
-                              <w:t>两端对齐</w:t>
-                            </w:r>
-                            <w:r>
-                              <w:rPr>
-                                <w:color w:val="FF0000"/>
-                                <w:kern w:val="0"/>
-                                <w:sz w:val="20"/>
-                                <w:szCs w:val="21"/>
-                              </w:rPr>
-                              <w:t xml:space="preserve">, </w:t>
-                            </w:r>
-                            <w:r>
-                              <w:rPr>
-                                <w:rFonts w:hint="eastAsia" w:ascii="宋体" w:cs="宋体"/>
-                                <w:color w:val="FF0000"/>
-                                <w:kern w:val="0"/>
-                                <w:sz w:val="20"/>
-                                <w:szCs w:val="21"/>
-                              </w:rPr>
-                              <w:t>行距</w:t>
-                            </w:r>
-                            <w:r>
-                              <w:rPr>
-                                <w:color w:val="FF0000"/>
-                                <w:kern w:val="0"/>
-                                <w:sz w:val="20"/>
-                                <w:szCs w:val="21"/>
-                              </w:rPr>
-                              <w:t xml:space="preserve">: </w:t>
-                            </w:r>
-                            <w:r>
-                              <w:rPr>
-                                <w:rFonts w:hint="eastAsia" w:ascii="宋体" w:cs="宋体"/>
-                                <w:color w:val="FF0000"/>
-                                <w:kern w:val="0"/>
-                                <w:sz w:val="20"/>
-                                <w:szCs w:val="21"/>
-                              </w:rPr>
-                              <w:t>固定值</w:t>
-                            </w:r>
-                            <w:r>
-                              <w:rPr>
-                                <w:rFonts w:ascii="宋体" w:cs="宋体"/>
-                                <w:color w:val="FF0000"/>
-                                <w:kern w:val="0"/>
-                                <w:sz w:val="20"/>
-                                <w:szCs w:val="21"/>
-                              </w:rPr>
-                              <w:t xml:space="preserve"> </w:t>
-                            </w:r>
-                            <w:r>
-                              <w:rPr>
-                                <w:color w:val="FF0000"/>
-                                <w:kern w:val="0"/>
-                                <w:sz w:val="20"/>
-                                <w:szCs w:val="21"/>
-                              </w:rPr>
-                              <w:t xml:space="preserve">22 </w:t>
-                            </w:r>
-                            <w:r>
-                              <w:rPr>
-                                <w:rFonts w:hint="eastAsia" w:ascii="宋体" w:cs="宋体"/>
-                                <w:color w:val="FF0000"/>
-                                <w:kern w:val="0"/>
-                                <w:sz w:val="20"/>
-                                <w:szCs w:val="21"/>
-                              </w:rPr>
-                              <w:t>磅</w:t>
-                            </w:r>
-                            <w:r>
-                              <w:rPr>
-                                <w:color w:val="FF0000"/>
-                                <w:kern w:val="0"/>
-                                <w:sz w:val="20"/>
-                                <w:szCs w:val="21"/>
-                              </w:rPr>
-                              <w:t xml:space="preserve">, </w:t>
-                            </w:r>
-                            <w:r>
-                              <w:rPr>
-                                <w:rFonts w:hint="eastAsia" w:ascii="宋体" w:cs="宋体"/>
-                                <w:color w:val="FF0000"/>
-                                <w:kern w:val="0"/>
-                                <w:sz w:val="20"/>
-                                <w:szCs w:val="21"/>
-                              </w:rPr>
-                              <w:t>首行缩进</w:t>
-                            </w:r>
-                            <w:r>
-                              <w:rPr>
-                                <w:color w:val="FF0000"/>
-                                <w:kern w:val="0"/>
-                                <w:sz w:val="20"/>
-                                <w:szCs w:val="21"/>
-                              </w:rPr>
-                              <w:t xml:space="preserve">: 2 </w:t>
-                            </w:r>
-                            <w:r>
-                              <w:rPr>
-                                <w:rFonts w:hint="eastAsia" w:ascii="宋体" w:cs="宋体"/>
-                                <w:color w:val="FF0000"/>
-                                <w:kern w:val="0"/>
-                                <w:sz w:val="20"/>
-                                <w:szCs w:val="21"/>
-                              </w:rPr>
-                              <w:t>字符</w:t>
-                            </w:r>
-                          </w:p>
-                          <w:p>
-                            <w:pPr>
-                              <w:spacing w:line="240" w:lineRule="exact"/>
-                              <w:ind w:firstLine="0" w:firstLineChars="0"/>
-                              <w:rPr>
-                                <w:rFonts w:ascii="宋体" w:hAnsi="宋体"/>
-                                <w:sz w:val="20"/>
-                                <w:szCs w:val="21"/>
-                              </w:rPr>
-                            </w:pPr>
-                          </w:p>
-                        </w:txbxContent>
-                      </wps:txbx>
-                      <wps:bodyPr wrap="square" upright="1"/>
-                    </wps:wsp>
-                  </a:graphicData>
-                </a:graphic>
-              </wp:anchor>
-            </w:drawing>
-          </mc:Choice>
-          <mc:Fallback>
-            <w:pict>
-              <v:shape id="自选图形 16" o:spid="_x0000_s1026" o:spt="61" type="#_x0000_t61" style="position:absolute;left:0pt;margin-left:260.7pt;margin-top:-28.95pt;height:57.9pt;width:158pt;z-index:251723776;mso-width-relative:page;mso-height-relative:page;" filled="f" stroked="t" coordsize="21600,21600" o:gfxdata="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" adj="-7567,35179">
-                <v:fill on="f" focussize="0,0"/>
-                <v:stroke weight="1pt" color="#000000" joinstyle="miter" dashstyle="dash"/>
-                <v:imagedata o:title=""/>
-                <o:lock v:ext="edit" aspectratio="f"/>
-                <v:textbox>
-                  <w:txbxContent>
-                    <w:p>
-                      <w:pPr>
-                        <w:autoSpaceDE w:val="0"/>
-                        <w:autoSpaceDN w:val="0"/>
-                        <w:adjustRightInd w:val="0"/>
-                        <w:spacing w:line="240" w:lineRule="exact"/>
-                        <w:ind w:firstLine="0" w:firstLineChars="0"/>
-                        <w:jc w:val="left"/>
-                        <w:rPr>
-                          <w:rFonts w:ascii="宋体" w:cs="宋体"/>
-                          <w:color w:val="FF0000"/>
-                          <w:kern w:val="0"/>
-                          <w:sz w:val="20"/>
-                          <w:szCs w:val="21"/>
-                        </w:rPr>
-                      </w:pPr>
-                      <w:r>
-                        <w:rPr>
-                          <w:rFonts w:hint="eastAsia" w:ascii="宋体" w:cs="宋体"/>
-                          <w:color w:val="FF0000"/>
-                          <w:kern w:val="0"/>
-                          <w:sz w:val="20"/>
-                          <w:szCs w:val="21"/>
-                        </w:rPr>
-                        <w:t>摘要内容字体</w:t>
-                      </w:r>
-                      <w:r>
-                        <w:rPr>
-                          <w:color w:val="FF0000"/>
-                          <w:kern w:val="0"/>
-                          <w:sz w:val="20"/>
-                          <w:szCs w:val="21"/>
-                        </w:rPr>
-                        <w:t>: (</w:t>
-                      </w:r>
-                      <w:r>
-                        <w:rPr>
-                          <w:rFonts w:hint="eastAsia" w:ascii="宋体" w:cs="宋体"/>
-                          <w:color w:val="FF0000"/>
-                          <w:kern w:val="0"/>
-                          <w:sz w:val="20"/>
-                          <w:szCs w:val="21"/>
-                        </w:rPr>
-                        <w:t>中文</w:t>
-                      </w:r>
-                      <w:r>
-                        <w:rPr>
-                          <w:color w:val="FF0000"/>
-                          <w:kern w:val="0"/>
-                          <w:sz w:val="20"/>
-                          <w:szCs w:val="21"/>
-                        </w:rPr>
-                        <w:t xml:space="preserve">) </w:t>
-                      </w:r>
-                      <w:r>
-                        <w:rPr>
-                          <w:rFonts w:hint="eastAsia" w:ascii="宋体" w:cs="宋体"/>
-                          <w:color w:val="FF0000"/>
-                          <w:kern w:val="0"/>
-                          <w:sz w:val="20"/>
-                          <w:szCs w:val="21"/>
-                        </w:rPr>
-                        <w:t>宋体</w:t>
-                      </w:r>
-                      <w:r>
-                        <w:rPr>
-                          <w:color w:val="FF0000"/>
-                          <w:kern w:val="0"/>
-                          <w:sz w:val="20"/>
-                          <w:szCs w:val="21"/>
-                        </w:rPr>
-                        <w:t>, (</w:t>
-                      </w:r>
-                      <w:r>
-                        <w:rPr>
-                          <w:rFonts w:hint="eastAsia" w:ascii="宋体" w:cs="宋体"/>
-                          <w:color w:val="FF0000"/>
-                          <w:kern w:val="0"/>
-                          <w:sz w:val="20"/>
-                          <w:szCs w:val="21"/>
-                        </w:rPr>
-                        <w:t>西文</w:t>
-                      </w:r>
-                      <w:r>
-                        <w:rPr>
-                          <w:color w:val="FF0000"/>
-                          <w:kern w:val="0"/>
-                          <w:sz w:val="20"/>
-                          <w:szCs w:val="21"/>
-                        </w:rPr>
-                        <w:t xml:space="preserve">) Times New Roman, </w:t>
-                      </w:r>
-                      <w:r>
-                        <w:rPr>
-                          <w:rFonts w:hint="eastAsia" w:ascii="宋体" w:cs="宋体"/>
-                          <w:color w:val="FF0000"/>
-                          <w:kern w:val="0"/>
-                          <w:sz w:val="20"/>
-                          <w:szCs w:val="21"/>
-                        </w:rPr>
-                        <w:t>小四</w:t>
-                      </w:r>
-                      <w:r>
-                        <w:rPr>
-                          <w:color w:val="FF0000"/>
-                          <w:kern w:val="0"/>
-                          <w:sz w:val="20"/>
-                          <w:szCs w:val="21"/>
-                        </w:rPr>
-                        <w:t xml:space="preserve">, </w:t>
-                      </w:r>
-                      <w:r>
-                        <w:rPr>
-                          <w:rFonts w:hint="eastAsia" w:ascii="宋体" w:cs="宋体"/>
-                          <w:color w:val="FF0000"/>
-                          <w:kern w:val="0"/>
-                          <w:sz w:val="20"/>
-                          <w:szCs w:val="21"/>
-                        </w:rPr>
-                        <w:t>两端对齐</w:t>
-                      </w:r>
-                      <w:r>
-                        <w:rPr>
-                          <w:color w:val="FF0000"/>
-                          <w:kern w:val="0"/>
-                          <w:sz w:val="20"/>
-                          <w:szCs w:val="21"/>
-                        </w:rPr>
-                        <w:t xml:space="preserve">, </w:t>
-                      </w:r>
-                      <w:r>
-                        <w:rPr>
-                          <w:rFonts w:hint="eastAsia" w:ascii="宋体" w:cs="宋体"/>
-                          <w:color w:val="FF0000"/>
-                          <w:kern w:val="0"/>
-                          <w:sz w:val="20"/>
-                          <w:szCs w:val="21"/>
-                        </w:rPr>
-                        <w:t>行距</w:t>
-                      </w:r>
-                      <w:r>
-                        <w:rPr>
-                          <w:color w:val="FF0000"/>
-                          <w:kern w:val="0"/>
-                          <w:sz w:val="20"/>
-                          <w:szCs w:val="21"/>
-                        </w:rPr>
-                        <w:t xml:space="preserve">: </w:t>
-                      </w:r>
-                      <w:r>
-                        <w:rPr>
-                          <w:rFonts w:hint="eastAsia" w:ascii="宋体" w:cs="宋体"/>
-                          <w:color w:val="FF0000"/>
-                          <w:kern w:val="0"/>
-                          <w:sz w:val="20"/>
-                          <w:szCs w:val="21"/>
-                        </w:rPr>
-                        <w:t>固定值</w:t>
-                      </w:r>
-                      <w:r>
-                        <w:rPr>
-                          <w:rFonts w:ascii="宋体" w:cs="宋体"/>
-                          <w:color w:val="FF0000"/>
-                          <w:kern w:val="0"/>
-                          <w:sz w:val="20"/>
-                          <w:szCs w:val="21"/>
-                        </w:rPr>
-                        <w:t xml:space="preserve"> </w:t>
-                      </w:r>
-                      <w:r>
-                        <w:rPr>
-                          <w:color w:val="FF0000"/>
-                          <w:kern w:val="0"/>
-                          <w:sz w:val="20"/>
-                          <w:szCs w:val="21"/>
-                        </w:rPr>
-                        <w:t xml:space="preserve">22 </w:t>
-                      </w:r>
-                      <w:r>
-                        <w:rPr>
-                          <w:rFonts w:hint="eastAsia" w:ascii="宋体" w:cs="宋体"/>
-                          <w:color w:val="FF0000"/>
-                          <w:kern w:val="0"/>
-                          <w:sz w:val="20"/>
-                          <w:szCs w:val="21"/>
-                        </w:rPr>
-                        <w:t>磅</w:t>
-                      </w:r>
-                      <w:r>
-                        <w:rPr>
-                          <w:color w:val="FF0000"/>
-                          <w:kern w:val="0"/>
-                          <w:sz w:val="20"/>
-                          <w:szCs w:val="21"/>
-                        </w:rPr>
-                        <w:t xml:space="preserve">, </w:t>
-                      </w:r>
-                      <w:r>
-                        <w:rPr>
-                          <w:rFonts w:hint="eastAsia" w:ascii="宋体" w:cs="宋体"/>
-                          <w:color w:val="FF0000"/>
-                          <w:kern w:val="0"/>
-                          <w:sz w:val="20"/>
-                          <w:szCs w:val="21"/>
-                        </w:rPr>
-                        <w:t>首行缩进</w:t>
-                      </w:r>
-                      <w:r>
-                        <w:rPr>
-                          <w:color w:val="FF0000"/>
-                          <w:kern w:val="0"/>
-                          <w:sz w:val="20"/>
-                          <w:szCs w:val="21"/>
-                        </w:rPr>
-                        <w:t xml:space="preserve">: 2 </w:t>
-                      </w:r>
-                      <w:r>
-                        <w:rPr>
-                          <w:rFonts w:hint="eastAsia" w:ascii="宋体" w:cs="宋体"/>
-                          <w:color w:val="FF0000"/>
-                          <w:kern w:val="0"/>
-                          <w:sz w:val="20"/>
-                          <w:szCs w:val="21"/>
-                        </w:rPr>
-                        <w:t>字符</w:t>
-                      </w:r>
-                    </w:p>
-                    <w:p>
-                      <w:pPr>
-                        <w:spacing w:line="240" w:lineRule="exact"/>
-                        <w:ind w:firstLine="0" w:firstLineChars="0"/>
-                        <w:rPr>
-                          <w:rFonts w:ascii="宋体" w:hAnsi="宋体"/>
-                          <w:sz w:val="20"/>
-                          <w:szCs w:val="21"/>
-                        </w:rPr>
-                      </w:pPr>
-                    </w:p>
-                  </w:txbxContent>
-                </v:textbox>
-              </v:shape>
-            </w:pict>
-          </mc:Fallback>
-        </mc:AlternateContent>
       </w:r>
       <w:r>
         <w:rPr>
@@ -3213,112 +2483,6 @@
         <w:rPr>
           <w:lang/>
         </w:rPr>
-        <mc:AlternateContent>
-          <mc:Choice Requires="wps">
-            <w:drawing>
-              <wp:anchor distT="0" distB="0" distL="114300" distR="114300" simplePos="0" relativeHeight="251661312" behindDoc="0" locked="0" layoutInCell="1" allowOverlap="1">
-                <wp:simplePos x="0" y="0"/>
-                <wp:positionH relativeFrom="column">
-                  <wp:posOffset>-300990</wp:posOffset>
-                </wp:positionH>
-                <wp:positionV relativeFrom="paragraph">
-                  <wp:posOffset>250190</wp:posOffset>
-                </wp:positionV>
-                <wp:extent cx="1404620" cy="735330"/>
-                <wp:effectExtent l="6350" t="835660" r="11430" b="29210"/>
-                <wp:wrapNone/>
-                <wp:docPr id="3" name="自选图形 17"/>
-                <wp:cNvGraphicFramePr/>
-                <a:graphic xmlns:a="http://schemas.openxmlformats.org/drawingml/2006/main">
-                  <a:graphicData uri="http://schemas.microsoft.com/office/word/2010/wordprocessingShape">
-                    <wps:wsp>
-                      <wps:cNvSpPr/>
-                      <wps:spPr>
-                        <a:xfrm>
-                          <a:off x="0" y="0"/>
-                          <a:ext cx="1404620" cy="735330"/>
-                        </a:xfrm>
-                        <a:prstGeom prst="wedgeRectCallout">
-                          <a:avLst>
-                            <a:gd name="adj1" fmla="val -4116"/>
-                            <a:gd name="adj2" fmla="val -159412"/>
-                          </a:avLst>
-                        </a:prstGeom>
-                        <a:noFill/>
-                        <a:ln w="12700" cap="flat" cmpd="sng">
-                          <a:solidFill>
-                            <a:srgbClr val="000000"/>
-                          </a:solidFill>
-                          <a:prstDash val="dash"/>
-                          <a:miter/>
-                          <a:headEnd type="none" w="med" len="med"/>
-                          <a:tailEnd type="none" w="med" len="med"/>
-                        </a:ln>
-                      </wps:spPr>
-                      <wps:txbx>
-                        <w:txbxContent>
-                          <w:p>
-                            <w:pPr>
-                              <w:spacing w:line="240" w:lineRule="exact"/>
-                              <w:ind w:firstLine="0" w:firstLineChars="0"/>
-                              <w:rPr>
-                                <w:rFonts w:hint="eastAsia" w:ascii="宋体" w:cs="宋体"/>
-                                <w:color w:val="FF0000"/>
-                                <w:kern w:val="0"/>
-                              </w:rPr>
-                            </w:pPr>
-                            <w:r>
-                              <w:rPr>
-                                <w:rFonts w:hint="eastAsia" w:ascii="宋体" w:cs="宋体"/>
-                                <w:color w:val="FF0000"/>
-                                <w:kern w:val="0"/>
-                              </w:rPr>
-                              <w:t>关键词四号黑体字，顶格、行距: 固定值 22 磅</w:t>
-                            </w:r>
-                          </w:p>
-                        </w:txbxContent>
-                      </wps:txbx>
-                      <wps:bodyPr wrap="square" upright="1"/>
-                    </wps:wsp>
-                  </a:graphicData>
-                </a:graphic>
-              </wp:anchor>
-            </w:drawing>
-          </mc:Choice>
-          <mc:Fallback>
-            <w:pict>
-              <v:shape id="自选图形 17" o:spid="_x0000_s1026" o:spt="61" type="#_x0000_t61" style="position:absolute;left:0pt;margin-left:-23.7pt;margin-top:19.7pt;height:57.9pt;width:110.6pt;z-index:251661312;mso-width-relative:page;mso-height-relative:page;" filled="f" stroked="t" coordsize="21600,21600" o:gfxdata="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" adj="9911,-23633">
-                <v:fill on="f" focussize="0,0"/>
-                <v:stroke weight="1pt" color="#000000" joinstyle="miter" dashstyle="dash"/>
-                <v:imagedata o:title=""/>
-                <o:lock v:ext="edit" aspectratio="f"/>
-                <v:textbox>
-                  <w:txbxContent>
-                    <w:p>
-                      <w:pPr>
-                        <w:spacing w:line="240" w:lineRule="exact"/>
-                        <w:ind w:firstLine="0" w:firstLineChars="0"/>
-                        <w:rPr>
-                          <w:rFonts w:hint="eastAsia" w:ascii="宋体" w:cs="宋体"/>
-                          <w:color w:val="FF0000"/>
-                          <w:kern w:val="0"/>
-                        </w:rPr>
-                      </w:pPr>
-                      <w:r>
-                        <w:rPr>
-                          <w:rFonts w:hint="eastAsia" w:ascii="宋体" w:cs="宋体"/>
-                          <w:color w:val="FF0000"/>
-                          <w:kern w:val="0"/>
-                        </w:rPr>
-                        <w:t>关键词四号黑体字，顶格、行距: 固定值 22 磅</w:t>
-                      </w:r>
-                    </w:p>
-                  </w:txbxContent>
-                </v:textbox>
-              </v:shape>
-            </w:pict>
-          </mc:Fallback>
-        </mc:AlternateContent>
       </w:r>
       <w:r>
         <w:br w:type="page"/>
@@ -3697,337 +2861,11 @@
         <w:rPr>
           <w:lang/>
         </w:rPr>
-        <mc:AlternateContent>
-          <mc:Choice Requires="wps">
-            <w:drawing>
-              <wp:anchor distT="0" distB="0" distL="114300" distR="114300" simplePos="0" relativeHeight="251665408" behindDoc="0" locked="0" layoutInCell="1" allowOverlap="1">
-                <wp:simplePos x="0" y="0"/>
-                <wp:positionH relativeFrom="column">
-                  <wp:posOffset>3110230</wp:posOffset>
-                </wp:positionH>
-                <wp:positionV relativeFrom="paragraph">
-                  <wp:posOffset>617855</wp:posOffset>
-                </wp:positionV>
-                <wp:extent cx="2608580" cy="735330"/>
-                <wp:effectExtent l="6350" t="972820" r="26670" b="19050"/>
-                <wp:wrapNone/>
-                <wp:docPr id="7" name="自选图形 22"/>
-                <wp:cNvGraphicFramePr/>
-                <a:graphic xmlns:a="http://schemas.openxmlformats.org/drawingml/2006/main">
-                  <a:graphicData uri="http://schemas.microsoft.com/office/word/2010/wordprocessingShape">
-                    <wps:wsp>
-                      <wps:cNvSpPr/>
-                      <wps:spPr>
-                        <a:xfrm>
-                          <a:off x="0" y="0"/>
-                          <a:ext cx="2608580" cy="735330"/>
-                        </a:xfrm>
-                        <a:prstGeom prst="wedgeRectCallout">
-                          <a:avLst>
-                            <a:gd name="adj1" fmla="val -32255"/>
-                            <a:gd name="adj2" fmla="val -179532"/>
-                          </a:avLst>
-                        </a:prstGeom>
-                        <a:noFill/>
-                        <a:ln w="12700" cap="flat" cmpd="sng">
-                          <a:solidFill>
-                            <a:srgbClr val="000000"/>
-                          </a:solidFill>
-                          <a:prstDash val="dash"/>
-                          <a:miter/>
-                          <a:headEnd type="none" w="med" len="med"/>
-                          <a:tailEnd type="none" w="med" len="med"/>
-                        </a:ln>
-                      </wps:spPr>
-                      <wps:txbx>
-                        <w:txbxContent>
-                          <w:p>
-                            <w:pPr>
-                              <w:spacing w:line="240" w:lineRule="auto"/>
-                              <w:ind w:firstLine="0" w:firstLineChars="0"/>
-                              <w:rPr>
-                                <w:rFonts w:hint="eastAsia"/>
-                                <w:color w:val="FF0000"/>
-                                <w:sz w:val="18"/>
-                                <w:szCs w:val="18"/>
-                              </w:rPr>
-                            </w:pPr>
-                            <w:r>
-                              <w:rPr>
-                                <w:rFonts w:hint="eastAsia"/>
-                                <w:color w:val="FF0000"/>
-                                <w:sz w:val="18"/>
-                                <w:szCs w:val="18"/>
-                              </w:rPr>
-                              <w:t>关键词</w:t>
-                            </w:r>
-                            <w:r>
-                              <w:rPr>
-                                <w:color w:val="FF0000"/>
-                                <w:sz w:val="18"/>
-                                <w:szCs w:val="18"/>
-                              </w:rPr>
-                              <w:t>小四号Times New Roman字书写，</w:t>
-                            </w:r>
-                            <w:r>
-                              <w:rPr>
-                                <w:rFonts w:hint="eastAsia"/>
-                                <w:color w:val="FF0000"/>
-                                <w:sz w:val="18"/>
-                                <w:szCs w:val="18"/>
-                              </w:rPr>
-                              <w:t>两端对齐</w:t>
-                            </w:r>
-                            <w:r>
-                              <w:rPr>
-                                <w:color w:val="FF0000"/>
-                                <w:sz w:val="18"/>
-                                <w:szCs w:val="18"/>
-                              </w:rPr>
-                              <w:t>；行距固定值22磅</w:t>
-                            </w:r>
-                            <w:r>
-                              <w:rPr>
-                                <w:rFonts w:hint="eastAsia"/>
-                                <w:color w:val="FF0000"/>
-                                <w:sz w:val="18"/>
-                                <w:szCs w:val="18"/>
-                              </w:rPr>
-                              <w:t>，不同关键词用分号隔开。</w:t>
-                            </w:r>
-                          </w:p>
-                        </w:txbxContent>
-                      </wps:txbx>
-                      <wps:bodyPr wrap="square" upright="1"/>
-                    </wps:wsp>
-                  </a:graphicData>
-                </a:graphic>
-              </wp:anchor>
-            </w:drawing>
-          </mc:Choice>
-          <mc:Fallback>
-            <w:pict>
-              <v:shape id="自选图形 22" o:spid="_x0000_s1026" o:spt="61" type="#_x0000_t61" style="position:absolute;left:0pt;margin-left:244.9pt;margin-top:48.65pt;height:57.9pt;width:205.4pt;z-index:251665408;mso-width-relative:page;mso-height-relative:page;" filled="f" stroked="t" coordsize="21600,21600" o:gfxdata="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" adj="3833,-27979">
-                <v:fill on="f" focussize="0,0"/>
-                <v:stroke weight="1pt" color="#000000" joinstyle="miter" dashstyle="dash"/>
-                <v:imagedata o:title=""/>
-                <o:lock v:ext="edit" aspectratio="f"/>
-                <v:textbox>
-                  <w:txbxContent>
-                    <w:p>
-                      <w:pPr>
-                        <w:spacing w:line="240" w:lineRule="auto"/>
-                        <w:ind w:firstLine="0" w:firstLineChars="0"/>
-                        <w:rPr>
-                          <w:rFonts w:hint="eastAsia"/>
-                          <w:color w:val="FF0000"/>
-                          <w:sz w:val="18"/>
-                          <w:szCs w:val="18"/>
-                        </w:rPr>
-                      </w:pPr>
-                      <w:r>
-                        <w:rPr>
-                          <w:rFonts w:hint="eastAsia"/>
-                          <w:color w:val="FF0000"/>
-                          <w:sz w:val="18"/>
-                          <w:szCs w:val="18"/>
-                        </w:rPr>
-                        <w:t>关键词</w:t>
-                      </w:r>
-                      <w:r>
-                        <w:rPr>
-                          <w:color w:val="FF0000"/>
-                          <w:sz w:val="18"/>
-                          <w:szCs w:val="18"/>
-                        </w:rPr>
-                        <w:t>小四号Times New Roman字书写，</w:t>
-                      </w:r>
-                      <w:r>
-                        <w:rPr>
-                          <w:rFonts w:hint="eastAsia"/>
-                          <w:color w:val="FF0000"/>
-                          <w:sz w:val="18"/>
-                          <w:szCs w:val="18"/>
-                        </w:rPr>
-                        <w:t>两端对齐</w:t>
-                      </w:r>
-                      <w:r>
-                        <w:rPr>
-                          <w:color w:val="FF0000"/>
-                          <w:sz w:val="18"/>
-                          <w:szCs w:val="18"/>
-                        </w:rPr>
-                        <w:t>；行距固定值22磅</w:t>
-                      </w:r>
-                      <w:r>
-                        <w:rPr>
-                          <w:rFonts w:hint="eastAsia"/>
-                          <w:color w:val="FF0000"/>
-                          <w:sz w:val="18"/>
-                          <w:szCs w:val="18"/>
-                        </w:rPr>
-                        <w:t>，不同关键词用分号隔开。</w:t>
-                      </w:r>
-                    </w:p>
-                  </w:txbxContent>
-                </v:textbox>
-              </v:shape>
-            </w:pict>
-          </mc:Fallback>
-        </mc:AlternateContent>
       </w:r>
       <w:r>
         <w:rPr>
           <w:lang/>
         </w:rPr>
-        <mc:AlternateContent>
-          <mc:Choice Requires="wps">
-            <w:drawing>
-              <wp:anchor distT="0" distB="0" distL="114300" distR="114300" simplePos="0" relativeHeight="251664384" behindDoc="0" locked="0" layoutInCell="1" allowOverlap="1">
-                <wp:simplePos x="0" y="0"/>
-                <wp:positionH relativeFrom="column">
-                  <wp:posOffset>-501650</wp:posOffset>
-                </wp:positionH>
-                <wp:positionV relativeFrom="paragraph">
-                  <wp:posOffset>617855</wp:posOffset>
-                </wp:positionV>
-                <wp:extent cx="2307590" cy="735330"/>
-                <wp:effectExtent l="6350" t="1019810" r="22860" b="22860"/>
-                <wp:wrapNone/>
-                <wp:docPr id="6" name="自选图形 21"/>
-                <wp:cNvGraphicFramePr/>
-                <a:graphic xmlns:a="http://schemas.openxmlformats.org/drawingml/2006/main">
-                  <a:graphicData uri="http://schemas.microsoft.com/office/word/2010/wordprocessingShape">
-                    <wps:wsp>
-                      <wps:cNvSpPr/>
-                      <wps:spPr>
-                        <a:xfrm>
-                          <a:off x="0" y="0"/>
-                          <a:ext cx="2307590" cy="735330"/>
-                        </a:xfrm>
-                        <a:prstGeom prst="wedgeRectCallout">
-                          <a:avLst>
-                            <a:gd name="adj1" fmla="val -9657"/>
-                            <a:gd name="adj2" fmla="val -185491"/>
-                          </a:avLst>
-                        </a:prstGeom>
-                        <a:noFill/>
-                        <a:ln w="12700" cap="flat" cmpd="sng">
-                          <a:solidFill>
-                            <a:srgbClr val="000000"/>
-                          </a:solidFill>
-                          <a:prstDash val="dash"/>
-                          <a:miter/>
-                          <a:headEnd type="none" w="med" len="med"/>
-                          <a:tailEnd type="none" w="med" len="med"/>
-                        </a:ln>
-                      </wps:spPr>
-                      <wps:txbx>
-                        <w:txbxContent>
-                          <w:p>
-                            <w:pPr>
-                              <w:spacing w:line="240" w:lineRule="auto"/>
-                              <w:ind w:firstLine="0" w:firstLineChars="0"/>
-                              <w:rPr>
-                                <w:color w:val="FF0000"/>
-                                <w:sz w:val="18"/>
-                                <w:szCs w:val="18"/>
-                              </w:rPr>
-                            </w:pPr>
-                            <w:r>
-                              <w:rPr>
-                                <w:rFonts w:hint="eastAsia"/>
-                                <w:color w:val="FF0000"/>
-                                <w:sz w:val="21"/>
-                                <w:szCs w:val="21"/>
-                              </w:rPr>
-                              <w:t xml:space="preserve">Arial Black字体 小四号 </w:t>
-                            </w:r>
-                            <w:r>
-                              <w:rPr>
-                                <w:rFonts w:hint="eastAsia"/>
-                                <w:color w:val="FF0000"/>
-                                <w:sz w:val="21"/>
-                                <w:szCs w:val="21"/>
-                                <w:highlight w:val="yellow"/>
-                                <w:lang w:val="en-US" w:eastAsia="zh-CN"/>
-                              </w:rPr>
-                              <w:t>顶格</w:t>
-                            </w:r>
-                            <w:r>
-                              <w:rPr>
-                                <w:rFonts w:hint="eastAsia"/>
-                                <w:color w:val="FF0000"/>
-                                <w:sz w:val="21"/>
-                                <w:szCs w:val="21"/>
-                              </w:rPr>
-                              <w:t>书写，行距固定值22磅</w:t>
-                            </w:r>
-                          </w:p>
-                        </w:txbxContent>
-                      </wps:txbx>
-                      <wps:bodyPr vert="horz" wrap="square" anchor="t" anchorCtr="0" upright="1"/>
-                    </wps:wsp>
-                  </a:graphicData>
-                </a:graphic>
-              </wp:anchor>
-            </w:drawing>
-          </mc:Choice>
-          <mc:Fallback>
-            <w:pict>
-              <v:shape id="自选图形 21" o:spid="_x0000_s1026" o:spt="61" type="#_x0000_t61" style="position:absolute;left:0pt;margin-left:-39.5pt;margin-top:48.65pt;height:57.9pt;width:181.7pt;z-index:251664384;mso-width-relative:page;mso-height-relative:page;" filled="f" stroked="t" coordsize="21600,21600" o:gfxdata="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" adj="8714,-29266">
-                <v:fill on="f" focussize="0,0"/>
-                <v:stroke weight="1pt" color="#000000" joinstyle="miter" dashstyle="dash"/>
-                <v:imagedata o:title=""/>
-                <o:lock v:ext="edit" aspectratio="f"/>
-                <v:textbox>
-                  <w:txbxContent>
-                    <w:p>
-                      <w:pPr>
-                        <w:spacing w:line="240" w:lineRule="auto"/>
-                        <w:ind w:firstLine="0" w:firstLineChars="0"/>
-                        <w:rPr>
-                          <w:color w:val="FF0000"/>
-                          <w:sz w:val="18"/>
-                          <w:szCs w:val="18"/>
-                        </w:rPr>
-                      </w:pPr>
-                      <w:r>
-                        <w:rPr>
-                          <w:rFonts w:hint="eastAsia"/>
-                          <w:color w:val="FF0000"/>
-                          <w:sz w:val="21"/>
-                          <w:szCs w:val="21"/>
-                        </w:rPr>
-                        <w:t xml:space="preserve">Arial Black字体 小四号 </w:t>
-                      </w:r>
-                      <w:r>
-                        <w:rPr>
-                          <w:rFonts w:hint="eastAsia"/>
-                          <w:color w:val="FF0000"/>
-                          <w:sz w:val="21"/>
-                          <w:szCs w:val="21"/>
-                          <w:highlight w:val="yellow"/>
-                          <w:lang w:val="en-US" w:eastAsia="zh-CN"/>
-                        </w:rPr>
-                        <w:t>顶格</w:t>
-                      </w:r>
-                      <w:r>
-                        <w:rPr>
-                          <w:rFonts w:hint="eastAsia"/>
-                          <w:color w:val="FF0000"/>
-                          <w:sz w:val="21"/>
-                          <w:szCs w:val="21"/>
-                        </w:rPr>
-                        <w:t>书写，行距固定值22磅</w:t>
-                      </w:r>
-                    </w:p>
-                  </w:txbxContent>
-                </v:textbox>
-              </v:shape>
-            </w:pict>
-          </mc:Fallback>
-        </mc:AlternateContent>
       </w:r>
       <w:r>
         <w:br w:type="page"/>
@@ -4037,116 +2875,6 @@
           <w:rFonts w:hint="eastAsia" w:ascii="宋体" w:hAnsi="宋体" w:cs="Arial"/>
           <w:bCs/>
         </w:rPr>
-        <mc:AlternateContent>
-          <mc:Choice Requires="wps">
-            <w:drawing>
-              <wp:anchor distT="0" distB="0" distL="114300" distR="114300" simplePos="0" relativeHeight="251731968" behindDoc="0" locked="0" layoutInCell="1" allowOverlap="1">
-                <wp:simplePos x="0" y="0"/>
-                <wp:positionH relativeFrom="column">
-                  <wp:posOffset>3860165</wp:posOffset>
-                </wp:positionH>
-                <wp:positionV relativeFrom="paragraph">
-                  <wp:posOffset>-76835</wp:posOffset>
-                </wp:positionV>
-                <wp:extent cx="2608580" cy="735330"/>
-                <wp:effectExtent l="735965" t="6350" r="8255" b="20320"/>
-                <wp:wrapNone/>
-                <wp:docPr id="82" name="自选图形 207"/>
-                <wp:cNvGraphicFramePr/>
-                <a:graphic xmlns:a="http://schemas.openxmlformats.org/drawingml/2006/main">
-                  <a:graphicData uri="http://schemas.microsoft.com/office/word/2010/wordprocessingShape">
-                    <wps:wsp>
-                      <wps:cNvSpPr/>
-                      <wps:spPr>
-                        <a:xfrm>
-                          <a:off x="0" y="0"/>
-                          <a:ext cx="2608580" cy="735330"/>
-                        </a:xfrm>
-                        <a:prstGeom prst="wedgeRectCallout">
-                          <a:avLst>
-                            <a:gd name="adj1" fmla="val -77282"/>
-                            <a:gd name="adj2" fmla="val 16495"/>
-                          </a:avLst>
-                        </a:prstGeom>
-                        <a:noFill/>
-                        <a:ln w="12700" cap="flat" cmpd="sng">
-                          <a:solidFill>
-                            <a:srgbClr val="000000"/>
-                          </a:solidFill>
-                          <a:prstDash val="dash"/>
-                          <a:miter/>
-                          <a:headEnd type="none" w="med" len="med"/>
-                          <a:tailEnd type="none" w="med" len="med"/>
-                        </a:ln>
-                      </wps:spPr>
-                      <wps:txbx>
-                        <w:txbxContent>
-                          <w:p>
-                            <w:pPr>
-                              <w:spacing w:line="240" w:lineRule="auto"/>
-                              <w:ind w:firstLine="0" w:firstLineChars="0"/>
-                              <w:rPr>
-                                <w:rFonts w:hint="eastAsia"/>
-                                <w:color w:val="FF0000"/>
-                                <w:sz w:val="18"/>
-                                <w:szCs w:val="18"/>
-                              </w:rPr>
-                            </w:pPr>
-                            <w:r>
-                              <w:rPr>
-                                <w:rFonts w:hint="eastAsia"/>
-                                <w:color w:val="FF0000"/>
-                                <w:sz w:val="18"/>
-                                <w:szCs w:val="18"/>
-                              </w:rPr>
-                              <w:t>目录小三号黑体居中书写，行距固定值22磅，两个字直接空四个空格</w:t>
-                            </w:r>
-                          </w:p>
-                        </w:txbxContent>
-                      </wps:txbx>
-                      <wps:bodyPr vert="horz" wrap="square" anchor="t" anchorCtr="0" upright="1"/>
-                    </wps:wsp>
-                  </a:graphicData>
-                </a:graphic>
-              </wp:anchor>
-            </w:drawing>
-          </mc:Choice>
-          <mc:Fallback>
-            <w:pict>
-              <v:shape id="自选图形 207" o:spid="_x0000_s1026" o:spt="61" type="#_x0000_t61" style="position:absolute;left:0pt;margin-left:303.95pt;margin-top:-6.05pt;height:57.9pt;width:205.4pt;z-index:251731968;mso-width-relative:page;mso-height-relative:page;" filled="f" stroked="t" coordsize="21600,21600" o:gfxdata="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" adj="-5893,14363">
-                <v:fill on="f" focussize="0,0"/>
-                <v:stroke weight="1pt" color="#000000" joinstyle="miter" dashstyle="dash"/>
-                <v:imagedata o:title=""/>
-                <o:lock v:ext="edit" aspectratio="f"/>
-                <v:textbox>
-                  <w:txbxContent>
-                    <w:p>
-                      <w:pPr>
-                        <w:spacing w:line="240" w:lineRule="auto"/>
-                        <w:ind w:firstLine="0" w:firstLineChars="0"/>
-                        <w:rPr>
-                          <w:rFonts w:hint="eastAsia"/>
-                          <w:color w:val="FF0000"/>
-                          <w:sz w:val="18"/>
-                          <w:szCs w:val="18"/>
-                        </w:rPr>
-                      </w:pPr>
-                      <w:r>
-                        <w:rPr>
-                          <w:rFonts w:hint="eastAsia"/>
-                          <w:color w:val="FF0000"/>
-                          <w:sz w:val="18"/>
-                          <w:szCs w:val="18"/>
-                        </w:rPr>
-                        <w:t>目录小三号黑体居中书写，行距固定值22磅，两个字直接空四个空格</w:t>
-                      </w:r>
-                    </w:p>
-                  </w:txbxContent>
-                </v:textbox>
-              </v:shape>
-            </w:pict>
-          </mc:Fallback>
-        </mc:AlternateContent>
       </w:r>
     </w:p>
     <w:p>
@@ -4167,116 +2895,6 @@
           <w:b/>
           <w:lang/>
         </w:rPr>
-        <mc:AlternateContent>
-          <mc:Choice Requires="wps">
-            <w:drawing>
-              <wp:anchor distT="0" distB="0" distL="114300" distR="114300" simplePos="0" relativeHeight="251706368" behindDoc="0" locked="0" layoutInCell="1" allowOverlap="1">
-                <wp:simplePos x="0" y="0"/>
-                <wp:positionH relativeFrom="column">
-                  <wp:posOffset>309880</wp:posOffset>
-                </wp:positionH>
-                <wp:positionV relativeFrom="paragraph">
-                  <wp:posOffset>-1130935</wp:posOffset>
-                </wp:positionV>
-                <wp:extent cx="2608580" cy="735330"/>
-                <wp:effectExtent l="249555" t="6350" r="12065" b="299720"/>
-                <wp:wrapNone/>
-                <wp:docPr id="57" name="自选图形 138"/>
-                <wp:cNvGraphicFramePr/>
-                <a:graphic xmlns:a="http://schemas.openxmlformats.org/drawingml/2006/main">
-                  <a:graphicData uri="http://schemas.microsoft.com/office/word/2010/wordprocessingShape">
-                    <wps:wsp>
-                      <wps:cNvSpPr/>
-                      <wps:spPr>
-                        <a:xfrm>
-                          <a:off x="0" y="0"/>
-                          <a:ext cx="2608580" cy="735330"/>
-                        </a:xfrm>
-                        <a:prstGeom prst="wedgeRectCallout">
-                          <a:avLst>
-                            <a:gd name="adj1" fmla="val -57694"/>
-                            <a:gd name="adj2" fmla="val 85579"/>
-                          </a:avLst>
-                        </a:prstGeom>
-                        <a:noFill/>
-                        <a:ln w="12700" cap="flat" cmpd="sng">
-                          <a:solidFill>
-                            <a:srgbClr val="000000"/>
-                          </a:solidFill>
-                          <a:prstDash val="dash"/>
-                          <a:miter/>
-                          <a:headEnd type="none" w="med" len="med"/>
-                          <a:tailEnd type="none" w="med" len="med"/>
-                        </a:ln>
-                      </wps:spPr>
-                      <wps:txbx>
-                        <w:txbxContent>
-                          <w:p>
-                            <w:pPr>
-                              <w:spacing w:line="240" w:lineRule="auto"/>
-                              <w:ind w:firstLine="0" w:firstLineChars="0"/>
-                              <w:rPr>
-                                <w:rFonts w:hint="eastAsia"/>
-                                <w:color w:val="FF0000"/>
-                                <w:sz w:val="18"/>
-                                <w:szCs w:val="18"/>
-                              </w:rPr>
-                            </w:pPr>
-                            <w:r>
-                              <w:rPr>
-                                <w:rFonts w:hint="eastAsia"/>
-                                <w:color w:val="FF0000"/>
-                                <w:sz w:val="18"/>
-                                <w:szCs w:val="18"/>
-                              </w:rPr>
-                              <w:t>此处空一行，宋体小四，不加粗，行距：固定值22磅</w:t>
-                            </w:r>
-                          </w:p>
-                        </w:txbxContent>
-                      </wps:txbx>
-                      <wps:bodyPr wrap="square" upright="1"/>
-                    </wps:wsp>
-                  </a:graphicData>
-                </a:graphic>
-              </wp:anchor>
-            </w:drawing>
-          </mc:Choice>
-          <mc:Fallback>
-            <w:pict>
-              <v:shape id="自选图形 138" o:spid="_x0000_s1026" o:spt="61" type="#_x0000_t61" style="position:absolute;left:0pt;margin-left:24.4pt;margin-top:-89.05pt;height:57.9pt;width:205.4pt;z-index:251706368;mso-width-relative:page;mso-height-relative:page;" filled="f" stroked="t" coordsize="21600,21600" o:gfxdata="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" adj="-1662,29285">
-                <v:fill on="f" focussize="0,0"/>
-                <v:stroke weight="1pt" color="#000000" joinstyle="miter" dashstyle="dash"/>
-                <v:imagedata o:title=""/>
-                <o:lock v:ext="edit" aspectratio="f"/>
-                <v:textbox>
-                  <w:txbxContent>
-                    <w:p>
-                      <w:pPr>
-                        <w:spacing w:line="240" w:lineRule="auto"/>
-                        <w:ind w:firstLine="0" w:firstLineChars="0"/>
-                        <w:rPr>
-                          <w:rFonts w:hint="eastAsia"/>
-                          <w:color w:val="FF0000"/>
-                          <w:sz w:val="18"/>
-                          <w:szCs w:val="18"/>
-                        </w:rPr>
-                      </w:pPr>
-                      <w:r>
-                        <w:rPr>
-                          <w:rFonts w:hint="eastAsia"/>
-                          <w:color w:val="FF0000"/>
-                          <w:sz w:val="18"/>
-                          <w:szCs w:val="18"/>
-                        </w:rPr>
-                        <w:t>此处空一行，宋体小四，不加粗，行距：固定值22磅</w:t>
-                      </w:r>
-                    </w:p>
-                  </w:txbxContent>
-                </v:textbox>
-              </v:shape>
-            </w:pict>
-          </mc:Fallback>
-        </mc:AlternateContent>
       </w:r>
       <w:r>
         <w:rPr>
@@ -4304,188 +2922,6 @@
           <w:bCs/>
           <w:lang/>
         </w:rPr>
-        <mc:AlternateContent>
-          <mc:Choice Requires="wps">
-            <w:drawing>
-              <wp:anchor distT="0" distB="0" distL="114300" distR="114300" simplePos="0" relativeHeight="251708416" behindDoc="0" locked="0" layoutInCell="1" allowOverlap="1">
-                <wp:simplePos x="0" y="0"/>
-                <wp:positionH relativeFrom="column">
-                  <wp:posOffset>974090</wp:posOffset>
-                </wp:positionH>
-                <wp:positionV relativeFrom="paragraph">
-                  <wp:posOffset>207645</wp:posOffset>
-                </wp:positionV>
-                <wp:extent cx="2607310" cy="354965"/>
-                <wp:effectExtent l="161925" t="6350" r="24765" b="146685"/>
-                <wp:wrapNone/>
-                <wp:docPr id="59" name="自选图形 140"/>
-                <wp:cNvGraphicFramePr/>
-                <a:graphic xmlns:a="http://schemas.openxmlformats.org/drawingml/2006/main">
-                  <a:graphicData uri="http://schemas.microsoft.com/office/word/2010/wordprocessingShape">
-                    <wps:wsp>
-                      <wps:cNvSpPr/>
-                      <wps:spPr>
-                        <a:xfrm>
-                          <a:off x="0" y="0"/>
-                          <a:ext cx="2607310" cy="354965"/>
-                        </a:xfrm>
-                        <a:prstGeom prst="wedgeRectCallout">
-                          <a:avLst>
-                            <a:gd name="adj1" fmla="val -54255"/>
-                            <a:gd name="adj2" fmla="val 82222"/>
-                          </a:avLst>
-                        </a:prstGeom>
-                        <a:noFill/>
-                        <a:ln w="12700" cap="flat" cmpd="sng">
-                          <a:solidFill>
-                            <a:srgbClr val="000000"/>
-                          </a:solidFill>
-                          <a:prstDash val="dash"/>
-                          <a:miter/>
-                          <a:headEnd type="none" w="med" len="med"/>
-                          <a:tailEnd type="none" w="med" len="med"/>
-                        </a:ln>
-                      </wps:spPr>
-                      <wps:txbx>
-                        <w:txbxContent>
-                          <w:p>
-                            <w:pPr>
-                              <w:spacing w:line="240" w:lineRule="auto"/>
-                              <w:ind w:firstLine="0" w:firstLineChars="0"/>
-                              <w:rPr>
-                                <w:rFonts w:hint="eastAsia"/>
-                                <w:color w:val="0070C0"/>
-                                <w:sz w:val="11"/>
-                                <w:szCs w:val="11"/>
-                              </w:rPr>
-                            </w:pPr>
-                            <w:r>
-                              <w:rPr>
-                                <w:rFonts w:hint="eastAsia" w:ascii="宋体" w:hAnsi="宋体" w:eastAsia="宋体"/>
-                                <w:color w:val="0070C0"/>
-                                <w:sz w:val="18"/>
-                                <w:szCs w:val="18"/>
-                              </w:rPr>
-                              <w:t>一级标题小四</w:t>
-                            </w:r>
-                            <w:r>
-                              <w:rPr>
-                                <w:rFonts w:ascii="宋体" w:hAnsi="宋体" w:eastAsia="宋体"/>
-                                <w:color w:val="0070C0"/>
-                                <w:sz w:val="18"/>
-                                <w:szCs w:val="18"/>
-                              </w:rPr>
-                              <w:t>号</w:t>
-                            </w:r>
-                            <w:r>
-                              <w:rPr>
-                                <w:rFonts w:hint="eastAsia" w:ascii="宋体" w:hAnsi="宋体" w:eastAsia="宋体"/>
-                                <w:color w:val="0070C0"/>
-                                <w:sz w:val="18"/>
-                                <w:szCs w:val="18"/>
-                              </w:rPr>
-                              <w:t>加粗</w:t>
-                            </w:r>
-                            <w:r>
-                              <w:rPr>
-                                <w:rFonts w:ascii="宋体" w:hAnsi="宋体" w:eastAsia="宋体"/>
-                                <w:color w:val="0070C0"/>
-                                <w:sz w:val="18"/>
-                                <w:szCs w:val="18"/>
-                              </w:rPr>
-                              <w:t>宋体</w:t>
-                            </w:r>
-                            <w:r>
-                              <w:rPr>
-                                <w:rFonts w:hint="eastAsia" w:ascii="宋体" w:hAnsi="宋体" w:eastAsia="宋体"/>
-                                <w:color w:val="0070C0"/>
-                                <w:sz w:val="18"/>
-                                <w:szCs w:val="18"/>
-                              </w:rPr>
-                              <w:t>字</w:t>
-                            </w:r>
-                          </w:p>
-                        </w:txbxContent>
-                      </wps:txbx>
-                      <wps:bodyPr vert="horz" wrap="square" anchor="t" anchorCtr="0" upright="1"/>
-                    </wps:wsp>
-                  </a:graphicData>
-                </a:graphic>
-              </wp:anchor>
-            </w:drawing>
-          </mc:Choice>
-          <mc:Fallback>
-            <w:pict>
-              <v:shape id="自选图形 140" o:spid="_x0000_s1026" o:spt="61" type="#_x0000_t61" style="position:absolute;left:0pt;margin-left:76.7pt;margin-top:16.35pt;height:27.95pt;width:205.3pt;z-index:251708416;mso-width-relative:page;mso-height-relative:page;" filled="f" stroked="t" coordsize="21600,21600" o:gfxdata="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" adj="-919,28560">
-                <v:fill on="f" focussize="0,0"/>
-                <v:stroke weight="1pt" color="#000000" joinstyle="miter" dashstyle="dash"/>
-                <v:imagedata o:title=""/>
-                <o:lock v:ext="edit" aspectratio="f"/>
-                <v:textbox>
-                  <w:txbxContent>
-                    <w:p>
-                      <w:pPr>
-                        <w:spacing w:line="240" w:lineRule="auto"/>
-                        <w:ind w:firstLine="0" w:firstLineChars="0"/>
-                        <w:rPr>
-                          <w:rFonts w:hint="eastAsia"/>
-                          <w:color w:val="0070C0"/>
-                          <w:sz w:val="11"/>
-                          <w:szCs w:val="11"/>
-                        </w:rPr>
-                      </w:pPr>
-                      <w:r>
-                        <w:rPr>
-                          <w:rFonts w:hint="eastAsia" w:ascii="宋体" w:hAnsi="宋体" w:eastAsia="宋体"/>
-                          <w:color w:val="0070C0"/>
-                          <w:sz w:val="18"/>
-                          <w:szCs w:val="18"/>
-                        </w:rPr>
-                        <w:t>一级标题小四</w:t>
-                      </w:r>
-                      <w:r>
-                        <w:rPr>
-                          <w:rFonts w:ascii="宋体" w:hAnsi="宋体" w:eastAsia="宋体"/>
-                          <w:color w:val="0070C0"/>
-                          <w:sz w:val="18"/>
-                          <w:szCs w:val="18"/>
-                        </w:rPr>
-                        <w:t>号</w:t>
-                      </w:r>
-                      <w:r>
-                        <w:rPr>
-                          <w:rFonts w:hint="eastAsia" w:ascii="宋体" w:hAnsi="宋体" w:eastAsia="宋体"/>
-                          <w:color w:val="0070C0"/>
-                          <w:sz w:val="18"/>
-                          <w:szCs w:val="18"/>
-                        </w:rPr>
-                        <w:t>加粗</w:t>
-                      </w:r>
-                      <w:r>
-                        <w:rPr>
-                          <w:rFonts w:ascii="宋体" w:hAnsi="宋体" w:eastAsia="宋体"/>
-                          <w:color w:val="0070C0"/>
-                          <w:sz w:val="18"/>
-                          <w:szCs w:val="18"/>
-                        </w:rPr>
-                        <w:t>宋体</w:t>
-                      </w:r>
-                      <w:r>
-                        <w:rPr>
-                          <w:rFonts w:hint="eastAsia" w:ascii="宋体" w:hAnsi="宋体" w:eastAsia="宋体"/>
-                          <w:color w:val="0070C0"/>
-                          <w:sz w:val="18"/>
-                          <w:szCs w:val="18"/>
-                        </w:rPr>
-                        <w:t>字</w:t>
-                      </w:r>
-                    </w:p>
-                  </w:txbxContent>
-                </v:textbox>
-              </v:shape>
-            </w:pict>
-          </mc:Fallback>
-        </mc:AlternateContent>
       </w:r>
     </w:p>
     <w:p>
@@ -4500,116 +2936,6 @@
           <w:color w:val="0000FF"/>
           <w:u w:val="single"/>
         </w:rPr>
-        <mc:AlternateContent>
-          <mc:Choice Requires="wps">
-            <w:drawing>
-              <wp:anchor distT="0" distB="0" distL="114300" distR="114300" simplePos="0" relativeHeight="251707392" behindDoc="0" locked="0" layoutInCell="1" allowOverlap="1">
-                <wp:simplePos x="0" y="0"/>
-                <wp:positionH relativeFrom="column">
-                  <wp:posOffset>-852170</wp:posOffset>
-                </wp:positionH>
-                <wp:positionV relativeFrom="paragraph">
-                  <wp:posOffset>17145</wp:posOffset>
-                </wp:positionV>
-                <wp:extent cx="774700" cy="1552575"/>
-                <wp:effectExtent l="6350" t="179705" r="412750" b="20320"/>
-                <wp:wrapNone/>
-                <wp:docPr id="58" name="自选图形 139"/>
-                <wp:cNvGraphicFramePr/>
-                <a:graphic xmlns:a="http://schemas.openxmlformats.org/drawingml/2006/main">
-                  <a:graphicData uri="http://schemas.microsoft.com/office/word/2010/wordprocessingShape">
-                    <wps:wsp>
-                      <wps:cNvSpPr/>
-                      <wps:spPr>
-                        <a:xfrm>
-                          <a:off x="0" y="0"/>
-                          <a:ext cx="774700" cy="1552575"/>
-                        </a:xfrm>
-                        <a:prstGeom prst="wedgeRectCallout">
-                          <a:avLst>
-                            <a:gd name="adj1" fmla="val 99917"/>
-                            <a:gd name="adj2" fmla="val -59407"/>
-                          </a:avLst>
-                        </a:prstGeom>
-                        <a:noFill/>
-                        <a:ln w="12700" cap="flat" cmpd="sng">
-                          <a:solidFill>
-                            <a:srgbClr val="000000"/>
-                          </a:solidFill>
-                          <a:prstDash val="dash"/>
-                          <a:miter/>
-                          <a:headEnd type="none" w="med" len="med"/>
-                          <a:tailEnd type="none" w="med" len="med"/>
-                        </a:ln>
-                      </wps:spPr>
-                      <wps:txbx>
-                        <w:txbxContent>
-                          <w:p>
-                            <w:pPr>
-                              <w:spacing w:line="240" w:lineRule="auto"/>
-                              <w:ind w:firstLine="0" w:firstLineChars="0"/>
-                              <w:rPr>
-                                <w:rFonts w:hint="eastAsia"/>
-                                <w:color w:val="FF0000"/>
-                                <w:sz w:val="18"/>
-                                <w:szCs w:val="18"/>
-                              </w:rPr>
-                            </w:pPr>
-                            <w:r>
-                              <w:rPr>
-                                <w:rFonts w:hint="eastAsia"/>
-                                <w:color w:val="FF0000"/>
-                                <w:sz w:val="18"/>
-                                <w:szCs w:val="18"/>
-                              </w:rPr>
-                              <w:t>此处空一行，宋体小四，不加粗，行距：固定值22磅</w:t>
-                            </w:r>
-                          </w:p>
-                        </w:txbxContent>
-                      </wps:txbx>
-                      <wps:bodyPr wrap="square" upright="1"/>
-                    </wps:wsp>
-                  </a:graphicData>
-                </a:graphic>
-              </wp:anchor>
-            </w:drawing>
-          </mc:Choice>
-          <mc:Fallback>
-            <w:pict>
-              <v:shape id="自选图形 139" o:spid="_x0000_s1026" o:spt="61" type="#_x0000_t61" style="position:absolute;left:0pt;margin-left:-67.1pt;margin-top:1.35pt;height:122.25pt;width:61pt;z-index:251707392;mso-width-relative:page;mso-height-relative:page;" filled="f" stroked="t" coordsize="21600,21600" o:gfxdata="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" adj="32382,-2032">
-                <v:fill on="f" focussize="0,0"/>
-                <v:stroke weight="1pt" color="#000000" joinstyle="miter" dashstyle="dash"/>
-                <v:imagedata o:title=""/>
-                <o:lock v:ext="edit" aspectratio="f"/>
-                <v:textbox>
-                  <w:txbxContent>
-                    <w:p>
-                      <w:pPr>
-                        <w:spacing w:line="240" w:lineRule="auto"/>
-                        <w:ind w:firstLine="0" w:firstLineChars="0"/>
-                        <w:rPr>
-                          <w:rFonts w:hint="eastAsia"/>
-                          <w:color w:val="FF0000"/>
-                          <w:sz w:val="18"/>
-                          <w:szCs w:val="18"/>
-                        </w:rPr>
-                      </w:pPr>
-                      <w:r>
-                        <w:rPr>
-                          <w:rFonts w:hint="eastAsia"/>
-                          <w:color w:val="FF0000"/>
-                          <w:sz w:val="18"/>
-                          <w:szCs w:val="18"/>
-                        </w:rPr>
-                        <w:t>此处空一行，宋体小四，不加粗，行距：固定值22磅</w:t>
-                      </w:r>
-                    </w:p>
-                  </w:txbxContent>
-                </v:textbox>
-              </v:shape>
-            </w:pict>
-          </mc:Fallback>
-        </mc:AlternateContent>
       </w:r>
       <w:r>
         <w:rPr>
@@ -4659,172 +2985,6 @@
           <w:rFonts w:hint="eastAsia" w:ascii="宋体" w:hAnsi="宋体" w:cs="Arial"/>
           <w:bCs/>
         </w:rPr>
-        <mc:AlternateContent>
-          <mc:Choice Requires="wps">
-            <w:drawing>
-              <wp:anchor distT="0" distB="0" distL="114300" distR="114300" simplePos="0" relativeHeight="251730944" behindDoc="0" locked="0" layoutInCell="1" allowOverlap="1">
-                <wp:simplePos x="0" y="0"/>
-                <wp:positionH relativeFrom="column">
-                  <wp:posOffset>1863090</wp:posOffset>
-                </wp:positionH>
-                <wp:positionV relativeFrom="paragraph">
-                  <wp:posOffset>258445</wp:posOffset>
-                </wp:positionV>
-                <wp:extent cx="2607310" cy="354965"/>
-                <wp:effectExtent l="161925" t="6350" r="24765" b="146685"/>
-                <wp:wrapNone/>
-                <wp:docPr id="81" name="自选图形 206"/>
-                <wp:cNvGraphicFramePr/>
-                <a:graphic xmlns:a="http://schemas.openxmlformats.org/drawingml/2006/main">
-                  <a:graphicData uri="http://schemas.microsoft.com/office/word/2010/wordprocessingShape">
-                    <wps:wsp>
-                      <wps:cNvSpPr/>
-                      <wps:spPr>
-                        <a:xfrm>
-                          <a:off x="0" y="0"/>
-                          <a:ext cx="2607310" cy="354965"/>
-                        </a:xfrm>
-                        <a:prstGeom prst="wedgeRectCallout">
-                          <a:avLst>
-                            <a:gd name="adj1" fmla="val -54255"/>
-                            <a:gd name="adj2" fmla="val 82222"/>
-                          </a:avLst>
-                        </a:prstGeom>
-                        <a:noFill/>
-                        <a:ln w="12700" cap="flat" cmpd="sng">
-                          <a:solidFill>
-                            <a:srgbClr val="000000"/>
-                          </a:solidFill>
-                          <a:prstDash val="dash"/>
-                          <a:miter/>
-                          <a:headEnd type="none" w="med" len="med"/>
-                          <a:tailEnd type="none" w="med" len="med"/>
-                        </a:ln>
-                      </wps:spPr>
-                      <wps:txbx>
-                        <w:txbxContent>
-                          <w:p>
-                            <w:pPr>
-                              <w:spacing w:line="240" w:lineRule="auto"/>
-                              <w:ind w:firstLine="0" w:firstLineChars="0"/>
-                              <w:rPr>
-                                <w:rFonts w:hint="eastAsia"/>
-                                <w:color w:val="0070C0"/>
-                                <w:sz w:val="11"/>
-                                <w:szCs w:val="11"/>
-                              </w:rPr>
-                            </w:pPr>
-                            <w:r>
-                              <w:rPr>
-                                <w:rFonts w:hint="eastAsia" w:ascii="宋体" w:hAnsi="宋体" w:eastAsia="宋体"/>
-                                <w:color w:val="0070C0"/>
-                                <w:sz w:val="18"/>
-                                <w:szCs w:val="18"/>
-                                <w:lang w:eastAsia="zh-CN"/>
-                              </w:rPr>
-                              <w:t>二、三</w:t>
-                            </w:r>
-                            <w:r>
-                              <w:rPr>
-                                <w:rFonts w:hint="eastAsia" w:ascii="宋体" w:hAnsi="宋体" w:eastAsia="宋体"/>
-                                <w:color w:val="0070C0"/>
-                                <w:sz w:val="18"/>
-                                <w:szCs w:val="18"/>
-                              </w:rPr>
-                              <w:t>级标题小四</w:t>
-                            </w:r>
-                            <w:r>
-                              <w:rPr>
-                                <w:rFonts w:ascii="宋体" w:hAnsi="宋体" w:eastAsia="宋体"/>
-                                <w:color w:val="0070C0"/>
-                                <w:sz w:val="18"/>
-                                <w:szCs w:val="18"/>
-                              </w:rPr>
-                              <w:t>号宋体</w:t>
-                            </w:r>
-                            <w:r>
-                              <w:rPr>
-                                <w:rFonts w:hint="eastAsia" w:ascii="宋体" w:hAnsi="宋体" w:eastAsia="宋体"/>
-                                <w:color w:val="0070C0"/>
-                                <w:sz w:val="18"/>
-                                <w:szCs w:val="18"/>
-                              </w:rPr>
-                              <w:t>字</w:t>
-                            </w:r>
-                          </w:p>
-                        </w:txbxContent>
-                      </wps:txbx>
-                      <wps:bodyPr wrap="square" upright="1"/>
-                    </wps:wsp>
-                  </a:graphicData>
-                </a:graphic>
-              </wp:anchor>
-            </w:drawing>
-          </mc:Choice>
-          <mc:Fallback>
-            <w:pict>
-              <v:shape id="自选图形 206" o:spid="_x0000_s1026" o:spt="61" type="#_x0000_t61" style="position:absolute;left:0pt;margin-left:146.7pt;margin-top:20.35pt;height:27.95pt;width:205.3pt;z-index:251730944;mso-width-relative:page;mso-height-relative:page;" filled="f" stroked="t" coordsize="21600,21600" o:gfxdata="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" adj="-919,28560">
-                <v:fill on="f" focussize="0,0"/>
-                <v:stroke weight="1pt" color="#000000" joinstyle="miter" dashstyle="dash"/>
-                <v:imagedata o:title=""/>
-                <o:lock v:ext="edit" aspectratio="f"/>
-                <v:textbox>
-                  <w:txbxContent>
-                    <w:p>
-                      <w:pPr>
-                        <w:spacing w:line="240" w:lineRule="auto"/>
-                        <w:ind w:firstLine="0" w:firstLineChars="0"/>
-                        <w:rPr>
-                          <w:rFonts w:hint="eastAsia"/>
-                          <w:color w:val="0070C0"/>
-                          <w:sz w:val="11"/>
-                          <w:szCs w:val="11"/>
-                        </w:rPr>
-                      </w:pPr>
-                      <w:r>
-                        <w:rPr>
-                          <w:rFonts w:hint="eastAsia" w:ascii="宋体" w:hAnsi="宋体" w:eastAsia="宋体"/>
-                          <w:color w:val="0070C0"/>
-                          <w:sz w:val="18"/>
-                          <w:szCs w:val="18"/>
-                          <w:lang w:eastAsia="zh-CN"/>
-                        </w:rPr>
-                        <w:t>二、三</w:t>
-                      </w:r>
-                      <w:r>
-                        <w:rPr>
-                          <w:rFonts w:hint="eastAsia" w:ascii="宋体" w:hAnsi="宋体" w:eastAsia="宋体"/>
-                          <w:color w:val="0070C0"/>
-                          <w:sz w:val="18"/>
-                          <w:szCs w:val="18"/>
-                        </w:rPr>
-                        <w:t>级标题小四</w:t>
-                      </w:r>
-                      <w:r>
-                        <w:rPr>
-                          <w:rFonts w:ascii="宋体" w:hAnsi="宋体" w:eastAsia="宋体"/>
-                          <w:color w:val="0070C0"/>
-                          <w:sz w:val="18"/>
-                          <w:szCs w:val="18"/>
-                        </w:rPr>
-                        <w:t>号宋体</w:t>
-                      </w:r>
-                      <w:r>
-                        <w:rPr>
-                          <w:rFonts w:hint="eastAsia" w:ascii="宋体" w:hAnsi="宋体" w:eastAsia="宋体"/>
-                          <w:color w:val="0070C0"/>
-                          <w:sz w:val="18"/>
-                          <w:szCs w:val="18"/>
-                        </w:rPr>
-                        <w:t>字</w:t>
-                      </w:r>
-                    </w:p>
-                  </w:txbxContent>
-                </v:textbox>
-              </v:shape>
-            </w:pict>
-          </mc:Fallback>
-        </mc:AlternateContent>
       </w:r>
       <w:r>
         <w:fldChar w:fldCharType="begin"/>
@@ -5822,278 +3982,6 @@
           <w:rFonts w:hint="eastAsia" w:ascii="宋体" w:hAnsi="宋体" w:cs="Arial"/>
           <w:bCs/>
         </w:rPr>
-        <mc:AlternateContent>
-          <mc:Choice Requires="wps">
-            <w:drawing>
-              <wp:anchor distT="0" distB="0" distL="114300" distR="114300" simplePos="0" relativeHeight="251729920" behindDoc="0" locked="0" layoutInCell="1" allowOverlap="1">
-                <wp:simplePos x="0" y="0"/>
-                <wp:positionH relativeFrom="column">
-                  <wp:posOffset>1478915</wp:posOffset>
-                </wp:positionH>
-                <wp:positionV relativeFrom="paragraph">
-                  <wp:posOffset>554990</wp:posOffset>
-                </wp:positionV>
-                <wp:extent cx="3294380" cy="1660525"/>
-                <wp:effectExtent l="6350" t="2303780" r="26670" b="23495"/>
-                <wp:wrapNone/>
-                <wp:docPr id="80" name="自选图形 205"/>
-                <wp:cNvGraphicFramePr/>
-                <a:graphic xmlns:a="http://schemas.openxmlformats.org/drawingml/2006/main">
-                  <a:graphicData uri="http://schemas.microsoft.com/office/word/2010/wordprocessingShape">
-                    <wps:wsp>
-                      <wps:cNvSpPr/>
-                      <wps:spPr>
-                        <a:xfrm>
-                          <a:off x="0" y="0"/>
-                          <a:ext cx="3294380" cy="1660525"/>
-                        </a:xfrm>
-                        <a:prstGeom prst="wedgeRectCallout">
-                          <a:avLst>
-                            <a:gd name="adj1" fmla="val -4065"/>
-                            <a:gd name="adj2" fmla="val -186551"/>
-                          </a:avLst>
-                        </a:prstGeom>
-                        <a:noFill/>
-                        <a:ln w="12700" cap="flat" cmpd="sng">
-                          <a:solidFill>
-                            <a:srgbClr val="000000"/>
-                          </a:solidFill>
-                          <a:prstDash val="dash"/>
-                          <a:miter/>
-                          <a:headEnd type="none" w="med" len="med"/>
-                          <a:tailEnd type="none" w="med" len="med"/>
-                        </a:ln>
-                      </wps:spPr>
-                      <wps:txbx>
-                        <w:txbxContent>
-                          <w:p>
-                            <w:pPr>
-                              <w:spacing w:line="360" w:lineRule="auto"/>
-                              <w:ind w:firstLine="0" w:firstLineChars="0"/>
-                              <w:rPr>
-                                <w:rFonts w:hint="eastAsia"/>
-                                <w:b/>
-                                <w:bCs/>
-                                <w:color w:val="0070C0"/>
-                                <w:sz w:val="24"/>
-                                <w:szCs w:val="24"/>
-                                <w:lang w:eastAsia="zh-CN"/>
-                              </w:rPr>
-                            </w:pPr>
-                            <w:r>
-                              <w:rPr>
-                                <w:rFonts w:hint="eastAsia"/>
-                                <w:b/>
-                                <w:bCs/>
-                                <w:color w:val="0070C0"/>
-                                <w:sz w:val="24"/>
-                                <w:szCs w:val="24"/>
-                                <w:lang w:eastAsia="zh-CN"/>
-                              </w:rPr>
-                              <w:t>采用插入引用自动生成</w:t>
-                            </w:r>
-                            <w:r>
-                              <w:rPr>
-                                <w:rFonts w:hint="eastAsia"/>
-                                <w:b/>
-                                <w:bCs/>
-                                <w:color w:val="0070C0"/>
-                                <w:sz w:val="24"/>
-                                <w:szCs w:val="24"/>
-                              </w:rPr>
-                              <w:t>目录</w:t>
-                            </w:r>
-                            <w:r>
-                              <w:rPr>
-                                <w:rFonts w:hint="eastAsia"/>
-                                <w:b/>
-                                <w:bCs/>
-                                <w:color w:val="0070C0"/>
-                                <w:sz w:val="24"/>
-                                <w:szCs w:val="24"/>
-                                <w:lang w:eastAsia="zh-CN"/>
-                              </w:rPr>
-                              <w:t>，目录不超过三级，并调整为层层缩进（</w:t>
-                            </w:r>
-                            <w:r>
-                              <w:rPr>
-                                <w:rFonts w:hint="eastAsia"/>
-                                <w:b/>
-                                <w:bCs/>
-                                <w:color w:val="0070C0"/>
-                                <w:sz w:val="24"/>
-                                <w:szCs w:val="24"/>
-                                <w:lang w:val="en-US" w:eastAsia="zh-CN"/>
-                              </w:rPr>
-                              <w:t>shift+alt+.</w:t>
-                            </w:r>
-                            <w:r>
-                              <w:rPr>
-                                <w:rFonts w:hint="eastAsia"/>
-                                <w:b/>
-                                <w:bCs/>
-                                <w:color w:val="0070C0"/>
-                                <w:sz w:val="24"/>
-                                <w:szCs w:val="24"/>
-                                <w:lang w:eastAsia="zh-CN"/>
-                              </w:rPr>
-                              <w:t>）</w:t>
-                            </w:r>
-                          </w:p>
-                          <w:p>
-                            <w:pPr>
-                              <w:pStyle w:val="2"/>
-                              <w:rPr>
-                                <w:rFonts w:hint="default" w:ascii="Times New Roman" w:hAnsi="Times New Roman" w:eastAsia="宋体" w:cs="Times New Roman"/>
-                                <w:b/>
-                                <w:bCs/>
-                                <w:color w:val="0070C0"/>
-                                <w:kern w:val="2"/>
-                                <w:sz w:val="24"/>
-                                <w:szCs w:val="24"/>
-                                <w:lang w:val="en-US" w:eastAsia="zh-CN" w:bidi="ar-SA"/>
-                              </w:rPr>
-                            </w:pPr>
-                            <w:r>
-                              <w:rPr>
-                                <w:rFonts w:hint="eastAsia" w:ascii="Times New Roman" w:hAnsi="Times New Roman" w:eastAsia="宋体" w:cs="Times New Roman"/>
-                                <w:b/>
-                                <w:bCs/>
-                                <w:color w:val="0070C0"/>
-                                <w:kern w:val="2"/>
-                                <w:sz w:val="24"/>
-                                <w:szCs w:val="24"/>
-                                <w:lang w:val="en-US" w:eastAsia="zh-CN" w:bidi="ar-SA"/>
-                              </w:rPr>
-                              <w:t>生成后适当调整缩进距离，为原来的一半。方法：先按shift+退格，再按空格键调整缩进为原来的一半</w:t>
-                            </w:r>
-                          </w:p>
-                        </w:txbxContent>
-                      </wps:txbx>
-                      <wps:bodyPr vert="horz" wrap="square" anchor="t" anchorCtr="0" upright="1"/>
-                    </wps:wsp>
-                  </a:graphicData>
-                </a:graphic>
-              </wp:anchor>
-            </w:drawing>
-          </mc:Choice>
-          <mc:Fallback>
-            <w:pict>
-              <v:shape id="自选图形 205" o:spid="_x0000_s1026" o:spt="61" type="#_x0000_t61" style="position:absolute;left:0pt;margin-left:116.45pt;margin-top:43.7pt;height:130.75pt;width:259.4pt;z-index:251729920;mso-width-relative:page;mso-height-relative:page;" filled="f" stroked="t" coordsize="21600,21600" o:gfxdata="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" adj="9922,-29495">
-                <v:fill on="f" focussize="0,0"/>
-                <v:stroke weight="1pt" color="#000000" joinstyle="miter" dashstyle="dash"/>
-                <v:imagedata o:title=""/>
-                <o:lock v:ext="edit" aspectratio="f"/>
-                <v:textbox>
-                  <w:txbxContent>
-                    <w:p>
-                      <w:pPr>
-                        <w:spacing w:line="360" w:lineRule="auto"/>
-                        <w:ind w:firstLine="0" w:firstLineChars="0"/>
-                        <w:rPr>
-                          <w:rFonts w:hint="eastAsia"/>
-                          <w:b/>
-                          <w:bCs/>
-                          <w:color w:val="0070C0"/>
-                          <w:sz w:val="24"/>
-                          <w:szCs w:val="24"/>
-                          <w:lang w:eastAsia="zh-CN"/>
-                        </w:rPr>
-                      </w:pPr>
-                      <w:r>
-                        <w:rPr>
-                          <w:rFonts w:hint="eastAsia"/>
-                          <w:b/>
-                          <w:bCs/>
-                          <w:color w:val="0070C0"/>
-                          <w:sz w:val="24"/>
-                          <w:szCs w:val="24"/>
-                          <w:lang w:eastAsia="zh-CN"/>
-                        </w:rPr>
-                        <w:t>采用插入引用自动生成</w:t>
-                      </w:r>
-                      <w:r>
-                        <w:rPr>
-                          <w:rFonts w:hint="eastAsia"/>
-                          <w:b/>
-                          <w:bCs/>
-                          <w:color w:val="0070C0"/>
-                          <w:sz w:val="24"/>
-                          <w:szCs w:val="24"/>
-                        </w:rPr>
-                        <w:t>目录</w:t>
-                      </w:r>
-                      <w:r>
-                        <w:rPr>
-                          <w:rFonts w:hint="eastAsia"/>
-                          <w:b/>
-                          <w:bCs/>
-                          <w:color w:val="0070C0"/>
-                          <w:sz w:val="24"/>
-                          <w:szCs w:val="24"/>
-                          <w:lang w:eastAsia="zh-CN"/>
-                        </w:rPr>
-                        <w:t>，目录不超过三级，并调整为层层缩进（</w:t>
-                      </w:r>
-                      <w:r>
-                        <w:rPr>
-                          <w:rFonts w:hint="eastAsia"/>
-                          <w:b/>
-                          <w:bCs/>
-                          <w:color w:val="0070C0"/>
-                          <w:sz w:val="24"/>
-                          <w:szCs w:val="24"/>
-                          <w:lang w:val="en-US" w:eastAsia="zh-CN"/>
-                        </w:rPr>
-                        <w:t>shift+alt+.</w:t>
-                      </w:r>
-                      <w:r>
-                        <w:rPr>
-                          <w:rFonts w:hint="eastAsia"/>
-                          <w:b/>
-                          <w:bCs/>
-                          <w:color w:val="0070C0"/>
-                          <w:sz w:val="24"/>
-                          <w:szCs w:val="24"/>
-                          <w:lang w:eastAsia="zh-CN"/>
-                        </w:rPr>
-                        <w:t>）</w:t>
-                      </w:r>
-                    </w:p>
-                    <w:p>
-                      <w:pPr>
-                        <w:pStyle w:val="2"/>
-                        <w:rPr>
-                          <w:rFonts w:hint="default" w:ascii="Times New Roman" w:hAnsi="Times New Roman" w:eastAsia="宋体" w:cs="Times New Roman"/>
-                          <w:b/>
-                          <w:bCs/>
-                          <w:color w:val="0070C0"/>
-                          <w:kern w:val="2"/>
-                          <w:sz w:val="24"/>
-                          <w:szCs w:val="24"/>
-                          <w:lang w:val="en-US" w:eastAsia="zh-CN" w:bidi="ar-SA"/>
-                        </w:rPr>
-                      </w:pPr>
-                      <w:r>
-                        <w:rPr>
-                          <w:rFonts w:hint="eastAsia" w:ascii="Times New Roman" w:hAnsi="Times New Roman" w:eastAsia="宋体" w:cs="Times New Roman"/>
-                          <w:b/>
-                          <w:bCs/>
-                          <w:color w:val="0070C0"/>
-                          <w:kern w:val="2"/>
-                          <w:sz w:val="24"/>
-                          <w:szCs w:val="24"/>
-                          <w:lang w:val="en-US" w:eastAsia="zh-CN" w:bidi="ar-SA"/>
-                        </w:rPr>
-                        <w:t>生成后适当调整缩进距离，为原来的一半。方法：先按shift+退格，再按空格键调整缩进为原来的一半</w:t>
-                      </w:r>
-                    </w:p>
-                  </w:txbxContent>
-                </v:textbox>
-              </v:shape>
-            </w:pict>
-          </mc:Fallback>
-        </mc:AlternateContent>
       </w:r>
       <w:r>
         <w:rPr>
@@ -7930,114 +5818,6 @@
           <w:highlight w:val="none"/>
           <w:lang/>
         </w:rPr>
-        <mc:AlternateContent>
-          <mc:Choice Requires="wps">
-            <w:drawing>
-              <wp:anchor distT="0" distB="0" distL="114300" distR="114300" simplePos="0" relativeHeight="251702272" behindDoc="0" locked="0" layoutInCell="1" allowOverlap="1">
-                <wp:simplePos x="0" y="0"/>
-                <wp:positionH relativeFrom="column">
-                  <wp:posOffset>3656330</wp:posOffset>
-                </wp:positionH>
-                <wp:positionV relativeFrom="paragraph">
-                  <wp:posOffset>-91440</wp:posOffset>
-                </wp:positionV>
-                <wp:extent cx="2438400" cy="657860"/>
-                <wp:effectExtent l="227330" t="6350" r="26670" b="21590"/>
-                <wp:wrapNone/>
-                <wp:docPr id="53" name="自选图形 134"/>
-                <wp:cNvGraphicFramePr/>
-                <a:graphic xmlns:a="http://schemas.openxmlformats.org/drawingml/2006/main">
-                  <a:graphicData uri="http://schemas.microsoft.com/office/word/2010/wordprocessingShape">
-                    <wps:wsp>
-                      <wps:cNvSpPr/>
-                      <wps:spPr>
-                        <a:xfrm>
-                          <a:off x="0" y="0"/>
-                          <a:ext cx="2438400" cy="657860"/>
-                        </a:xfrm>
-                        <a:prstGeom prst="wedgeRectCallout">
-                          <a:avLst>
-                            <a:gd name="adj1" fmla="val -58616"/>
-                            <a:gd name="adj2" fmla="val 24227"/>
-                          </a:avLst>
-                        </a:prstGeom>
-                        <a:noFill/>
-                        <a:ln w="12700" cap="flat" cmpd="sng">
-                          <a:solidFill>
-                            <a:srgbClr val="000000"/>
-                          </a:solidFill>
-                          <a:prstDash val="dash"/>
-                          <a:miter/>
-                          <a:headEnd type="none" w="med" len="med"/>
-                          <a:tailEnd type="none" w="med" len="med"/>
-                        </a:ln>
-                      </wps:spPr>
-                      <wps:txbx>
-                        <w:txbxContent>
-                          <w:p>
-                            <w:pPr>
-                              <w:ind w:firstLine="0" w:firstLineChars="0"/>
-                              <w:rPr>
-                                <w:rFonts w:hint="eastAsia"/>
-                                <w:color w:val="FF0000"/>
-                                <w:sz w:val="18"/>
-                                <w:szCs w:val="18"/>
-                              </w:rPr>
-                            </w:pPr>
-                            <w:r>
-                              <w:rPr>
-                                <w:rFonts w:hint="eastAsia"/>
-                                <w:color w:val="FF0000"/>
-                                <w:sz w:val="18"/>
-                                <w:szCs w:val="18"/>
-                              </w:rPr>
-                              <w:t>“参考文献”按按一级标题要求书写，但不用标题编号，每字之间空一空格距离</w:t>
-                            </w:r>
-                          </w:p>
-                        </w:txbxContent>
-                      </wps:txbx>
-                      <wps:bodyPr vert="horz" wrap="square" anchor="t" anchorCtr="0" upright="1"/>
-                    </wps:wsp>
-                  </a:graphicData>
-                </a:graphic>
-              </wp:anchor>
-            </w:drawing>
-          </mc:Choice>
-          <mc:Fallback>
-            <w:pict>
-              <v:shape id="自选图形 134" o:spid="_x0000_s1026" o:spt="61" type="#_x0000_t61" style="position:absolute;left:0pt;margin-left:287.9pt;margin-top:-7.2pt;height:51.8pt;width:192pt;z-index:251702272;mso-width-relative:page;mso-height-relative:page;" filled="f" stroked="t" coordsize="21600,21600" o:gfxdata="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" adj="-1861,16033">
-                <v:fill on="f" focussize="0,0"/>
-                <v:stroke weight="1pt" color="#000000" joinstyle="miter" dashstyle="dash"/>
-                <v:imagedata o:title=""/>
-                <o:lock v:ext="edit" aspectratio="f"/>
-                <v:textbox>
-                  <w:txbxContent>
-                    <w:p>
-                      <w:pPr>
-                        <w:ind w:firstLine="0" w:firstLineChars="0"/>
-                        <w:rPr>
-                          <w:rFonts w:hint="eastAsia"/>
-                          <w:color w:val="FF0000"/>
-                          <w:sz w:val="18"/>
-                          <w:szCs w:val="18"/>
-                        </w:rPr>
-                      </w:pPr>
-                      <w:r>
-                        <w:rPr>
-                          <w:rFonts w:hint="eastAsia"/>
-                          <w:color w:val="FF0000"/>
-                          <w:sz w:val="18"/>
-                          <w:szCs w:val="18"/>
-                        </w:rPr>
-                        <w:t>“参考文献”按按一级标题要求书写，但不用标题编号，每字之间空一空格距离</w:t>
-                      </w:r>
-                    </w:p>
-                  </w:txbxContent>
-                </v:textbox>
-              </v:shape>
-            </w:pict>
-          </mc:Fallback>
-        </mc:AlternateContent>
       </w:r>
       <w:r>
         <w:rPr>
@@ -8208,272 +5988,6 @@
         <w:rPr>
           <w:rFonts w:hint="eastAsia"/>
         </w:rPr>
-        <mc:AlternateContent>
-          <mc:Choice Requires="wps">
-            <w:drawing>
-              <wp:anchor distT="0" distB="0" distL="114300" distR="114300" simplePos="0" relativeHeight="251734016" behindDoc="0" locked="0" layoutInCell="1" allowOverlap="1">
-                <wp:simplePos x="0" y="0"/>
-                <wp:positionH relativeFrom="column">
-                  <wp:posOffset>1397000</wp:posOffset>
-                </wp:positionH>
-                <wp:positionV relativeFrom="paragraph">
-                  <wp:posOffset>144780</wp:posOffset>
-                </wp:positionV>
-                <wp:extent cx="3879850" cy="630555"/>
-                <wp:effectExtent l="6350" t="897890" r="25400" b="20955"/>
-                <wp:wrapNone/>
-                <wp:docPr id="84" name="自选图形 212"/>
-                <wp:cNvGraphicFramePr/>
-                <a:graphic xmlns:a="http://schemas.openxmlformats.org/drawingml/2006/main">
-                  <a:graphicData uri="http://schemas.microsoft.com/office/word/2010/wordprocessingShape">
-                    <wps:wsp>
-                      <wps:cNvSpPr/>
-                      <wps:spPr>
-                        <a:xfrm>
-                          <a:off x="0" y="0"/>
-                          <a:ext cx="3879850" cy="630555"/>
-                        </a:xfrm>
-                        <a:prstGeom prst="wedgeRectCallout">
-                          <a:avLst>
-                            <a:gd name="adj1" fmla="val 23157"/>
-                            <a:gd name="adj2" fmla="val -190278"/>
-                          </a:avLst>
-                        </a:prstGeom>
-                        <a:noFill/>
-                        <a:ln w="12700" cap="flat" cmpd="sng">
-                          <a:solidFill>
-                            <a:srgbClr val="000000"/>
-                          </a:solidFill>
-                          <a:prstDash val="dash"/>
-                          <a:miter/>
-                          <a:headEnd type="none" w="med" len="med"/>
-                          <a:tailEnd type="none" w="med" len="med"/>
-                        </a:ln>
-                      </wps:spPr>
-                      <wps:txbx>
-                        <w:txbxContent>
-                          <w:p>
-                            <w:pPr>
-                              <w:spacing w:line="360" w:lineRule="exact"/>
-                              <w:ind w:firstLine="0" w:firstLineChars="0"/>
-                              <w:rPr>
-                                <w:rFonts w:hint="eastAsia"/>
-                                <w:b/>
-                                <w:bCs/>
-                                <w:color w:val="0070C0"/>
-                                <w:spacing w:val="-2"/>
-                                <w:sz w:val="21"/>
-                                <w:szCs w:val="21"/>
-                              </w:rPr>
-                            </w:pPr>
-                            <w:r>
-                              <w:rPr>
-                                <w:rFonts w:hint="eastAsia"/>
-                                <w:b/>
-                                <w:bCs/>
-                                <w:color w:val="FF0000"/>
-                                <w:sz w:val="21"/>
-                                <w:szCs w:val="21"/>
-                              </w:rPr>
-                              <w:t>参考文献</w:t>
-                            </w:r>
-                            <w:r>
-                              <w:rPr>
-                                <w:rFonts w:hint="eastAsia"/>
-                                <w:b/>
-                                <w:bCs/>
-                                <w:color w:val="FF0000"/>
-                                <w:sz w:val="21"/>
-                                <w:szCs w:val="21"/>
-                                <w:lang w:val="en-US" w:eastAsia="zh-CN"/>
-                              </w:rPr>
-                              <w:t>可在</w:t>
-                            </w:r>
-                            <w:r>
-                              <w:rPr>
-                                <w:rFonts w:hint="eastAsia"/>
-                                <w:b/>
-                                <w:bCs/>
-                                <w:color w:val="FF0000"/>
-                                <w:sz w:val="21"/>
-                                <w:szCs w:val="21"/>
-                                <w:highlight w:val="yellow"/>
-                                <w:lang w:val="en-US" w:eastAsia="zh-CN"/>
-                              </w:rPr>
-                              <w:t>百度学术，中国知网</w:t>
-                            </w:r>
-                            <w:r>
-                              <w:rPr>
-                                <w:rFonts w:hint="eastAsia"/>
-                                <w:b/>
-                                <w:bCs/>
-                                <w:color w:val="FF0000"/>
-                                <w:sz w:val="21"/>
-                                <w:szCs w:val="21"/>
-                                <w:lang w:val="en-US" w:eastAsia="zh-CN"/>
-                              </w:rPr>
-                              <w:t>等网站中查询，选择引用</w:t>
-                            </w:r>
-                            <w:r>
-                              <w:rPr>
-                                <w:rFonts w:hint="eastAsia"/>
-                                <w:b/>
-                                <w:bCs/>
-                                <w:color w:val="FF0000"/>
-                                <w:sz w:val="21"/>
-                                <w:szCs w:val="21"/>
-                                <w:highlight w:val="yellow"/>
-                                <w:lang w:val="en-US" w:eastAsia="zh-CN"/>
-                              </w:rPr>
-                              <w:t>（GB/T)</w:t>
-                            </w:r>
-                            <w:r>
-                              <w:rPr>
-                                <w:rFonts w:hint="eastAsia"/>
-                                <w:b/>
-                                <w:bCs/>
-                                <w:color w:val="FF0000"/>
-                                <w:sz w:val="21"/>
-                                <w:szCs w:val="21"/>
-                                <w:lang w:val="en-US" w:eastAsia="zh-CN"/>
-                              </w:rPr>
-                              <w:t>格式即可。</w:t>
-                            </w:r>
-                          </w:p>
-                          <w:p>
-                            <w:pPr>
-                              <w:ind w:firstLine="0" w:firstLineChars="0"/>
-                              <w:rPr>
-                                <w:rFonts w:hint="eastAsia"/>
-                                <w:color w:val="FF0000"/>
-                                <w:sz w:val="18"/>
-                                <w:szCs w:val="18"/>
-                              </w:rPr>
-                            </w:pPr>
-                          </w:p>
-                        </w:txbxContent>
-                      </wps:txbx>
-                      <wps:bodyPr vert="horz" wrap="square" anchor="t" anchorCtr="0" upright="1"/>
-                    </wps:wsp>
-                  </a:graphicData>
-                </a:graphic>
-              </wp:anchor>
-            </w:drawing>
-          </mc:Choice>
-          <mc:Fallback>
-            <w:pict>
-              <v:shape id="自选图形 212" o:spid="_x0000_s1026" o:spt="61" type="#_x0000_t61" style="position:absolute;left:0pt;margin-left:110pt;margin-top:11.4pt;height:49.65pt;width:305.5pt;z-index:251734016;mso-width-relative:page;mso-height-relative:page;" filled="f" stroked="t" coordsize="21600,21600" o:gfxdata="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" adj="15802,-30300">
-                <v:fill on="f" focussize="0,0"/>
-                <v:stroke weight="1pt" color="#000000" joinstyle="miter" dashstyle="dash"/>
-                <v:imagedata o:title=""/>
-                <o:lock v:ext="edit" aspectratio="f"/>
-                <v:textbox>
-                  <w:txbxContent>
-                    <w:p>
-                      <w:pPr>
-                        <w:spacing w:line="360" w:lineRule="exact"/>
-                        <w:ind w:firstLine="0" w:firstLineChars="0"/>
-                        <w:rPr>
-                          <w:rFonts w:hint="eastAsia"/>
-                          <w:b/>
-                          <w:bCs/>
-                          <w:color w:val="0070C0"/>
-                          <w:spacing w:val="-2"/>
-                          <w:sz w:val="21"/>
-                          <w:szCs w:val="21"/>
-                        </w:rPr>
-                      </w:pPr>
-                      <w:r>
-                        <w:rPr>
-                          <w:rFonts w:hint="eastAsia"/>
-                          <w:b/>
-                          <w:bCs/>
-                          <w:color w:val="FF0000"/>
-                          <w:sz w:val="21"/>
-                          <w:szCs w:val="21"/>
-                        </w:rPr>
-                        <w:t>参考文献</w:t>
-                      </w:r>
-                      <w:r>
-                        <w:rPr>
-                          <w:rFonts w:hint="eastAsia"/>
-                          <w:b/>
-                          <w:bCs/>
-                          <w:color w:val="FF0000"/>
-                          <w:sz w:val="21"/>
-                          <w:szCs w:val="21"/>
-                          <w:lang w:val="en-US" w:eastAsia="zh-CN"/>
-                        </w:rPr>
-                        <w:t>可在</w:t>
-                      </w:r>
-                      <w:r>
-                        <w:rPr>
-                          <w:rFonts w:hint="eastAsia"/>
-                          <w:b/>
-                          <w:bCs/>
-                          <w:color w:val="FF0000"/>
-                          <w:sz w:val="21"/>
-                          <w:szCs w:val="21"/>
-                          <w:highlight w:val="yellow"/>
-                          <w:lang w:val="en-US" w:eastAsia="zh-CN"/>
-                        </w:rPr>
-                        <w:t>百度学术，中国知网</w:t>
-                      </w:r>
-                      <w:r>
-                        <w:rPr>
-                          <w:rFonts w:hint="eastAsia"/>
-                          <w:b/>
-                          <w:bCs/>
-                          <w:color w:val="FF0000"/>
-                          <w:sz w:val="21"/>
-                          <w:szCs w:val="21"/>
-                          <w:lang w:val="en-US" w:eastAsia="zh-CN"/>
-                        </w:rPr>
-                        <w:t>等网站中查询，选择引用</w:t>
-                      </w:r>
-                      <w:r>
-                        <w:rPr>
-                          <w:rFonts w:hint="eastAsia"/>
-                          <w:b/>
-                          <w:bCs/>
-                          <w:color w:val="FF0000"/>
-                          <w:sz w:val="21"/>
-                          <w:szCs w:val="21"/>
-                          <w:highlight w:val="yellow"/>
-                          <w:lang w:val="en-US" w:eastAsia="zh-CN"/>
-                        </w:rPr>
-                        <w:t>（GB/T)</w:t>
-                      </w:r>
-                      <w:r>
-                        <w:rPr>
-                          <w:rFonts w:hint="eastAsia"/>
-                          <w:b/>
-                          <w:bCs/>
-                          <w:color w:val="FF0000"/>
-                          <w:sz w:val="21"/>
-                          <w:szCs w:val="21"/>
-                          <w:lang w:val="en-US" w:eastAsia="zh-CN"/>
-                        </w:rPr>
-                        <w:t>格式即可。</w:t>
-                      </w:r>
-                    </w:p>
-                    <w:p>
-                      <w:pPr>
-                        <w:ind w:firstLine="0" w:firstLineChars="0"/>
-                        <w:rPr>
-                          <w:rFonts w:hint="eastAsia"/>
-                          <w:color w:val="FF0000"/>
-                          <w:sz w:val="18"/>
-                          <w:szCs w:val="18"/>
-                        </w:rPr>
-                      </w:pPr>
-                    </w:p>
-                  </w:txbxContent>
-                </v:textbox>
-              </v:shape>
-            </w:pict>
-          </mc:Fallback>
-        </mc:AlternateContent>
       </w:r>
       <w:r>
         <w:br w:type="page"/>

</xml_diff>

<commit_message>
fix: NDNU refs loop + empty Heading numbering
Root cause 1: Step 8 was re-processing refs after Step 6 already handled
them, overwriting {{ ref }} with a duplicate for/endfor layer.
Fix: remove Step 8 entirely, let Step 6 handle refs alone.

Root cause 2: Step 7 cleanup was clearing refs area text, destroying
the <w:t> elements that Step 6 wrote {{ ref }} into.
Fix: skip refs zone entirely in Step 7 post-cleanup (in_refs_zone flag).

Root cause 3: Empty Heading 1 paragraphs still show auto-numbering.
Fix: downgrade cleared Heading paragraphs to Normal style.

Also: Step 6 now matches "参 考 文 献" (with spaces) in addition to
"参考文献", and cleans residual examples after endfor properly.

Co-Authored-By: Claude Opus 4.6 (1M context) <noreply@anthropic.com>
</commit_message>
<xml_diff>
--- a/templates/ndnu/template.docx
+++ b/templates/ndnu/template.docx
@@ -4229,7 +4229,6 @@
     </w:p>
     <w:p>
       <w:pPr>
-        <w:pStyle w:val="5"/>
         <w:spacing w:before="326" w:after="326"/>
         <w:rPr>
           <w:rFonts w:hint="eastAsia"/>
@@ -4546,7 +4545,6 @@
     </w:p>
     <w:p>
       <w:pPr>
-        <w:pStyle w:val="6"/>
         <w:spacing w:before="163" w:after="163"/>
         <w:ind w:firstLine="480"/>
         <w:rPr>
@@ -4638,7 +4636,6 @@
     </w:p>
     <w:p>
       <w:pPr>
-        <w:pStyle w:val="5"/>
         <w:spacing w:before="326" w:after="326"/>
         <w:rPr>
           <w:rFonts w:hint="eastAsia"/>
@@ -4680,7 +4677,6 @@
     </w:p>
     <w:p>
       <w:pPr>
-        <w:pStyle w:val="4"/>
         <w:spacing w:before="326" w:after="326"/>
         <w:ind w:firstLine="592"/>
         <w:rPr>
@@ -4733,7 +4729,6 @@
     </w:p>
     <w:p>
       <w:pPr>
-        <w:pStyle w:val="5"/>
         <w:spacing w:before="326" w:after="326"/>
         <w:rPr>
           <w:rFonts w:hint="eastAsia"/>
@@ -4760,7 +4755,6 @@
     </w:p>
     <w:p>
       <w:pPr>
-        <w:pStyle w:val="6"/>
         <w:spacing w:before="163" w:after="163"/>
         <w:ind w:firstLine="480"/>
         <w:rPr>
@@ -5289,7 +5283,6 @@
     </w:p>
     <w:p>
       <w:pPr>
-        <w:pStyle w:val="6"/>
         <w:spacing w:before="163" w:after="163"/>
         <w:ind w:firstLine="480"/>
         <w:rPr>
@@ -5336,7 +5329,6 @@
     </w:p>
     <w:p>
       <w:pPr>
-        <w:pStyle w:val="7"/>
         <w:ind w:firstLine="472" w:firstLineChars="0"/>
         <w:rPr>
           <w:rFonts w:hint="eastAsia"/>
@@ -5556,7 +5548,6 @@
     </w:p>
     <w:p>
       <w:pPr>
-        <w:pStyle w:val="4"/>
         <w:spacing w:before="326" w:after="326"/>
         <w:rPr>
           <w:rFonts w:hint="eastAsia"/>
@@ -5832,6 +5823,11 @@
       <w:bookmarkEnd w:id="59"/>
     </w:p>
     <w:p>
+      <w:r>
+        <w:t xml:space="preserve">{%p for ref in references %}</w:t>
+      </w:r>
+    </w:p>
+    <w:p>
       <w:pPr>
         <w:numPr>
           <w:ilvl w:val="2"/>
@@ -5844,9 +5840,16 @@
         </w:rPr>
       </w:pPr>
       <w:bookmarkStart w:id="60" w:name="_Ref415687906"/>
-      <w:r/>
+      <w:r>
+        <w:t>{{ ref }}</w:t>
+      </w:r>
       <w:bookmarkEnd w:id="60"/>
       <w:bookmarkStart w:id="61" w:name="_Ref415670923"/>
+    </w:p>
+    <w:p>
+      <w:r>
+        <w:t xml:space="preserve">{%p endfor %}</w:t>
+      </w:r>
     </w:p>
     <w:p>
       <w:pPr>

</xml_diff>

<commit_message>
fix: remove numPr from empty refs paragraphs to hide [2][3][4]
Empty paragraphs after endfor still had numPr auto-numbering,
showing residual [2][3][4] markers. Now removing numPr from all
refs zone paragraphs except the {{ ref }} template paragraph.

Co-Authored-By: Claude Opus 4.6 (1M context) <noreply@anthropic.com>
</commit_message>
<xml_diff>
--- a/templates/ndnu/template.docx
+++ b/templates/ndnu/template.docx
@@ -5853,10 +5853,6 @@
     </w:p>
     <w:p>
       <w:pPr>
-        <w:numPr>
-          <w:ilvl w:val="2"/>
-          <w:numId w:val="12"/>
-        </w:numPr>
         <w:spacing w:line="360" w:lineRule="exact"/>
         <w:ind w:firstLineChars="0"/>
       </w:pPr>
@@ -5875,10 +5871,6 @@
     </w:p>
     <w:p>
       <w:pPr>
-        <w:numPr>
-          <w:ilvl w:val="2"/>
-          <w:numId w:val="12"/>
-        </w:numPr>
         <w:spacing w:line="360" w:lineRule="exact"/>
         <w:ind w:firstLineChars="0"/>
         <w:rPr>
@@ -5899,10 +5891,6 @@
     </w:p>
     <w:p>
       <w:pPr>
-        <w:numPr>
-          <w:ilvl w:val="2"/>
-          <w:numId w:val="12"/>
-        </w:numPr>
         <w:ind w:firstLineChars="0"/>
         <w:rPr>
           <w:rFonts w:hint="eastAsia"/>

</xml_diff>

<commit_message>
fix: rebuild template from updated source with correct cover fonts
User manually added sample text with correct fonts in the original
template's cover table. Regenerating template inherits those fonts.

Co-Authored-By: Claude Opus 4.6 (1M context) <noreply@anthropic.com>
</commit_message>
<xml_diff>
--- a/templates/ndnu/template.docx
+++ b/templates/ndnu/template.docx
@@ -11,8 +11,6 @@
           <w:sz w:val="32"/>
         </w:rPr>
       </w:pPr>
-      <w:bookmarkStart w:id="67" w:name="_GoBack"/>
-      <w:bookmarkEnd w:id="67"/>
     </w:p>
     <w:p>
       <w:pPr>
@@ -356,10 +354,17 @@
             </w:pPr>
             <w:r>
               <w:rPr>
+                <w:rFonts w:hint="eastAsia" w:eastAsia="仿宋"/>
+                <w:bCs/>
+                <w:sz w:val="30"/>
+              </w:rPr>
+              <w:t>{{ name }}</w:t>
+            </w:r>
+            <w:r>
+              <w:rPr>
                 <w:rFonts w:hint="default" w:ascii="Times New Roman" w:hAnsi="Times New Roman" w:eastAsia="仿宋_GB2312" w:cs="Times New Roman"/>
                 <w:sz w:val="32"/>
               </w:rPr>
-              <w:t>{{ name }}</w:t>
             </w:r>
           </w:p>
         </w:tc>
@@ -423,6 +428,11 @@
               </w:rPr>
             </w:pPr>
             <w:r>
+              <w:rPr>
+                <w:rFonts w:hint="eastAsia" w:eastAsia="仿宋"/>
+                <w:bCs/>
+                <w:sz w:val="30"/>
+              </w:rPr>
               <w:t>{{ student_id }}</w:t>
             </w:r>
           </w:p>
@@ -487,7 +497,27 @@
               </w:rPr>
             </w:pPr>
             <w:r>
+              <w:rPr>
+                <w:rFonts w:hint="eastAsia" w:eastAsia="仿宋"/>
+                <w:bCs/>
+                <w:sz w:val="30"/>
+              </w:rPr>
               <w:t>{{ major }}</w:t>
+            </w:r>
+            <w:r>
+              <w:rPr>
+                <w:rFonts w:hint="eastAsia" w:eastAsia="仿宋"/>
+                <w:bCs/>
+                <w:sz w:val="30"/>
+                <w:lang w:val="en-US" w:eastAsia="zh-CN"/>
+              </w:rPr>
+            </w:r>
+            <w:r>
+              <w:rPr>
+                <w:rFonts w:hint="eastAsia" w:eastAsia="仿宋"/>
+                <w:bCs/>
+                <w:sz w:val="30"/>
+              </w:rPr>
             </w:r>
           </w:p>
         </w:tc>
@@ -552,10 +582,9 @@
             </w:pPr>
             <w:r>
               <w:rPr>
-                <w:rFonts w:hint="default" w:ascii="Times New Roman" w:hAnsi="Times New Roman" w:eastAsia="仿宋" w:cs="Times New Roman"/>
+                <w:rFonts w:eastAsia="仿宋"/>
                 <w:bCs/>
                 <w:sz w:val="30"/>
-                <w:lang w:val="en-US" w:eastAsia="zh-CN"/>
               </w:rPr>
               <w:t>信息工程学院</w:t>
             </w:r>
@@ -622,10 +651,10 @@
             </w:pPr>
             <w:r>
               <w:rPr>
-                <w:rFonts w:hint="default" w:ascii="Times New Roman" w:hAnsi="Times New Roman" w:eastAsia="仿宋" w:cs="Times New Roman"/>
+                <w:rFonts w:hint="eastAsia" w:eastAsia="仿宋"/>
                 <w:bCs/>
                 <w:sz w:val="30"/>
-                <w:lang w:val="en-US" w:eastAsia="zh-CN"/>
+                <w:lang w:val="zh-CN" w:eastAsia="zh"/>
               </w:rPr>
               <w:t>{{ advisor }}</w:t>
             </w:r>
@@ -692,10 +721,10 @@
             </w:pPr>
             <w:r>
               <w:rPr>
-                <w:rFonts w:hint="default" w:ascii="Times New Roman" w:hAnsi="Times New Roman" w:eastAsia="仿宋" w:cs="Times New Roman"/>
+                <w:rFonts w:hint="eastAsia" w:eastAsia="仿宋"/>
                 <w:bCs/>
                 <w:sz w:val="30"/>
-                <w:lang w:val="en-US" w:eastAsia="zh-CN"/>
+                <w:lang w:val="zh-CN" w:eastAsia="zh"/>
               </w:rPr>
               <w:t>{{ advisor_title }}</w:t>
             </w:r>
@@ -778,56 +807,27 @@
             </w:r>
             <w:r>
               <w:rPr>
-                <w:rFonts w:hint="default" w:ascii="Times New Roman" w:hAnsi="Times New Roman" w:eastAsia="仿宋" w:cs="Times New Roman"/>
+                <w:rFonts w:eastAsia="仿宋"/>
                 <w:sz w:val="30"/>
                 <w:szCs w:val="30"/>
               </w:rPr>
             </w:r>
             <w:r>
               <w:rPr>
-                <w:rFonts w:hint="default" w:ascii="Times New Roman" w:hAnsi="Times New Roman" w:eastAsia="仿宋" w:cs="Times New Roman"/>
-                <w:sz w:val="30"/>
-                <w:szCs w:val="30"/>
-                <w:lang w:val="en-US" w:eastAsia="zh-CN"/>
-              </w:rPr>
-            </w:r>
-            <w:r>
-              <w:rPr>
-                <w:rFonts w:hint="default" w:ascii="Times New Roman" w:hAnsi="Times New Roman" w:eastAsia="仿宋" w:cs="Times New Roman"/>
+                <w:rFonts w:hint="eastAsia" w:eastAsia="仿宋"/>
                 <w:sz w:val="30"/>
                 <w:szCs w:val="30"/>
               </w:rPr>
             </w:r>
             <w:r>
               <w:rPr>
-                <w:rFonts w:hint="default" w:ascii="Times New Roman" w:hAnsi="Times New Roman" w:eastAsia="仿宋" w:cs="Times New Roman"/>
-                <w:sz w:val="30"/>
-                <w:szCs w:val="30"/>
-                <w:lang w:val="en-US" w:eastAsia="zh-CN"/>
-              </w:rPr>
-            </w:r>
-            <w:r>
-              <w:rPr>
-                <w:rFonts w:hint="default" w:ascii="Times New Roman" w:hAnsi="Times New Roman" w:eastAsia="仿宋" w:cs="Times New Roman"/>
+                <w:rFonts w:eastAsia="仿宋"/>
                 <w:sz w:val="30"/>
                 <w:szCs w:val="30"/>
               </w:rPr>
             </w:r>
-            <w:r>
-              <w:rPr>
-                <w:rFonts w:hint="default" w:ascii="Times New Roman" w:hAnsi="Times New Roman" w:eastAsia="仿宋" w:cs="Times New Roman"/>
-                <w:sz w:val="30"/>
-                <w:szCs w:val="30"/>
-                <w:lang w:val="en-US" w:eastAsia="zh-CN"/>
-              </w:rPr>
-            </w:r>
-            <w:r>
-              <w:rPr>
-                <w:rFonts w:hint="default" w:ascii="Times New Roman" w:hAnsi="Times New Roman" w:eastAsia="仿宋" w:cs="Times New Roman"/>
-                <w:sz w:val="30"/>
-                <w:szCs w:val="30"/>
-              </w:rPr>
-            </w:r>
+            <w:bookmarkStart w:id="67" w:name="_GoBack"/>
+            <w:bookmarkEnd w:id="67"/>
           </w:p>
         </w:tc>
       </w:tr>
@@ -2296,7 +2296,6 @@
           <w:footerReference r:id="rId6" w:type="default"/>
           <w:pgSz w:w="11906" w:h="16838"/>
           <w:pgMar w:top="1417" w:right="1418" w:bottom="1417" w:left="1417" w:header="992" w:footer="992" w:gutter="0"/>
-          <w:paperSrc/>
           <w:pgNumType w:start="1"/>
           <w:cols w:space="720" w:num="1"/>
           <w:rtlGutter w:val="0"/>
@@ -2319,14 +2318,12 @@
         <w:rPr>
           <w:rFonts w:hint="eastAsia" w:ascii="宋体" w:hAnsi="宋体" w:cs="Arial"/>
           <w:bCs/>
-          <w:lang/>
         </w:rPr>
       </w:r>
       <w:r>
         <w:rPr>
           <w:rFonts w:hint="eastAsia" w:ascii="宋体" w:hAnsi="宋体" w:cs="Arial"/>
           <w:bCs/>
-          <w:lang/>
         </w:rPr>
       </w:r>
       <w:r>
@@ -2399,14 +2396,6 @@
         <w:rPr>
           <w:rFonts w:hint="eastAsia" w:ascii="宋体" w:hAnsi="宋体" w:cs="Arial"/>
           <w:bCs/>
-          <w:color w:val="0000FF"/>
-          <w:lang w:val="en-US" w:eastAsia="zh-CN"/>
-        </w:rPr>
-      </w:r>
-      <w:r>
-        <w:rPr>
-          <w:rFonts w:hint="eastAsia" w:ascii="宋体" w:hAnsi="宋体" w:cs="Arial"/>
-          <w:bCs/>
         </w:rPr>
       </w:r>
     </w:p>
@@ -2424,7 +2413,6 @@
           <w:bCs/>
           <w:sz w:val="28"/>
           <w:szCs w:val="28"/>
-          <w:lang/>
         </w:rPr>
       </w:r>
       <w:r>
@@ -2455,11 +2443,7 @@
           <w:sz w:val="30"/>
         </w:rPr>
       </w:pPr>
-      <w:r>
-        <w:rPr>
-          <w:lang/>
-        </w:rPr>
-      </w:r>
+      <w:r/>
       <w:r>
         <w:br w:type="page"/>
       </w:r>
@@ -2483,7 +2467,6 @@
           <w:rFonts w:hint="eastAsia" w:ascii="Times New Roman" w:hAnsi="Times New Roman" w:eastAsia="黑体"/>
           <w:b w:val="0"/>
           <w:sz w:val="24"/>
-          <w:lang/>
         </w:rPr>
         <w:t>{{ abstract_en }}</w:t>
       </w:r>
@@ -2492,7 +2475,6 @@
           <w:rFonts w:hint="eastAsia" w:ascii="Arial Black" w:hAnsi="Arial Black"/>
           <w:sz w:val="30"/>
           <w:szCs w:val="28"/>
-          <w:lang/>
         </w:rPr>
       </w:r>
       <w:r/>
@@ -2836,16 +2818,8 @@
           <w:bCs/>
         </w:rPr>
       </w:pPr>
-      <w:r>
-        <w:rPr>
-          <w:lang/>
-        </w:rPr>
-      </w:r>
-      <w:r>
-        <w:rPr>
-          <w:lang/>
-        </w:rPr>
-      </w:r>
+      <w:r/>
+      <w:r/>
       <w:r>
         <w:br w:type="page"/>
       </w:r>
@@ -2872,7 +2846,6 @@
         <w:rPr>
           <w:rFonts w:hint="eastAsia" w:ascii="宋体" w:hAnsi="宋体"/>
           <w:b/>
-          <w:lang/>
         </w:rPr>
       </w:r>
       <w:r>
@@ -2892,14 +2865,12 @@
         <w:rPr>
           <w:rFonts w:hint="eastAsia" w:ascii="宋体" w:hAnsi="宋体"/>
           <w:b/>
-          <w:lang/>
         </w:rPr>
       </w:pPr>
       <w:r>
         <w:rPr>
           <w:rFonts w:hint="eastAsia" w:ascii="宋体" w:hAnsi="宋体" w:cs="Arial"/>
           <w:bCs/>
-          <w:lang/>
         </w:rPr>
       </w:r>
     </w:p>
@@ -3913,13 +3884,11 @@
           <w:bCs/>
           <w:sz w:val="44"/>
           <w:szCs w:val="44"/>
-          <w:lang/>
         </w:rPr>
         <w:sectPr>
           <w:footerReference r:id="rId7" w:type="default"/>
           <w:pgSz w:w="11906" w:h="16838"/>
           <w:pgMar w:top="1417" w:right="1418" w:bottom="1417" w:left="1417" w:header="992" w:footer="992" w:gutter="0"/>
-          <w:paperSrc/>
           <w:pgNumType w:fmt="upperRoman" w:start="1"/>
           <w:cols w:space="720" w:num="1"/>
           <w:rtlGutter w:val="0"/>
@@ -3930,9 +3899,6 @@
     <w:p>
       <w:pPr>
         <w:pStyle w:val="2"/>
-        <w:rPr>
-          <w:lang/>
-        </w:rPr>
       </w:pPr>
     </w:p>
     <w:p>
@@ -3949,7 +3915,6 @@
           <w:type w:val="continuous"/>
           <w:pgSz w:w="11906" w:h="16838"/>
           <w:pgMar w:top="1417" w:right="1418" w:bottom="1417" w:left="1417" w:header="992" w:footer="992" w:gutter="0"/>
-          <w:paperSrc/>
           <w:pgNumType w:fmt="upperRoman" w:start="1"/>
           <w:cols w:space="720" w:num="1"/>
           <w:rtlGutter w:val="0"/>
@@ -3969,7 +3934,6 @@
           <w:bCs/>
           <w:sz w:val="44"/>
           <w:szCs w:val="44"/>
-          <w:lang/>
         </w:rPr>
         <w:fldChar w:fldCharType="end"/>
       </w:r>
@@ -3990,19 +3954,16 @@
         <w:rPr>
           <w:rFonts w:hint="eastAsia"/>
           <w:szCs w:val="28"/>
-          <w:lang/>
-        </w:rPr>
-      </w:r>
-      <w:r>
-        <w:rPr>
-          <w:rFonts w:hint="eastAsia"/>
-          <w:lang/>
-        </w:rPr>
-      </w:r>
-      <w:r>
-        <w:rPr>
-          <w:rFonts w:hint="eastAsia"/>
-          <w:lang/>
+        </w:rPr>
+      </w:r>
+      <w:r>
+        <w:rPr>
+          <w:rFonts w:hint="eastAsia"/>
+        </w:rPr>
+      </w:r>
+      <w:r>
+        <w:rPr>
+          <w:rFonts w:hint="eastAsia"/>
         </w:rPr>
       </w:r>
       <w:r>
@@ -4062,10 +4023,10 @@
           <w:szCs w:val="28"/>
         </w:rPr>
       </w:pPr>
-      <w:bookmarkStart w:id="4" w:name="_Toc419571860"/>
-      <w:bookmarkStart w:id="5" w:name="_Toc419471754"/>
-      <w:bookmarkStart w:id="6" w:name="_Toc419471630"/>
-      <w:bookmarkStart w:id="7" w:name="_Toc419472403"/>
+      <w:bookmarkStart w:id="4" w:name="_Toc419471630"/>
+      <w:bookmarkStart w:id="5" w:name="_Toc419472403"/>
+      <w:bookmarkStart w:id="6" w:name="_Toc419571860"/>
+      <w:bookmarkStart w:id="7" w:name="_Toc419471754"/>
       <w:r>
         <w:rPr>
           <w:rFonts w:hint="eastAsia"/>
@@ -4105,7 +4066,6 @@
         <w:rPr>
           <w:rFonts w:hint="eastAsia"/>
           <w:szCs w:val="28"/>
-          <w:lang/>
         </w:rPr>
         <w:t>{{ para }}</w:t>
       </w:r>
@@ -4135,10 +4095,10 @@
           <w:rFonts w:hint="eastAsia"/>
         </w:rPr>
       </w:pPr>
-      <w:bookmarkStart w:id="12" w:name="_Toc419571862"/>
-      <w:bookmarkStart w:id="13" w:name="_Toc419471756"/>
+      <w:bookmarkStart w:id="12" w:name="_Toc419471632"/>
+      <w:bookmarkStart w:id="13" w:name="_Toc419571862"/>
       <w:bookmarkStart w:id="14" w:name="_Toc419472405"/>
-      <w:bookmarkStart w:id="15" w:name="_Toc419471632"/>
+      <w:bookmarkStart w:id="15" w:name="_Toc419471756"/>
       <w:r>
         <w:rPr>
           <w:rFonts w:hint="eastAsia"/>
@@ -4166,7 +4126,6 @@
         <w:rPr>
           <w:rFonts w:hint="eastAsia"/>
           <w:szCs w:val="28"/>
-          <w:lang/>
         </w:rPr>
         <w:t>{{ p2 }}</w:t>
       </w:r>
@@ -4222,7 +4181,6 @@
         <w:rPr>
           <w:rFonts w:hint="eastAsia"/>
           <w:szCs w:val="28"/>
-          <w:lang/>
         </w:rPr>
       </w:r>
       <w:r>
@@ -4243,16 +4201,8 @@
           <w:rFonts w:hint="eastAsia"/>
         </w:rPr>
       </w:pPr>
-      <w:r>
-        <w:rPr>
-          <w:lang/>
-        </w:rPr>
-      </w:r>
-      <w:r>
-        <w:rPr>
-          <w:lang/>
-        </w:rPr>
-      </w:r>
+      <w:r/>
+      <w:r/>
       <w:r>
         <w:rPr>
           <w:rFonts w:hint="eastAsia"/>
@@ -4554,7 +4504,6 @@
       <w:r>
         <w:rPr>
           <w:rFonts w:hint="eastAsia" w:ascii="Arial" w:hAnsi="Arial"/>
-          <w:lang/>
         </w:rPr>
       </w:r>
       <w:r>
@@ -4567,16 +4516,8 @@
       <w:pPr>
         <w:pStyle w:val="122"/>
       </w:pPr>
-      <w:r>
-        <w:rPr>
-          <w:lang/>
-        </w:rPr>
-      </w:r>
-      <w:r>
-        <w:rPr>
-          <w:lang/>
-        </w:rPr>
-      </w:r>
+      <w:r/>
+      <w:r/>
       <w:r/>
     </w:p>
     <w:p>
@@ -4627,7 +4568,6 @@
       <w:r>
         <w:rPr>
           <w:rFonts w:hint="eastAsia"/>
-          <w:lang/>
         </w:rPr>
       </w:r>
       <w:r>
@@ -4667,9 +4607,9 @@
           <w:rFonts w:hint="eastAsia"/>
         </w:rPr>
       </w:r>
-      <w:bookmarkStart w:id="24" w:name="_Toc419472409"/>
-      <w:bookmarkStart w:id="25" w:name="_Toc419471760"/>
-      <w:bookmarkStart w:id="26" w:name="_Toc419471636"/>
+      <w:bookmarkStart w:id="24" w:name="_Toc419471760"/>
+      <w:bookmarkStart w:id="25" w:name="_Toc419471636"/>
+      <w:bookmarkStart w:id="26" w:name="_Toc419472409"/>
       <w:bookmarkStart w:id="27" w:name="_Toc419571865"/>
       <w:r>
         <w:rPr>
@@ -4696,7 +4636,6 @@
       <w:r>
         <w:rPr>
           <w:rFonts w:hint="eastAsia"/>
-          <w:lang/>
         </w:rPr>
       </w:r>
       <w:r>
@@ -4713,9 +4652,9 @@
           <w:rFonts w:hint="eastAsia"/>
         </w:rPr>
       </w:pPr>
-      <w:bookmarkStart w:id="28" w:name="_Toc419471761"/>
+      <w:bookmarkStart w:id="28" w:name="_Toc419471637"/>
       <w:bookmarkStart w:id="29" w:name="_Toc419472410"/>
-      <w:bookmarkStart w:id="30" w:name="_Toc419471637"/>
+      <w:bookmarkStart w:id="30" w:name="_Toc419471761"/>
       <w:bookmarkStart w:id="31" w:name="_Toc419571866"/>
       <w:r>
         <w:rPr>
@@ -4778,14 +4717,12 @@
         <w:rPr>
           <w:rFonts w:ascii="宋体" w:hAnsi="宋体" w:cs="宋体"/>
           <w:kern w:val="0"/>
-          <w:lang/>
         </w:rPr>
       </w:r>
       <w:r>
         <w:rPr>
           <w:rFonts w:ascii="宋体" w:hAnsi="宋体" w:cs="宋体"/>
           <w:kern w:val="0"/>
-          <w:lang/>
         </w:rPr>
       </w:r>
       <w:r>
@@ -4997,21 +4934,18 @@
         <w:rPr>
           <w:rFonts w:ascii="宋体" w:hAnsi="宋体" w:cs="宋体"/>
           <w:kern w:val="0"/>
-          <w:lang/>
         </w:rPr>
       </w:r>
       <w:r>
         <w:rPr>
           <w:rFonts w:ascii="宋体" w:hAnsi="宋体" w:cs="宋体"/>
           <w:kern w:val="0"/>
-          <w:lang/>
         </w:rPr>
       </w:r>
       <w:r>
         <w:rPr>
           <w:rFonts w:ascii="宋体" w:hAnsi="宋体" w:cs="宋体"/>
           <w:kern w:val="0"/>
-          <w:lang/>
         </w:rPr>
       </w:r>
     </w:p>
@@ -5235,11 +5169,7 @@
           <w:rFonts w:hint="eastAsia"/>
         </w:rPr>
       </w:pPr>
-      <w:r>
-        <w:rPr>
-          <w:lang/>
-        </w:rPr>
-      </w:r>
+      <w:r/>
       <w:r/>
     </w:p>
     <w:p>
@@ -5272,11 +5202,7 @@
       <w:bookmarkStart w:id="37" w:name="_Toc419472415"/>
       <w:bookmarkStart w:id="38" w:name="_Toc419471766"/>
       <w:bookmarkStart w:id="39" w:name="_Toc419571868"/>
-      <w:r>
-        <w:rPr>
-          <w:lang/>
-        </w:rPr>
-      </w:r>
+      <w:r/>
       <w:r>
         <w:rPr>
           <w:rFonts w:hint="eastAsia"/>
@@ -5316,7 +5242,6 @@
       <w:r>
         <w:rPr>
           <w:rFonts w:hint="eastAsia"/>
-          <w:lang/>
         </w:rPr>
       </w:r>
       <w:r>
@@ -5470,7 +5395,6 @@
           <w:rFonts w:hint="eastAsia" w:ascii="黑体" w:hAnsi="黑体" w:eastAsia="黑体"/>
           <w:color w:val="CCE8CF"/>
           <w:sz w:val="21"/>
-          <w:lang/>
         </w:rPr>
       </w:r>
     </w:p>
@@ -5502,13 +5426,11 @@
       <w:r>
         <w:rPr>
           <w:rFonts w:hint="eastAsia"/>
-          <w:lang/>
-        </w:rPr>
-      </w:r>
-      <w:r>
-        <w:rPr>
-          <w:rFonts w:hint="eastAsia"/>
-          <w:lang/>
+        </w:rPr>
+      </w:r>
+      <w:r>
+        <w:rPr>
+          <w:rFonts w:hint="eastAsia"/>
         </w:rPr>
       </w:r>
       <w:r>
@@ -5537,10 +5459,10 @@
           <w:rFonts w:hint="eastAsia"/>
         </w:rPr>
       </w:r>
-      <w:bookmarkStart w:id="40" w:name="_Toc419472443"/>
-      <w:bookmarkStart w:id="41" w:name="_Toc419471794"/>
-      <w:bookmarkStart w:id="42" w:name="_Toc419571869"/>
-      <w:bookmarkStart w:id="43" w:name="_Toc419471670"/>
+      <w:bookmarkStart w:id="40" w:name="_Toc419471670"/>
+      <w:bookmarkStart w:id="41" w:name="_Toc419571869"/>
+      <w:bookmarkStart w:id="42" w:name="_Toc419472443"/>
+      <w:bookmarkStart w:id="43" w:name="_Toc419471794"/>
       <w:r>
         <w:rPr>
           <w:rFonts w:hint="eastAsia"/>
@@ -5604,18 +5526,17 @@
           <w:szCs w:val="30"/>
         </w:rPr>
       </w:pPr>
-      <w:bookmarkStart w:id="44" w:name="_Toc419571772"/>
-      <w:bookmarkStart w:id="45" w:name="_Toc419571756"/>
+      <w:bookmarkStart w:id="44" w:name="_Toc419571727"/>
+      <w:bookmarkStart w:id="45" w:name="_Toc419571772"/>
       <w:bookmarkStart w:id="46" w:name="_Toc419486878"/>
-      <w:bookmarkStart w:id="47" w:name="_Toc419571727"/>
-      <w:bookmarkStart w:id="48" w:name="_Toc419571837"/>
-      <w:bookmarkStart w:id="49" w:name="_Toc419486721"/>
-      <w:bookmarkStart w:id="50" w:name="_Toc419571870"/>
-      <w:bookmarkStart w:id="51" w:name="_Toc419571599"/>
-      <w:r>
-        <w:rPr>
-          <w:rFonts w:hint="eastAsia"/>
-          <w:lang/>
+      <w:bookmarkStart w:id="47" w:name="_Toc419571756"/>
+      <w:bookmarkStart w:id="48" w:name="_Toc419571599"/>
+      <w:bookmarkStart w:id="49" w:name="_Toc419571870"/>
+      <w:bookmarkStart w:id="50" w:name="_Toc419486721"/>
+      <w:bookmarkStart w:id="51" w:name="_Toc419571837"/>
+      <w:r>
+        <w:rPr>
+          <w:rFonts w:hint="eastAsia"/>
         </w:rPr>
       </w:r>
       <w:bookmarkEnd w:id="44"/>
@@ -5626,8 +5547,8 @@
       <w:bookmarkEnd w:id="49"/>
       <w:bookmarkEnd w:id="50"/>
       <w:bookmarkEnd w:id="51"/>
-      <w:bookmarkStart w:id="52" w:name="_Toc419471797"/>
-      <w:bookmarkStart w:id="53" w:name="_Toc419471673"/>
+      <w:bookmarkStart w:id="52" w:name="_Toc419471673"/>
+      <w:bookmarkStart w:id="53" w:name="_Toc419471797"/>
       <w:bookmarkStart w:id="54" w:name="_Toc419472446"/>
     </w:p>
     <w:p>
@@ -5684,7 +5605,6 @@
       <w:r>
         <w:rPr>
           <w:rFonts w:hint="eastAsia"/>
-          <w:lang/>
         </w:rPr>
         <w:t xml:space="preserve">    {{ acknowledgement }}</w:t>
       </w:r>
@@ -5740,7 +5660,6 @@
           <w:strike w:val="0"/>
           <w:dstrike w:val="0"/>
           <w:highlight w:val="yellow"/>
-          <w:lang/>
         </w:rPr>
       </w:r>
       <w:r>
@@ -5786,7 +5705,6 @@
         <w:rPr>
           <w:rFonts w:hint="eastAsia"/>
           <w:highlight w:val="none"/>
-          <w:lang/>
         </w:rPr>
       </w:r>
       <w:r>
@@ -5894,7 +5812,6 @@
       <w:r>
         <w:rPr>
           <w:rFonts w:hint="eastAsia"/>
-          <w:lang/>
         </w:rPr>
       </w:r>
       <w:r>
@@ -6088,16 +6005,8 @@
           <w:rFonts w:hint="eastAsia"/>
         </w:rPr>
       </w:pPr>
-      <w:r>
-        <w:rPr>
-          <w:lang/>
-        </w:rPr>
-      </w:r>
-      <w:r>
-        <w:rPr>
-          <w:lang/>
-        </w:rPr>
-      </w:r>
+      <w:r/>
+      <w:r/>
     </w:p>
     <w:p>
       <w:pPr>
@@ -6149,7 +6058,6 @@
       <w:footerReference r:id="rId12" w:type="even"/>
       <w:pgSz w:w="11906" w:h="16838"/>
       <w:pgMar w:top="1417" w:right="1418" w:bottom="1417" w:left="1417" w:header="992" w:footer="992" w:gutter="0"/>
-      <w:paperSrc/>
       <w:pgNumType w:fmt="decimal" w:start="1"/>
       <w:cols w:space="720" w:num="1"/>
       <w:rtlGutter w:val="0"/>
@@ -6396,7 +6304,6 @@
         <w:rFonts w:ascii="宋体" w:hAnsi="宋体" w:eastAsia="宋体"/>
         <w:sz w:val="28"/>
         <w:szCs w:val="28"/>
-        <w:lang/>
       </w:rPr>
       <w:t>２</w:t>
     </w:r>
@@ -7316,6 +7223,7 @@
       <w:jc w:val="both"/>
     </w:pPr>
     <w:rPr>
+      <w:rFonts w:ascii="Times New Roman" w:hAnsi="Times New Roman" w:eastAsia="宋体" w:cs="Times New Roman"/>
       <w:kern w:val="2"/>
       <w:sz w:val="24"/>
       <w:szCs w:val="24"/>
@@ -7503,7 +7411,6 @@
     <w:semiHidden/>
     <w:uiPriority w:val="0"/>
     <w:tblPr>
-      <w:tblStyle w:val="59"/>
       <w:tblCellMar>
         <w:top w:w="0" w:type="dxa"/>
         <w:left w:w="108" w:type="dxa"/>
@@ -7750,7 +7657,6 @@
     </w:pPr>
     <w:rPr>
       <w:rFonts w:ascii="宋体" w:hAnsi="宋体"/>
-      <w:lang/>
     </w:rPr>
   </w:style>
   <w:style w:type="paragraph" w:styleId="33">
@@ -7877,7 +7783,7 @@
       <w:jc w:val="center"/>
     </w:pPr>
     <w:rPr>
-      <w:rFonts w:eastAsia="仿宋_GB2312"/>
+      <w:rFonts w:ascii="Times New Roman" w:hAnsi="Times New Roman" w:eastAsia="仿宋_GB2312" w:cs="Times New Roman"/>
       <w:kern w:val="2"/>
       <w:sz w:val="18"/>
       <w:szCs w:val="18"/>
@@ -7905,7 +7811,6 @@
     <w:rPr>
       <w:rFonts w:ascii="宋体" w:hAnsi="宋体"/>
       <w:b/>
-      <w:lang/>
     </w:rPr>
   </w:style>
   <w:style w:type="paragraph" w:styleId="45">
@@ -7991,7 +7896,6 @@
     </w:pPr>
     <w:rPr>
       <w:rFonts w:ascii="宋体" w:hAnsi="宋体"/>
-      <w:lang/>
     </w:rPr>
   </w:style>
   <w:style w:type="paragraph" w:styleId="52">
@@ -8081,7 +7985,6 @@
       <w:jc w:val="both"/>
     </w:pPr>
     <w:tblPr>
-      <w:tblStyle w:val="59"/>
       <w:tblBorders>
         <w:top w:val="single" w:color="auto" w:sz="4" w:space="0"/>
         <w:left w:val="single" w:color="auto" w:sz="4" w:space="0"/>
@@ -8102,7 +8005,6 @@
       <w:jc w:val="both"/>
     </w:pPr>
     <w:tblPr>
-      <w:tblStyle w:val="59"/>
       <w:tblBorders>
         <w:top w:val="single" w:color="auto" w:sz="4" w:space="0"/>
         <w:left w:val="single" w:color="auto" w:sz="4" w:space="0"/>
@@ -8126,7 +8028,6 @@
       <w:color w:val="FFFFFF"/>
     </w:rPr>
     <w:tblPr>
-      <w:tblStyle w:val="59"/>
       <w:tblBorders>
         <w:top w:val="single" w:color="008080" w:sz="12" w:space="0"/>
         <w:left w:val="single" w:color="008080" w:sz="12" w:space="0"/>
@@ -8145,9 +8046,7 @@
         <w:i/>
         <w:iCs/>
       </w:rPr>
-      <w:tblPr>
-        <w:tblStyle w:val="59"/>
-      </w:tblPr>
+      <w:tblPr/>
       <w:tcPr>
         <w:tcBorders>
           <w:top w:val="nil"/>
@@ -8169,9 +8068,7 @@
         <w:i/>
         <w:iCs/>
       </w:rPr>
-      <w:tblPr>
-        <w:tblStyle w:val="59"/>
-      </w:tblPr>
+      <w:tblPr/>
       <w:tcPr>
         <w:tcBorders>
           <w:top w:val="nil"/>
@@ -8187,9 +8084,7 @@
       </w:tcPr>
     </w:tblStylePr>
     <w:tblStylePr w:type="nwCell">
-      <w:tblPr>
-        <w:tblStyle w:val="59"/>
-      </w:tblPr>
+      <w:tblPr/>
       <w:tcPr>
         <w:tcBorders>
           <w:top w:val="nil"/>
@@ -8211,9 +8106,7 @@
         <w:i w:val="0"/>
         <w:iCs w:val="0"/>
       </w:rPr>
-      <w:tblPr>
-        <w:tblStyle w:val="59"/>
-      </w:tblPr>
+      <w:tblPr/>
       <w:tcPr>
         <w:tcBorders>
           <w:top w:val="nil"/>
@@ -8238,7 +8131,6 @@
       <w:jc w:val="both"/>
     </w:pPr>
     <w:tblPr>
-      <w:tblStyle w:val="59"/>
       <w:tblBorders>
         <w:bottom w:val="single" w:color="000000" w:sz="12" w:space="0"/>
       </w:tblBorders>
@@ -8254,9 +8146,7 @@
         <w:iCs/>
         <w:color w:val="FFFFFF"/>
       </w:rPr>
-      <w:tblPr>
-        <w:tblStyle w:val="59"/>
-      </w:tblPr>
+      <w:tblPr/>
       <w:tcPr>
         <w:tcBorders>
           <w:top w:val="nil"/>
@@ -8278,9 +8168,7 @@
         <w:i/>
         <w:iCs/>
       </w:rPr>
-      <w:tblPr>
-        <w:tblStyle w:val="59"/>
-      </w:tblPr>
+      <w:tblPr/>
       <w:tcPr>
         <w:tcBorders>
           <w:top w:val="nil"/>
@@ -8295,9 +8183,7 @@
       </w:tcPr>
     </w:tblStylePr>
     <w:tblStylePr w:type="lastCol">
-      <w:tblPr>
-        <w:tblStyle w:val="59"/>
-      </w:tblPr>
+      <w:tblPr/>
       <w:tcPr>
         <w:tcBorders>
           <w:top w:val="nil"/>
@@ -8319,9 +8205,7 @@
         <w:i w:val="0"/>
         <w:iCs w:val="0"/>
       </w:rPr>
-      <w:tblPr>
-        <w:tblStyle w:val="59"/>
-      </w:tblPr>
+      <w:tblPr/>
       <w:tcPr>
         <w:tcBorders>
           <w:top w:val="nil"/>
@@ -8346,7 +8230,6 @@
       <w:jc w:val="both"/>
     </w:pPr>
     <w:tblPr>
-      <w:tblStyle w:val="59"/>
       <w:tblBorders>
         <w:top w:val="single" w:color="000000" w:sz="18" w:space="0"/>
         <w:left w:val="single" w:color="000000" w:sz="18" w:space="0"/>
@@ -8359,9 +8242,7 @@
       <w:shd w:val="pct25" w:color="008080" w:fill="FFFFFF"/>
     </w:tcPr>
     <w:tblStylePr w:type="firstRow">
-      <w:tblPr>
-        <w:tblStyle w:val="59"/>
-      </w:tblPr>
+      <w:tblPr/>
       <w:tcPr>
         <w:tcBorders>
           <w:top w:val="nil"/>
@@ -8377,9 +8258,7 @@
       </w:tcPr>
     </w:tblStylePr>
     <w:tblStylePr w:type="firstCol">
-      <w:tblPr>
-        <w:tblStyle w:val="59"/>
-      </w:tblPr>
+      <w:tblPr/>
       <w:tcPr>
         <w:tcBorders>
           <w:top w:val="nil"/>
@@ -8400,9 +8279,7 @@
         <w:bCs/>
         <w:color w:val="FFFFFF"/>
       </w:rPr>
-      <w:tblPr>
-        <w:tblStyle w:val="59"/>
-      </w:tblPr>
+      <w:tblPr/>
       <w:tcPr>
         <w:tcBorders>
           <w:top w:val="nil"/>
@@ -8428,7 +8305,6 @@
       <w:jc w:val="both"/>
     </w:pPr>
     <w:tblPr>
-      <w:tblStyle w:val="59"/>
       <w:tblBorders>
         <w:top w:val="double" w:color="000000" w:sz="6" w:space="0"/>
         <w:left w:val="double" w:color="000000" w:sz="6" w:space="0"/>
@@ -8446,9 +8322,7 @@
         <w:caps/>
         <w:color w:val="auto"/>
       </w:rPr>
-      <w:tblPr>
-        <w:tblStyle w:val="59"/>
-      </w:tblPr>
+      <w:tblPr/>
       <w:tcPr>
         <w:tcBorders>
           <w:top w:val="nil"/>
@@ -8473,7 +8347,6 @@
       <w:jc w:val="both"/>
     </w:pPr>
     <w:tblPr>
-      <w:tblStyle w:val="59"/>
       <w:tblBorders>
         <w:top w:val="single" w:color="000000" w:sz="12" w:space="0"/>
         <w:bottom w:val="single" w:color="000000" w:sz="12" w:space="0"/>
@@ -8487,9 +8360,7 @@
         <w:i/>
         <w:iCs/>
       </w:rPr>
-      <w:tblPr>
-        <w:tblStyle w:val="59"/>
-      </w:tblPr>
+      <w:tblPr/>
       <w:tcPr>
         <w:tcBorders>
           <w:top w:val="nil"/>
@@ -8507,9 +8378,7 @@
       <w:rPr>
         <w:color w:val="auto"/>
       </w:rPr>
-      <w:tblPr>
-        <w:tblStyle w:val="59"/>
-      </w:tblPr>
+      <w:tblPr/>
       <w:tcPr>
         <w:tcBorders>
           <w:top w:val="single" w:color="000000" w:sz="6" w:space="0"/>
@@ -8524,9 +8393,7 @@
       </w:tcPr>
     </w:tblStylePr>
     <w:tblStylePr w:type="firstCol">
-      <w:tblPr>
-        <w:tblStyle w:val="59"/>
-      </w:tblPr>
+      <w:tblPr/>
       <w:tcPr>
         <w:tcBorders>
           <w:top w:val="nil"/>
@@ -8547,9 +8414,7 @@
         <w:i w:val="0"/>
         <w:iCs w:val="0"/>
       </w:rPr>
-      <w:tblPr>
-        <w:tblStyle w:val="59"/>
-      </w:tblPr>
+      <w:tblPr/>
       <w:tcPr>
         <w:tcBorders>
           <w:top w:val="nil"/>
@@ -8568,9 +8433,7 @@
         <w:b/>
         <w:bCs/>
       </w:rPr>
-      <w:tblPr>
-        <w:tblStyle w:val="59"/>
-      </w:tblPr>
+      <w:tblPr/>
       <w:tcPr>
         <w:tcBorders>
           <w:top w:val="nil"/>
@@ -8595,7 +8458,6 @@
       <w:jc w:val="both"/>
     </w:pPr>
     <w:tblPr>
-      <w:tblStyle w:val="59"/>
       <w:tblBorders>
         <w:top w:val="single" w:color="000000" w:sz="12" w:space="0"/>
         <w:bottom w:val="single" w:color="000000" w:sz="12" w:space="0"/>
@@ -8608,9 +8470,7 @@
       <w:rPr>
         <w:color w:val="FFFFFF"/>
       </w:rPr>
-      <w:tblPr>
-        <w:tblStyle w:val="59"/>
-      </w:tblPr>
+      <w:tblPr/>
       <w:tcPr>
         <w:tcBorders>
           <w:top w:val="nil"/>
@@ -8626,9 +8486,7 @@
       </w:tcPr>
     </w:tblStylePr>
     <w:tblStylePr w:type="lastRow">
-      <w:tblPr>
-        <w:tblStyle w:val="59"/>
-      </w:tblPr>
+      <w:tblPr/>
       <w:tcPr>
         <w:tcBorders>
           <w:top w:val="single" w:color="000000" w:sz="6" w:space="0"/>
@@ -8647,9 +8505,7 @@
         <w:b/>
         <w:bCs/>
       </w:rPr>
-      <w:tblPr>
-        <w:tblStyle w:val="59"/>
-      </w:tblPr>
+      <w:tblPr/>
       <w:tcPr>
         <w:tcBorders>
           <w:top w:val="nil"/>
@@ -8669,9 +8525,7 @@
         <w:b/>
         <w:bCs/>
       </w:rPr>
-      <w:tblPr>
-        <w:tblStyle w:val="59"/>
-      </w:tblPr>
+      <w:tblPr/>
       <w:tcPr>
         <w:tcBorders>
           <w:top w:val="nil"/>
@@ -8686,9 +8540,7 @@
       </w:tcPr>
     </w:tblStylePr>
     <w:tblStylePr w:type="nwCell">
-      <w:tblPr>
-        <w:tblStyle w:val="59"/>
-      </w:tblPr>
+      <w:tblPr/>
       <w:tcPr>
         <w:tcBorders>
           <w:top w:val="nil"/>
@@ -8707,9 +8559,7 @@
       <w:rPr>
         <w:color w:val="000080"/>
       </w:rPr>
-      <w:tblPr>
-        <w:tblStyle w:val="59"/>
-      </w:tblPr>
+      <w:tblPr/>
       <w:tcPr>
         <w:tcBorders>
           <w:top w:val="nil"/>
@@ -8737,7 +8587,6 @@
       <w:color w:val="000080"/>
     </w:rPr>
     <w:tblPr>
-      <w:tblStyle w:val="59"/>
       <w:tblBorders>
         <w:top w:val="single" w:color="000000" w:sz="12" w:space="0"/>
         <w:left w:val="single" w:color="000000" w:sz="12" w:space="0"/>
@@ -8756,9 +8605,7 @@
         <w:iCs/>
         <w:color w:val="FFFFFF"/>
       </w:rPr>
-      <w:tblPr>
-        <w:tblStyle w:val="59"/>
-      </w:tblPr>
+      <w:tblPr/>
       <w:tcPr>
         <w:tcBorders>
           <w:top w:val="nil"/>
@@ -8777,9 +8624,7 @@
       <w:rPr>
         <w:color w:val="000080"/>
       </w:rPr>
-      <w:tblPr>
-        <w:tblStyle w:val="59"/>
-      </w:tblPr>
+      <w:tblPr/>
       <w:tcPr>
         <w:tcBorders>
           <w:top w:val="single" w:color="000000" w:sz="12" w:space="0"/>
@@ -8800,9 +8645,7 @@
         <w:bCs/>
         <w:color w:val="000000"/>
       </w:rPr>
-      <w:tblPr>
-        <w:tblStyle w:val="59"/>
-      </w:tblPr>
+      <w:tblPr/>
       <w:tcPr>
         <w:tcBorders>
           <w:top w:val="nil"/>
@@ -8827,7 +8670,6 @@
       <w:jc w:val="both"/>
     </w:pPr>
     <w:tblPr>
-      <w:tblStyle w:val="59"/>
       <w:tblBorders>
         <w:top w:val="single" w:color="000000" w:sz="12" w:space="0"/>
         <w:left w:val="single" w:color="000000" w:sz="6" w:space="0"/>
@@ -8846,9 +8688,7 @@
         <w:iCs/>
         <w:color w:val="FFFFFF"/>
       </w:rPr>
-      <w:tblPr>
-        <w:tblStyle w:val="59"/>
-      </w:tblPr>
+      <w:tblPr/>
       <w:tcPr>
         <w:tcBorders>
           <w:top w:val="nil"/>
@@ -8867,9 +8707,7 @@
       <w:rPr>
         <w:color w:val="000080"/>
       </w:rPr>
-      <w:tblPr>
-        <w:tblStyle w:val="59"/>
-      </w:tblPr>
+      <w:tblPr/>
       <w:tcPr>
         <w:tcBorders>
           <w:top w:val="nil"/>
@@ -8889,9 +8727,7 @@
         <w:b/>
         <w:bCs/>
       </w:rPr>
-      <w:tblPr>
-        <w:tblStyle w:val="59"/>
-      </w:tblPr>
+      <w:tblPr/>
       <w:tcPr>
         <w:tcBorders>
           <w:top w:val="nil"/>
@@ -8910,9 +8746,7 @@
         <w:b/>
         <w:bCs/>
       </w:rPr>
-      <w:tblPr>
-        <w:tblStyle w:val="59"/>
-      </w:tblPr>
+      <w:tblPr/>
       <w:tcPr>
         <w:tcBorders>
           <w:top w:val="nil"/>
@@ -8930,9 +8764,7 @@
       <w:rPr>
         <w:color w:val="000080"/>
       </w:rPr>
-      <w:tblPr>
-        <w:tblStyle w:val="59"/>
-      </w:tblPr>
+      <w:tblPr/>
       <w:tcPr>
         <w:tcBorders>
           <w:top w:val="nil"/>
@@ -8957,7 +8789,6 @@
       <w:jc w:val="both"/>
     </w:pPr>
     <w:tblPr>
-      <w:tblStyle w:val="59"/>
       <w:tblBorders>
         <w:top w:val="single" w:color="008000" w:sz="12" w:space="0"/>
         <w:bottom w:val="single" w:color="008000" w:sz="12" w:space="0"/>
@@ -8967,9 +8798,7 @@
       <w:shd w:val="clear" w:color="auto" w:fill="auto"/>
     </w:tcPr>
     <w:tblStylePr w:type="firstRow">
-      <w:tblPr>
-        <w:tblStyle w:val="59"/>
-      </w:tblPr>
+      <w:tblPr/>
       <w:tcPr>
         <w:tcBorders>
           <w:top w:val="nil"/>
@@ -8984,9 +8813,7 @@
       </w:tcPr>
     </w:tblStylePr>
     <w:tblStylePr w:type="lastRow">
-      <w:tblPr>
-        <w:tblStyle w:val="59"/>
-      </w:tblPr>
+      <w:tblPr/>
       <w:tcPr>
         <w:tcBorders>
           <w:top w:val="single" w:color="008000" w:sz="6" w:space="0"/>
@@ -9003,6 +8830,132 @@
   </w:style>
   <w:style w:type="table" w:styleId="71">
     <w:name w:val="Table Simple 2"/>
+    <w:basedOn w:val="59"/>
+    <w:semiHidden/>
+    <w:uiPriority w:val="0"/>
+    <w:pPr>
+      <w:widowControl w:val="0"/>
+      <w:jc w:val="both"/>
+    </w:pPr>
+    <w:tblPr/>
+    <w:tblStylePr w:type="firstRow">
+      <w:rPr>
+        <w:b/>
+        <w:bCs/>
+      </w:rPr>
+      <w:tblPr/>
+      <w:tcPr>
+        <w:tcBorders>
+          <w:top w:val="nil"/>
+          <w:left w:val="single" w:color="000000" w:sz="12" w:space="0"/>
+          <w:bottom w:val="nil"/>
+          <w:right w:val="nil"/>
+          <w:insideH w:val="nil"/>
+          <w:insideV w:val="nil"/>
+          <w:tl2br w:val="nil"/>
+          <w:tr2bl w:val="nil"/>
+        </w:tcBorders>
+      </w:tcPr>
+    </w:tblStylePr>
+    <w:tblStylePr w:type="lastRow">
+      <w:rPr>
+        <w:b/>
+        <w:bCs/>
+        <w:color w:val="auto"/>
+      </w:rPr>
+      <w:tblPr/>
+      <w:tcPr>
+        <w:tcBorders>
+          <w:top w:val="single" w:color="000000" w:sz="6" w:space="0"/>
+          <w:left w:val="nil"/>
+          <w:bottom w:val="nil"/>
+          <w:right w:val="nil"/>
+          <w:insideH w:val="nil"/>
+          <w:insideV w:val="nil"/>
+          <w:tl2br w:val="nil"/>
+          <w:tr2bl w:val="nil"/>
+        </w:tcBorders>
+      </w:tcPr>
+    </w:tblStylePr>
+    <w:tblStylePr w:type="firstCol">
+      <w:rPr>
+        <w:b/>
+        <w:bCs/>
+      </w:rPr>
+      <w:tblPr/>
+      <w:tcPr>
+        <w:tcBorders>
+          <w:top w:val="nil"/>
+          <w:left w:val="nil"/>
+          <w:bottom w:val="nil"/>
+          <w:right w:val="single" w:color="000000" w:sz="12" w:space="0"/>
+          <w:insideH w:val="nil"/>
+          <w:insideV w:val="nil"/>
+          <w:tl2br w:val="nil"/>
+          <w:tr2bl w:val="nil"/>
+        </w:tcBorders>
+      </w:tcPr>
+    </w:tblStylePr>
+    <w:tblStylePr w:type="lastCol">
+      <w:rPr>
+        <w:b/>
+        <w:bCs/>
+      </w:rPr>
+      <w:tblPr/>
+      <w:tcPr>
+        <w:tcBorders>
+          <w:top w:val="nil"/>
+          <w:left w:val="nil"/>
+          <w:bottom w:val="single" w:color="000000" w:sz="6" w:space="0"/>
+          <w:right w:val="nil"/>
+          <w:insideH w:val="nil"/>
+          <w:insideV w:val="nil"/>
+          <w:tl2br w:val="nil"/>
+          <w:tr2bl w:val="nil"/>
+        </w:tcBorders>
+      </w:tcPr>
+    </w:tblStylePr>
+    <w:tblStylePr w:type="neCell">
+      <w:rPr>
+        <w:b/>
+        <w:bCs/>
+      </w:rPr>
+      <w:tblPr/>
+      <w:tcPr>
+        <w:tcBorders>
+          <w:top w:val="nil"/>
+          <w:left w:val="nil"/>
+          <w:bottom w:val="nil"/>
+          <w:right w:val="nil"/>
+          <w:insideH w:val="nil"/>
+          <w:insideV w:val="nil"/>
+          <w:tl2br w:val="nil"/>
+          <w:tr2bl w:val="nil"/>
+        </w:tcBorders>
+      </w:tcPr>
+    </w:tblStylePr>
+    <w:tblStylePr w:type="swCell">
+      <w:rPr>
+        <w:b/>
+        <w:bCs/>
+      </w:rPr>
+      <w:tblPr/>
+      <w:tcPr>
+        <w:tcBorders>
+          <w:top w:val="nil"/>
+          <w:left w:val="nil"/>
+          <w:bottom w:val="nil"/>
+          <w:right w:val="nil"/>
+          <w:insideH w:val="nil"/>
+          <w:insideV w:val="nil"/>
+          <w:tl2br w:val="nil"/>
+          <w:tr2bl w:val="nil"/>
+        </w:tcBorders>
+      </w:tcPr>
+    </w:tblStylePr>
+  </w:style>
+  <w:style w:type="table" w:styleId="72">
+    <w:name w:val="Table Simple 3"/>
     <w:basedOn w:val="59"/>
     <w:semiHidden/>
     <w:uiPriority w:val="0"/>
@@ -9011,147 +8964,6 @@
       <w:jc w:val="both"/>
     </w:pPr>
     <w:tblPr>
-      <w:tblStyle w:val="59"/>
-    </w:tblPr>
-    <w:tblStylePr w:type="firstRow">
-      <w:rPr>
-        <w:b/>
-        <w:bCs/>
-      </w:rPr>
-      <w:tblPr>
-        <w:tblStyle w:val="59"/>
-      </w:tblPr>
-      <w:tcPr>
-        <w:tcBorders>
-          <w:top w:val="nil"/>
-          <w:left w:val="single" w:color="000000" w:sz="12" w:space="0"/>
-          <w:bottom w:val="nil"/>
-          <w:right w:val="nil"/>
-          <w:insideH w:val="nil"/>
-          <w:insideV w:val="nil"/>
-          <w:tl2br w:val="nil"/>
-          <w:tr2bl w:val="nil"/>
-        </w:tcBorders>
-      </w:tcPr>
-    </w:tblStylePr>
-    <w:tblStylePr w:type="lastRow">
-      <w:rPr>
-        <w:b/>
-        <w:bCs/>
-        <w:color w:val="auto"/>
-      </w:rPr>
-      <w:tblPr>
-        <w:tblStyle w:val="59"/>
-      </w:tblPr>
-      <w:tcPr>
-        <w:tcBorders>
-          <w:top w:val="single" w:color="000000" w:sz="6" w:space="0"/>
-          <w:left w:val="nil"/>
-          <w:bottom w:val="nil"/>
-          <w:right w:val="nil"/>
-          <w:insideH w:val="nil"/>
-          <w:insideV w:val="nil"/>
-          <w:tl2br w:val="nil"/>
-          <w:tr2bl w:val="nil"/>
-        </w:tcBorders>
-      </w:tcPr>
-    </w:tblStylePr>
-    <w:tblStylePr w:type="firstCol">
-      <w:rPr>
-        <w:b/>
-        <w:bCs/>
-      </w:rPr>
-      <w:tblPr>
-        <w:tblStyle w:val="59"/>
-      </w:tblPr>
-      <w:tcPr>
-        <w:tcBorders>
-          <w:top w:val="nil"/>
-          <w:left w:val="nil"/>
-          <w:bottom w:val="nil"/>
-          <w:right w:val="single" w:color="000000" w:sz="12" w:space="0"/>
-          <w:insideH w:val="nil"/>
-          <w:insideV w:val="nil"/>
-          <w:tl2br w:val="nil"/>
-          <w:tr2bl w:val="nil"/>
-        </w:tcBorders>
-      </w:tcPr>
-    </w:tblStylePr>
-    <w:tblStylePr w:type="lastCol">
-      <w:rPr>
-        <w:b/>
-        <w:bCs/>
-      </w:rPr>
-      <w:tblPr>
-        <w:tblStyle w:val="59"/>
-      </w:tblPr>
-      <w:tcPr>
-        <w:tcBorders>
-          <w:top w:val="nil"/>
-          <w:left w:val="nil"/>
-          <w:bottom w:val="single" w:color="000000" w:sz="6" w:space="0"/>
-          <w:right w:val="nil"/>
-          <w:insideH w:val="nil"/>
-          <w:insideV w:val="nil"/>
-          <w:tl2br w:val="nil"/>
-          <w:tr2bl w:val="nil"/>
-        </w:tcBorders>
-      </w:tcPr>
-    </w:tblStylePr>
-    <w:tblStylePr w:type="neCell">
-      <w:rPr>
-        <w:b/>
-        <w:bCs/>
-      </w:rPr>
-      <w:tblPr>
-        <w:tblStyle w:val="59"/>
-      </w:tblPr>
-      <w:tcPr>
-        <w:tcBorders>
-          <w:top w:val="nil"/>
-          <w:left w:val="nil"/>
-          <w:bottom w:val="nil"/>
-          <w:right w:val="nil"/>
-          <w:insideH w:val="nil"/>
-          <w:insideV w:val="nil"/>
-          <w:tl2br w:val="nil"/>
-          <w:tr2bl w:val="nil"/>
-        </w:tcBorders>
-      </w:tcPr>
-    </w:tblStylePr>
-    <w:tblStylePr w:type="swCell">
-      <w:rPr>
-        <w:b/>
-        <w:bCs/>
-      </w:rPr>
-      <w:tblPr>
-        <w:tblStyle w:val="59"/>
-      </w:tblPr>
-      <w:tcPr>
-        <w:tcBorders>
-          <w:top w:val="nil"/>
-          <w:left w:val="nil"/>
-          <w:bottom w:val="nil"/>
-          <w:right w:val="nil"/>
-          <w:insideH w:val="nil"/>
-          <w:insideV w:val="nil"/>
-          <w:tl2br w:val="nil"/>
-          <w:tr2bl w:val="nil"/>
-        </w:tcBorders>
-      </w:tcPr>
-    </w:tblStylePr>
-  </w:style>
-  <w:style w:type="table" w:styleId="72">
-    <w:name w:val="Table Simple 3"/>
-    <w:basedOn w:val="59"/>
-    <w:semiHidden/>
-    <w:uiPriority w:val="0"/>
-    <w:pPr>
-      <w:widowControl w:val="0"/>
-      <w:jc w:val="both"/>
-    </w:pPr>
-    <w:tblPr>
-      <w:tblStyle w:val="59"/>
       <w:tblBorders>
         <w:top w:val="single" w:color="000000" w:sz="12" w:space="0"/>
         <w:left w:val="single" w:color="000000" w:sz="12" w:space="0"/>
@@ -9168,9 +8980,7 @@
         <w:bCs/>
         <w:color w:val="FFFFFF"/>
       </w:rPr>
-      <w:tblPr>
-        <w:tblStyle w:val="59"/>
-      </w:tblPr>
+      <w:tblPr/>
       <w:tcPr>
         <w:tcBorders>
           <w:top w:val="nil"/>
@@ -9188,6 +8998,132 @@
   </w:style>
   <w:style w:type="table" w:styleId="73">
     <w:name w:val="Table Subtle 1"/>
+    <w:basedOn w:val="59"/>
+    <w:semiHidden/>
+    <w:uiPriority w:val="0"/>
+    <w:pPr>
+      <w:widowControl w:val="0"/>
+      <w:jc w:val="both"/>
+    </w:pPr>
+    <w:tblPr/>
+    <w:tblStylePr w:type="firstRow">
+      <w:tblPr/>
+      <w:tcPr>
+        <w:tcBorders>
+          <w:top w:val="single" w:color="000000" w:sz="6" w:space="0"/>
+          <w:left w:val="single" w:color="000000" w:sz="12" w:space="0"/>
+          <w:bottom w:val="nil"/>
+          <w:right w:val="nil"/>
+          <w:insideH w:val="nil"/>
+          <w:insideV w:val="nil"/>
+          <w:tl2br w:val="nil"/>
+          <w:tr2bl w:val="nil"/>
+        </w:tcBorders>
+      </w:tcPr>
+    </w:tblStylePr>
+    <w:tblStylePr w:type="lastRow">
+      <w:tblPr/>
+      <w:tcPr>
+        <w:tcBorders>
+          <w:top w:val="single" w:color="000000" w:sz="12" w:space="0"/>
+          <w:left w:val="nil"/>
+          <w:bottom w:val="nil"/>
+          <w:right w:val="nil"/>
+          <w:insideH w:val="nil"/>
+          <w:insideV w:val="nil"/>
+          <w:tl2br w:val="nil"/>
+          <w:tr2bl w:val="nil"/>
+        </w:tcBorders>
+        <w:shd w:val="pct25" w:color="800080" w:fill="FFFFFF"/>
+      </w:tcPr>
+    </w:tblStylePr>
+    <w:tblStylePr w:type="firstCol">
+      <w:tblPr/>
+      <w:tcPr>
+        <w:tcBorders>
+          <w:top w:val="nil"/>
+          <w:left w:val="nil"/>
+          <w:bottom w:val="nil"/>
+          <w:right w:val="single" w:color="000000" w:sz="12" w:space="0"/>
+          <w:insideH w:val="nil"/>
+          <w:insideV w:val="nil"/>
+          <w:tl2br w:val="nil"/>
+          <w:tr2bl w:val="nil"/>
+        </w:tcBorders>
+      </w:tcPr>
+    </w:tblStylePr>
+    <w:tblStylePr w:type="lastCol">
+      <w:tblPr/>
+      <w:tcPr>
+        <w:tcBorders>
+          <w:top w:val="nil"/>
+          <w:left w:val="nil"/>
+          <w:bottom w:val="single" w:color="000000" w:sz="12" w:space="0"/>
+          <w:right w:val="nil"/>
+          <w:insideH w:val="nil"/>
+          <w:insideV w:val="nil"/>
+          <w:tl2br w:val="nil"/>
+          <w:tr2bl w:val="nil"/>
+        </w:tcBorders>
+      </w:tcPr>
+    </w:tblStylePr>
+    <w:tblStylePr w:type="band1Horz">
+      <w:tblPr/>
+      <w:tcPr>
+        <w:tcBorders>
+          <w:top w:val="nil"/>
+          <w:left w:val="single" w:color="000000" w:sz="6" w:space="0"/>
+          <w:bottom w:val="nil"/>
+          <w:right w:val="nil"/>
+          <w:insideH w:val="nil"/>
+          <w:insideV w:val="nil"/>
+          <w:tl2br w:val="nil"/>
+          <w:tr2bl w:val="nil"/>
+        </w:tcBorders>
+        <w:shd w:val="pct25" w:color="808000" w:fill="FFFFFF"/>
+      </w:tcPr>
+    </w:tblStylePr>
+    <w:tblStylePr w:type="neCell">
+      <w:rPr>
+        <w:b/>
+        <w:bCs/>
+      </w:rPr>
+      <w:tblPr/>
+      <w:tcPr>
+        <w:tcBorders>
+          <w:top w:val="nil"/>
+          <w:left w:val="nil"/>
+          <w:bottom w:val="nil"/>
+          <w:right w:val="nil"/>
+          <w:insideH w:val="nil"/>
+          <w:insideV w:val="nil"/>
+          <w:tl2br w:val="nil"/>
+          <w:tr2bl w:val="nil"/>
+        </w:tcBorders>
+      </w:tcPr>
+    </w:tblStylePr>
+    <w:tblStylePr w:type="swCell">
+      <w:rPr>
+        <w:b/>
+        <w:bCs/>
+      </w:rPr>
+      <w:tblPr/>
+      <w:tcPr>
+        <w:tcBorders>
+          <w:top w:val="nil"/>
+          <w:left w:val="nil"/>
+          <w:bottom w:val="nil"/>
+          <w:right w:val="nil"/>
+          <w:insideH w:val="nil"/>
+          <w:insideV w:val="nil"/>
+          <w:tl2br w:val="nil"/>
+          <w:tr2bl w:val="nil"/>
+        </w:tcBorders>
+      </w:tcPr>
+    </w:tblStylePr>
+  </w:style>
+  <w:style w:type="table" w:styleId="74">
+    <w:name w:val="Table Subtle 2"/>
     <w:basedOn w:val="59"/>
     <w:semiHidden/>
     <w:uiPriority w:val="0"/>
@@ -9196,159 +9132,13 @@
       <w:jc w:val="both"/>
     </w:pPr>
     <w:tblPr>
-      <w:tblStyle w:val="59"/>
-      <w:tblStyleRowBandSize w:val="1"/>
-    </w:tblPr>
-    <w:tblStylePr w:type="firstRow">
-      <w:tblPr>
-        <w:tblStyle w:val="59"/>
-      </w:tblPr>
-      <w:tcPr>
-        <w:tcBorders>
-          <w:top w:val="single" w:color="000000" w:sz="6" w:space="0"/>
-          <w:left w:val="single" w:color="000000" w:sz="12" w:space="0"/>
-          <w:bottom w:val="nil"/>
-          <w:right w:val="nil"/>
-          <w:insideH w:val="nil"/>
-          <w:insideV w:val="nil"/>
-          <w:tl2br w:val="nil"/>
-          <w:tr2bl w:val="nil"/>
-        </w:tcBorders>
-      </w:tcPr>
-    </w:tblStylePr>
-    <w:tblStylePr w:type="lastRow">
-      <w:tblPr>
-        <w:tblStyle w:val="59"/>
-      </w:tblPr>
-      <w:tcPr>
-        <w:tcBorders>
-          <w:top w:val="single" w:color="000000" w:sz="12" w:space="0"/>
-          <w:left w:val="nil"/>
-          <w:bottom w:val="nil"/>
-          <w:right w:val="nil"/>
-          <w:insideH w:val="nil"/>
-          <w:insideV w:val="nil"/>
-          <w:tl2br w:val="nil"/>
-          <w:tr2bl w:val="nil"/>
-        </w:tcBorders>
-        <w:shd w:val="pct25" w:color="800080" w:fill="FFFFFF"/>
-      </w:tcPr>
-    </w:tblStylePr>
-    <w:tblStylePr w:type="firstCol">
-      <w:tblPr>
-        <w:tblStyle w:val="59"/>
-      </w:tblPr>
-      <w:tcPr>
-        <w:tcBorders>
-          <w:top w:val="nil"/>
-          <w:left w:val="nil"/>
-          <w:bottom w:val="nil"/>
-          <w:right w:val="single" w:color="000000" w:sz="12" w:space="0"/>
-          <w:insideH w:val="nil"/>
-          <w:insideV w:val="nil"/>
-          <w:tl2br w:val="nil"/>
-          <w:tr2bl w:val="nil"/>
-        </w:tcBorders>
-      </w:tcPr>
-    </w:tblStylePr>
-    <w:tblStylePr w:type="lastCol">
-      <w:tblPr>
-        <w:tblStyle w:val="59"/>
-      </w:tblPr>
-      <w:tcPr>
-        <w:tcBorders>
-          <w:top w:val="nil"/>
-          <w:left w:val="nil"/>
-          <w:bottom w:val="single" w:color="000000" w:sz="12" w:space="0"/>
-          <w:right w:val="nil"/>
-          <w:insideH w:val="nil"/>
-          <w:insideV w:val="nil"/>
-          <w:tl2br w:val="nil"/>
-          <w:tr2bl w:val="nil"/>
-        </w:tcBorders>
-      </w:tcPr>
-    </w:tblStylePr>
-    <w:tblStylePr w:type="band1Horz">
-      <w:tblPr>
-        <w:tblStyle w:val="59"/>
-      </w:tblPr>
-      <w:tcPr>
-        <w:tcBorders>
-          <w:top w:val="nil"/>
-          <w:left w:val="single" w:color="000000" w:sz="6" w:space="0"/>
-          <w:bottom w:val="nil"/>
-          <w:right w:val="nil"/>
-          <w:insideH w:val="nil"/>
-          <w:insideV w:val="nil"/>
-          <w:tl2br w:val="nil"/>
-          <w:tr2bl w:val="nil"/>
-        </w:tcBorders>
-        <w:shd w:val="pct25" w:color="808000" w:fill="FFFFFF"/>
-      </w:tcPr>
-    </w:tblStylePr>
-    <w:tblStylePr w:type="neCell">
-      <w:rPr>
-        <w:b/>
-        <w:bCs/>
-      </w:rPr>
-      <w:tblPr>
-        <w:tblStyle w:val="59"/>
-      </w:tblPr>
-      <w:tcPr>
-        <w:tcBorders>
-          <w:top w:val="nil"/>
-          <w:left w:val="nil"/>
-          <w:bottom w:val="nil"/>
-          <w:right w:val="nil"/>
-          <w:insideH w:val="nil"/>
-          <w:insideV w:val="nil"/>
-          <w:tl2br w:val="nil"/>
-          <w:tr2bl w:val="nil"/>
-        </w:tcBorders>
-      </w:tcPr>
-    </w:tblStylePr>
-    <w:tblStylePr w:type="swCell">
-      <w:rPr>
-        <w:b/>
-        <w:bCs/>
-      </w:rPr>
-      <w:tblPr>
-        <w:tblStyle w:val="59"/>
-      </w:tblPr>
-      <w:tcPr>
-        <w:tcBorders>
-          <w:top w:val="nil"/>
-          <w:left w:val="nil"/>
-          <w:bottom w:val="nil"/>
-          <w:right w:val="nil"/>
-          <w:insideH w:val="nil"/>
-          <w:insideV w:val="nil"/>
-          <w:tl2br w:val="nil"/>
-          <w:tr2bl w:val="nil"/>
-        </w:tcBorders>
-      </w:tcPr>
-    </w:tblStylePr>
-  </w:style>
-  <w:style w:type="table" w:styleId="74">
-    <w:name w:val="Table Subtle 2"/>
-    <w:basedOn w:val="59"/>
-    <w:semiHidden/>
-    <w:uiPriority w:val="0"/>
-    <w:pPr>
-      <w:widowControl w:val="0"/>
-      <w:jc w:val="both"/>
-    </w:pPr>
-    <w:tblPr>
-      <w:tblStyle w:val="59"/>
       <w:tblBorders>
         <w:left w:val="single" w:color="000000" w:sz="6" w:space="0"/>
         <w:right w:val="single" w:color="000000" w:sz="6" w:space="0"/>
       </w:tblBorders>
     </w:tblPr>
     <w:tblStylePr w:type="firstRow">
-      <w:tblPr>
-        <w:tblStyle w:val="59"/>
-      </w:tblPr>
+      <w:tblPr/>
       <w:tcPr>
         <w:tcBorders>
           <w:top w:val="nil"/>
@@ -9363,9 +9153,7 @@
       </w:tcPr>
     </w:tblStylePr>
     <w:tblStylePr w:type="lastRow">
-      <w:tblPr>
-        <w:tblStyle w:val="59"/>
-      </w:tblPr>
+      <w:tblPr/>
       <w:tcPr>
         <w:tcBorders>
           <w:top w:val="single" w:color="000000" w:sz="12" w:space="0"/>
@@ -9380,9 +9168,7 @@
       </w:tcPr>
     </w:tblStylePr>
     <w:tblStylePr w:type="firstCol">
-      <w:tblPr>
-        <w:tblStyle w:val="59"/>
-      </w:tblPr>
+      <w:tblPr/>
       <w:tcPr>
         <w:tcBorders>
           <w:top w:val="nil"/>
@@ -9398,9 +9184,7 @@
       </w:tcPr>
     </w:tblStylePr>
     <w:tblStylePr w:type="lastCol">
-      <w:tblPr>
-        <w:tblStyle w:val="59"/>
-      </w:tblPr>
+      <w:tblPr/>
       <w:tcPr>
         <w:tcBorders>
           <w:top w:val="nil"/>
@@ -9420,9 +9204,7 @@
         <w:b/>
         <w:bCs/>
       </w:rPr>
-      <w:tblPr>
-        <w:tblStyle w:val="59"/>
-      </w:tblPr>
+      <w:tblPr/>
       <w:tcPr>
         <w:tcBorders>
           <w:top w:val="nil"/>
@@ -9441,9 +9223,7 @@
         <w:b/>
         <w:bCs/>
       </w:rPr>
-      <w:tblPr>
-        <w:tblStyle w:val="59"/>
-      </w:tblPr>
+      <w:tblPr/>
       <w:tcPr>
         <w:tcBorders>
           <w:top w:val="nil"/>
@@ -9460,6 +9240,361 @@
   </w:style>
   <w:style w:type="table" w:styleId="75">
     <w:name w:val="Table 3D effects 1"/>
+    <w:basedOn w:val="59"/>
+    <w:semiHidden/>
+    <w:uiPriority w:val="0"/>
+    <w:pPr>
+      <w:widowControl w:val="0"/>
+      <w:jc w:val="both"/>
+    </w:pPr>
+    <w:tblPr/>
+    <w:tcPr>
+      <w:shd w:val="solid" w:color="C0C0C0" w:fill="FFFFFF"/>
+    </w:tcPr>
+    <w:tblStylePr w:type="firstRow">
+      <w:rPr>
+        <w:b/>
+        <w:bCs/>
+        <w:color w:val="800080"/>
+      </w:rPr>
+      <w:tblPr/>
+      <w:tcPr>
+        <w:tcBorders>
+          <w:top w:val="nil"/>
+          <w:left w:val="single" w:color="808080" w:sz="6" w:space="0"/>
+          <w:bottom w:val="nil"/>
+          <w:right w:val="nil"/>
+          <w:insideH w:val="nil"/>
+          <w:insideV w:val="nil"/>
+          <w:tl2br w:val="nil"/>
+          <w:tr2bl w:val="nil"/>
+        </w:tcBorders>
+      </w:tcPr>
+    </w:tblStylePr>
+    <w:tblStylePr w:type="lastRow">
+      <w:tblPr/>
+      <w:tcPr>
+        <w:tcBorders>
+          <w:top w:val="single" w:color="FFFFFF" w:sz="6" w:space="0"/>
+          <w:left w:val="nil"/>
+          <w:bottom w:val="nil"/>
+          <w:right w:val="nil"/>
+          <w:insideH w:val="nil"/>
+          <w:insideV w:val="nil"/>
+          <w:tl2br w:val="nil"/>
+          <w:tr2bl w:val="nil"/>
+        </w:tcBorders>
+      </w:tcPr>
+    </w:tblStylePr>
+    <w:tblStylePr w:type="firstCol">
+      <w:rPr>
+        <w:b/>
+        <w:bCs/>
+      </w:rPr>
+      <w:tblPr/>
+      <w:tcPr>
+        <w:tcBorders>
+          <w:top w:val="nil"/>
+          <w:left w:val="nil"/>
+          <w:bottom w:val="nil"/>
+          <w:right w:val="single" w:color="808080" w:sz="6" w:space="0"/>
+          <w:insideH w:val="nil"/>
+          <w:insideV w:val="nil"/>
+          <w:tl2br w:val="nil"/>
+          <w:tr2bl w:val="nil"/>
+        </w:tcBorders>
+      </w:tcPr>
+    </w:tblStylePr>
+    <w:tblStylePr w:type="lastCol">
+      <w:tblPr/>
+      <w:tcPr>
+        <w:tcBorders>
+          <w:top w:val="nil"/>
+          <w:left w:val="nil"/>
+          <w:bottom w:val="single" w:color="FFFFFF" w:sz="6" w:space="0"/>
+          <w:right w:val="nil"/>
+          <w:insideH w:val="nil"/>
+          <w:insideV w:val="nil"/>
+          <w:tl2br w:val="nil"/>
+          <w:tr2bl w:val="nil"/>
+        </w:tcBorders>
+      </w:tcPr>
+    </w:tblStylePr>
+    <w:tblStylePr w:type="neCell">
+      <w:tblPr/>
+      <w:tcPr>
+        <w:tcBorders>
+          <w:top w:val="nil"/>
+          <w:left w:val="nil"/>
+          <w:bottom w:val="nil"/>
+          <w:right w:val="nil"/>
+          <w:insideH w:val="nil"/>
+          <w:insideV w:val="nil"/>
+          <w:tl2br w:val="nil"/>
+          <w:tr2bl w:val="nil"/>
+        </w:tcBorders>
+      </w:tcPr>
+    </w:tblStylePr>
+    <w:tblStylePr w:type="nwCell">
+      <w:tblPr/>
+      <w:tcPr>
+        <w:tcBorders>
+          <w:top w:val="nil"/>
+          <w:left w:val="nil"/>
+          <w:bottom w:val="nil"/>
+          <w:right w:val="nil"/>
+          <w:insideH w:val="nil"/>
+          <w:insideV w:val="nil"/>
+          <w:tl2br w:val="nil"/>
+          <w:tr2bl w:val="nil"/>
+        </w:tcBorders>
+      </w:tcPr>
+    </w:tblStylePr>
+    <w:tblStylePr w:type="seCell">
+      <w:tblPr/>
+      <w:tcPr>
+        <w:tcBorders>
+          <w:top w:val="nil"/>
+          <w:left w:val="nil"/>
+          <w:bottom w:val="nil"/>
+          <w:right w:val="nil"/>
+          <w:insideH w:val="nil"/>
+          <w:insideV w:val="nil"/>
+          <w:tl2br w:val="nil"/>
+          <w:tr2bl w:val="nil"/>
+        </w:tcBorders>
+      </w:tcPr>
+    </w:tblStylePr>
+    <w:tblStylePr w:type="swCell">
+      <w:rPr>
+        <w:color w:val="000080"/>
+      </w:rPr>
+      <w:tblPr/>
+      <w:tcPr>
+        <w:tcBorders>
+          <w:top w:val="nil"/>
+          <w:left w:val="nil"/>
+          <w:bottom w:val="nil"/>
+          <w:right w:val="nil"/>
+          <w:insideH w:val="nil"/>
+          <w:insideV w:val="nil"/>
+          <w:tl2br w:val="nil"/>
+          <w:tr2bl w:val="nil"/>
+        </w:tcBorders>
+      </w:tcPr>
+    </w:tblStylePr>
+  </w:style>
+  <w:style w:type="table" w:styleId="76">
+    <w:name w:val="Table 3D effects 2"/>
+    <w:basedOn w:val="59"/>
+    <w:semiHidden/>
+    <w:uiPriority w:val="0"/>
+    <w:pPr>
+      <w:widowControl w:val="0"/>
+      <w:jc w:val="both"/>
+    </w:pPr>
+    <w:tblPr/>
+    <w:tcPr>
+      <w:shd w:val="solid" w:color="C0C0C0" w:fill="FFFFFF"/>
+    </w:tcPr>
+    <w:tblStylePr w:type="firstRow">
+      <w:rPr>
+        <w:b/>
+        <w:bCs/>
+      </w:rPr>
+      <w:tblPr/>
+      <w:tcPr>
+        <w:tcBorders>
+          <w:top w:val="nil"/>
+          <w:left w:val="nil"/>
+          <w:bottom w:val="nil"/>
+          <w:right w:val="nil"/>
+          <w:insideH w:val="nil"/>
+          <w:insideV w:val="nil"/>
+          <w:tl2br w:val="nil"/>
+          <w:tr2bl w:val="nil"/>
+        </w:tcBorders>
+      </w:tcPr>
+    </w:tblStylePr>
+    <w:tblStylePr w:type="firstCol">
+      <w:tblPr/>
+      <w:tcPr>
+        <w:tcBorders>
+          <w:top w:val="nil"/>
+          <w:left w:val="nil"/>
+          <w:bottom w:val="nil"/>
+          <w:right w:val="single" w:color="808080" w:sz="6" w:space="0"/>
+          <w:insideH w:val="nil"/>
+          <w:insideV w:val="nil"/>
+          <w:tl2br w:val="nil"/>
+          <w:tr2bl w:val="nil"/>
+        </w:tcBorders>
+      </w:tcPr>
+    </w:tblStylePr>
+    <w:tblStylePr w:type="lastCol">
+      <w:tblPr/>
+      <w:tcPr>
+        <w:tcBorders>
+          <w:top w:val="nil"/>
+          <w:left w:val="nil"/>
+          <w:bottom w:val="nil"/>
+          <w:right w:val="single" w:color="FFFFFF" w:sz="6" w:space="0"/>
+          <w:insideH w:val="nil"/>
+          <w:insideV w:val="nil"/>
+          <w:tl2br w:val="nil"/>
+          <w:tr2bl w:val="nil"/>
+        </w:tcBorders>
+      </w:tcPr>
+    </w:tblStylePr>
+    <w:tblStylePr w:type="band1Horz">
+      <w:tblPr/>
+      <w:tcPr>
+        <w:tcBorders>
+          <w:top w:val="single" w:color="808080" w:sz="6" w:space="0"/>
+          <w:left w:val="single" w:color="FFFFFF" w:sz="6" w:space="0"/>
+          <w:bottom w:val="nil"/>
+          <w:right w:val="nil"/>
+          <w:insideH w:val="nil"/>
+          <w:insideV w:val="nil"/>
+          <w:tl2br w:val="nil"/>
+          <w:tr2bl w:val="nil"/>
+        </w:tcBorders>
+      </w:tcPr>
+    </w:tblStylePr>
+    <w:tblStylePr w:type="swCell">
+      <w:rPr>
+        <w:b/>
+        <w:bCs/>
+      </w:rPr>
+      <w:tblPr/>
+      <w:tcPr>
+        <w:tcBorders>
+          <w:top w:val="nil"/>
+          <w:left w:val="nil"/>
+          <w:bottom w:val="nil"/>
+          <w:right w:val="nil"/>
+          <w:insideH w:val="nil"/>
+          <w:insideV w:val="nil"/>
+          <w:tl2br w:val="nil"/>
+          <w:tr2bl w:val="nil"/>
+        </w:tcBorders>
+      </w:tcPr>
+    </w:tblStylePr>
+  </w:style>
+  <w:style w:type="table" w:styleId="77">
+    <w:name w:val="Table 3D effects 3"/>
+    <w:basedOn w:val="59"/>
+    <w:semiHidden/>
+    <w:uiPriority w:val="0"/>
+    <w:pPr>
+      <w:widowControl w:val="0"/>
+      <w:jc w:val="both"/>
+    </w:pPr>
+    <w:tblPr/>
+    <w:tblStylePr w:type="firstRow">
+      <w:rPr>
+        <w:b/>
+        <w:bCs/>
+      </w:rPr>
+      <w:tblPr/>
+      <w:tcPr>
+        <w:tcBorders>
+          <w:top w:val="nil"/>
+          <w:left w:val="nil"/>
+          <w:bottom w:val="nil"/>
+          <w:right w:val="nil"/>
+          <w:insideH w:val="nil"/>
+          <w:insideV w:val="nil"/>
+          <w:tl2br w:val="nil"/>
+          <w:tr2bl w:val="nil"/>
+        </w:tcBorders>
+      </w:tcPr>
+    </w:tblStylePr>
+    <w:tblStylePr w:type="firstCol">
+      <w:tblPr/>
+      <w:tcPr>
+        <w:tcBorders>
+          <w:top w:val="nil"/>
+          <w:left w:val="nil"/>
+          <w:bottom w:val="nil"/>
+          <w:right w:val="single" w:color="808080" w:sz="6" w:space="0"/>
+          <w:insideH w:val="nil"/>
+          <w:insideV w:val="nil"/>
+          <w:tl2br w:val="nil"/>
+          <w:tr2bl w:val="nil"/>
+        </w:tcBorders>
+      </w:tcPr>
+    </w:tblStylePr>
+    <w:tblStylePr w:type="lastCol">
+      <w:tblPr/>
+      <w:tcPr>
+        <w:tcBorders>
+          <w:top w:val="nil"/>
+          <w:left w:val="nil"/>
+          <w:bottom w:val="nil"/>
+          <w:right w:val="single" w:color="FFFFFF" w:sz="6" w:space="0"/>
+          <w:insideH w:val="nil"/>
+          <w:insideV w:val="nil"/>
+          <w:tl2br w:val="nil"/>
+          <w:tr2bl w:val="nil"/>
+        </w:tcBorders>
+      </w:tcPr>
+    </w:tblStylePr>
+    <w:tblStylePr w:type="band1Vert">
+      <w:rPr>
+        <w:color w:val="auto"/>
+      </w:rPr>
+      <w:tblPr/>
+      <w:tcPr>
+        <w:shd w:val="solid" w:color="C0C0C0" w:fill="FFFFFF"/>
+      </w:tcPr>
+    </w:tblStylePr>
+    <w:tblStylePr w:type="band2Vert">
+      <w:rPr>
+        <w:color w:val="auto"/>
+      </w:rPr>
+      <w:tblPr/>
+      <w:tcPr>
+        <w:shd w:val="pct50" w:color="C0C0C0" w:fill="FFFFFF"/>
+      </w:tcPr>
+    </w:tblStylePr>
+    <w:tblStylePr w:type="band1Horz">
+      <w:tblPr/>
+      <w:tcPr>
+        <w:tcBorders>
+          <w:top w:val="single" w:color="808080" w:sz="6" w:space="0"/>
+          <w:left w:val="single" w:color="FFFFFF" w:sz="6" w:space="0"/>
+          <w:bottom w:val="nil"/>
+          <w:right w:val="nil"/>
+          <w:insideH w:val="nil"/>
+          <w:insideV w:val="nil"/>
+          <w:tl2br w:val="nil"/>
+          <w:tr2bl w:val="nil"/>
+        </w:tcBorders>
+      </w:tcPr>
+    </w:tblStylePr>
+    <w:tblStylePr w:type="swCell">
+      <w:rPr>
+        <w:b/>
+        <w:bCs/>
+      </w:rPr>
+      <w:tblPr/>
+      <w:tcPr>
+        <w:tcBorders>
+          <w:top w:val="nil"/>
+          <w:left w:val="nil"/>
+          <w:bottom w:val="nil"/>
+          <w:right w:val="nil"/>
+          <w:insideH w:val="nil"/>
+          <w:insideV w:val="nil"/>
+          <w:tl2br w:val="nil"/>
+          <w:tr2bl w:val="nil"/>
+        </w:tcBorders>
+      </w:tcPr>
+    </w:tblStylePr>
+  </w:style>
+  <w:style w:type="table" w:styleId="78">
+    <w:name w:val="Table List 1"/>
     <w:basedOn w:val="59"/>
     <w:semiHidden/>
     <w:uiPriority w:val="0"/>
@@ -9468,412 +9603,6 @@
       <w:jc w:val="both"/>
     </w:pPr>
     <w:tblPr>
-      <w:tblStyle w:val="59"/>
-    </w:tblPr>
-    <w:tcPr>
-      <w:shd w:val="solid" w:color="C0C0C0" w:fill="FFFFFF"/>
-    </w:tcPr>
-    <w:tblStylePr w:type="firstRow">
-      <w:rPr>
-        <w:b/>
-        <w:bCs/>
-        <w:color w:val="800080"/>
-      </w:rPr>
-      <w:tblPr>
-        <w:tblStyle w:val="59"/>
-      </w:tblPr>
-      <w:tcPr>
-        <w:tcBorders>
-          <w:top w:val="nil"/>
-          <w:left w:val="single" w:color="808080" w:sz="6" w:space="0"/>
-          <w:bottom w:val="nil"/>
-          <w:right w:val="nil"/>
-          <w:insideH w:val="nil"/>
-          <w:insideV w:val="nil"/>
-          <w:tl2br w:val="nil"/>
-          <w:tr2bl w:val="nil"/>
-        </w:tcBorders>
-      </w:tcPr>
-    </w:tblStylePr>
-    <w:tblStylePr w:type="lastRow">
-      <w:tblPr>
-        <w:tblStyle w:val="59"/>
-      </w:tblPr>
-      <w:tcPr>
-        <w:tcBorders>
-          <w:top w:val="single" w:color="FFFFFF" w:sz="6" w:space="0"/>
-          <w:left w:val="nil"/>
-          <w:bottom w:val="nil"/>
-          <w:right w:val="nil"/>
-          <w:insideH w:val="nil"/>
-          <w:insideV w:val="nil"/>
-          <w:tl2br w:val="nil"/>
-          <w:tr2bl w:val="nil"/>
-        </w:tcBorders>
-      </w:tcPr>
-    </w:tblStylePr>
-    <w:tblStylePr w:type="firstCol">
-      <w:rPr>
-        <w:b/>
-        <w:bCs/>
-      </w:rPr>
-      <w:tblPr>
-        <w:tblStyle w:val="59"/>
-      </w:tblPr>
-      <w:tcPr>
-        <w:tcBorders>
-          <w:top w:val="nil"/>
-          <w:left w:val="nil"/>
-          <w:bottom w:val="nil"/>
-          <w:right w:val="single" w:color="808080" w:sz="6" w:space="0"/>
-          <w:insideH w:val="nil"/>
-          <w:insideV w:val="nil"/>
-          <w:tl2br w:val="nil"/>
-          <w:tr2bl w:val="nil"/>
-        </w:tcBorders>
-      </w:tcPr>
-    </w:tblStylePr>
-    <w:tblStylePr w:type="lastCol">
-      <w:tblPr>
-        <w:tblStyle w:val="59"/>
-      </w:tblPr>
-      <w:tcPr>
-        <w:tcBorders>
-          <w:top w:val="nil"/>
-          <w:left w:val="nil"/>
-          <w:bottom w:val="single" w:color="FFFFFF" w:sz="6" w:space="0"/>
-          <w:right w:val="nil"/>
-          <w:insideH w:val="nil"/>
-          <w:insideV w:val="nil"/>
-          <w:tl2br w:val="nil"/>
-          <w:tr2bl w:val="nil"/>
-        </w:tcBorders>
-      </w:tcPr>
-    </w:tblStylePr>
-    <w:tblStylePr w:type="neCell">
-      <w:tblPr>
-        <w:tblStyle w:val="59"/>
-      </w:tblPr>
-      <w:tcPr>
-        <w:tcBorders>
-          <w:top w:val="nil"/>
-          <w:left w:val="nil"/>
-          <w:bottom w:val="nil"/>
-          <w:right w:val="nil"/>
-          <w:insideH w:val="nil"/>
-          <w:insideV w:val="nil"/>
-          <w:tl2br w:val="nil"/>
-          <w:tr2bl w:val="nil"/>
-        </w:tcBorders>
-      </w:tcPr>
-    </w:tblStylePr>
-    <w:tblStylePr w:type="nwCell">
-      <w:tblPr>
-        <w:tblStyle w:val="59"/>
-      </w:tblPr>
-      <w:tcPr>
-        <w:tcBorders>
-          <w:top w:val="nil"/>
-          <w:left w:val="nil"/>
-          <w:bottom w:val="nil"/>
-          <w:right w:val="nil"/>
-          <w:insideH w:val="nil"/>
-          <w:insideV w:val="nil"/>
-          <w:tl2br w:val="nil"/>
-          <w:tr2bl w:val="nil"/>
-        </w:tcBorders>
-      </w:tcPr>
-    </w:tblStylePr>
-    <w:tblStylePr w:type="seCell">
-      <w:tblPr>
-        <w:tblStyle w:val="59"/>
-      </w:tblPr>
-      <w:tcPr>
-        <w:tcBorders>
-          <w:top w:val="nil"/>
-          <w:left w:val="nil"/>
-          <w:bottom w:val="nil"/>
-          <w:right w:val="nil"/>
-          <w:insideH w:val="nil"/>
-          <w:insideV w:val="nil"/>
-          <w:tl2br w:val="nil"/>
-          <w:tr2bl w:val="nil"/>
-        </w:tcBorders>
-      </w:tcPr>
-    </w:tblStylePr>
-    <w:tblStylePr w:type="swCell">
-      <w:rPr>
-        <w:color w:val="000080"/>
-      </w:rPr>
-      <w:tblPr>
-        <w:tblStyle w:val="59"/>
-      </w:tblPr>
-      <w:tcPr>
-        <w:tcBorders>
-          <w:top w:val="nil"/>
-          <w:left w:val="nil"/>
-          <w:bottom w:val="nil"/>
-          <w:right w:val="nil"/>
-          <w:insideH w:val="nil"/>
-          <w:insideV w:val="nil"/>
-          <w:tl2br w:val="nil"/>
-          <w:tr2bl w:val="nil"/>
-        </w:tcBorders>
-      </w:tcPr>
-    </w:tblStylePr>
-  </w:style>
-  <w:style w:type="table" w:styleId="76">
-    <w:name w:val="Table 3D effects 2"/>
-    <w:basedOn w:val="59"/>
-    <w:semiHidden/>
-    <w:uiPriority w:val="0"/>
-    <w:pPr>
-      <w:widowControl w:val="0"/>
-      <w:jc w:val="both"/>
-    </w:pPr>
-    <w:tblPr>
-      <w:tblStyle w:val="59"/>
-      <w:tblStyleRowBandSize w:val="1"/>
-    </w:tblPr>
-    <w:tcPr>
-      <w:shd w:val="solid" w:color="C0C0C0" w:fill="FFFFFF"/>
-    </w:tcPr>
-    <w:tblStylePr w:type="firstRow">
-      <w:rPr>
-        <w:b/>
-        <w:bCs/>
-      </w:rPr>
-      <w:tblPr>
-        <w:tblStyle w:val="59"/>
-      </w:tblPr>
-      <w:tcPr>
-        <w:tcBorders>
-          <w:top w:val="nil"/>
-          <w:left w:val="nil"/>
-          <w:bottom w:val="nil"/>
-          <w:right w:val="nil"/>
-          <w:insideH w:val="nil"/>
-          <w:insideV w:val="nil"/>
-          <w:tl2br w:val="nil"/>
-          <w:tr2bl w:val="nil"/>
-        </w:tcBorders>
-      </w:tcPr>
-    </w:tblStylePr>
-    <w:tblStylePr w:type="firstCol">
-      <w:tblPr>
-        <w:tblStyle w:val="59"/>
-      </w:tblPr>
-      <w:tcPr>
-        <w:tcBorders>
-          <w:top w:val="nil"/>
-          <w:left w:val="nil"/>
-          <w:bottom w:val="nil"/>
-          <w:right w:val="single" w:color="808080" w:sz="6" w:space="0"/>
-          <w:insideH w:val="nil"/>
-          <w:insideV w:val="nil"/>
-          <w:tl2br w:val="nil"/>
-          <w:tr2bl w:val="nil"/>
-        </w:tcBorders>
-      </w:tcPr>
-    </w:tblStylePr>
-    <w:tblStylePr w:type="lastCol">
-      <w:tblPr>
-        <w:tblStyle w:val="59"/>
-      </w:tblPr>
-      <w:tcPr>
-        <w:tcBorders>
-          <w:top w:val="nil"/>
-          <w:left w:val="nil"/>
-          <w:bottom w:val="nil"/>
-          <w:right w:val="single" w:color="FFFFFF" w:sz="6" w:space="0"/>
-          <w:insideH w:val="nil"/>
-          <w:insideV w:val="nil"/>
-          <w:tl2br w:val="nil"/>
-          <w:tr2bl w:val="nil"/>
-        </w:tcBorders>
-      </w:tcPr>
-    </w:tblStylePr>
-    <w:tblStylePr w:type="band1Horz">
-      <w:tblPr>
-        <w:tblStyle w:val="59"/>
-      </w:tblPr>
-      <w:tcPr>
-        <w:tcBorders>
-          <w:top w:val="single" w:color="808080" w:sz="6" w:space="0"/>
-          <w:left w:val="single" w:color="FFFFFF" w:sz="6" w:space="0"/>
-          <w:bottom w:val="nil"/>
-          <w:right w:val="nil"/>
-          <w:insideH w:val="nil"/>
-          <w:insideV w:val="nil"/>
-          <w:tl2br w:val="nil"/>
-          <w:tr2bl w:val="nil"/>
-        </w:tcBorders>
-      </w:tcPr>
-    </w:tblStylePr>
-    <w:tblStylePr w:type="swCell">
-      <w:rPr>
-        <w:b/>
-        <w:bCs/>
-      </w:rPr>
-      <w:tblPr>
-        <w:tblStyle w:val="59"/>
-      </w:tblPr>
-      <w:tcPr>
-        <w:tcBorders>
-          <w:top w:val="nil"/>
-          <w:left w:val="nil"/>
-          <w:bottom w:val="nil"/>
-          <w:right w:val="nil"/>
-          <w:insideH w:val="nil"/>
-          <w:insideV w:val="nil"/>
-          <w:tl2br w:val="nil"/>
-          <w:tr2bl w:val="nil"/>
-        </w:tcBorders>
-      </w:tcPr>
-    </w:tblStylePr>
-  </w:style>
-  <w:style w:type="table" w:styleId="77">
-    <w:name w:val="Table 3D effects 3"/>
-    <w:basedOn w:val="59"/>
-    <w:semiHidden/>
-    <w:uiPriority w:val="0"/>
-    <w:pPr>
-      <w:widowControl w:val="0"/>
-      <w:jc w:val="both"/>
-    </w:pPr>
-    <w:tblPr>
-      <w:tblStyle w:val="59"/>
-      <w:tblStyleRowBandSize w:val="1"/>
-      <w:tblStyleColBandSize w:val="1"/>
-    </w:tblPr>
-    <w:tblStylePr w:type="firstRow">
-      <w:rPr>
-        <w:b/>
-        <w:bCs/>
-      </w:rPr>
-      <w:tblPr>
-        <w:tblStyle w:val="59"/>
-      </w:tblPr>
-      <w:tcPr>
-        <w:tcBorders>
-          <w:top w:val="nil"/>
-          <w:left w:val="nil"/>
-          <w:bottom w:val="nil"/>
-          <w:right w:val="nil"/>
-          <w:insideH w:val="nil"/>
-          <w:insideV w:val="nil"/>
-          <w:tl2br w:val="nil"/>
-          <w:tr2bl w:val="nil"/>
-        </w:tcBorders>
-      </w:tcPr>
-    </w:tblStylePr>
-    <w:tblStylePr w:type="firstCol">
-      <w:tblPr>
-        <w:tblStyle w:val="59"/>
-      </w:tblPr>
-      <w:tcPr>
-        <w:tcBorders>
-          <w:top w:val="nil"/>
-          <w:left w:val="nil"/>
-          <w:bottom w:val="nil"/>
-          <w:right w:val="single" w:color="808080" w:sz="6" w:space="0"/>
-          <w:insideH w:val="nil"/>
-          <w:insideV w:val="nil"/>
-          <w:tl2br w:val="nil"/>
-          <w:tr2bl w:val="nil"/>
-        </w:tcBorders>
-      </w:tcPr>
-    </w:tblStylePr>
-    <w:tblStylePr w:type="lastCol">
-      <w:tblPr>
-        <w:tblStyle w:val="59"/>
-      </w:tblPr>
-      <w:tcPr>
-        <w:tcBorders>
-          <w:top w:val="nil"/>
-          <w:left w:val="nil"/>
-          <w:bottom w:val="nil"/>
-          <w:right w:val="single" w:color="FFFFFF" w:sz="6" w:space="0"/>
-          <w:insideH w:val="nil"/>
-          <w:insideV w:val="nil"/>
-          <w:tl2br w:val="nil"/>
-          <w:tr2bl w:val="nil"/>
-        </w:tcBorders>
-      </w:tcPr>
-    </w:tblStylePr>
-    <w:tblStylePr w:type="band1Vert">
-      <w:rPr>
-        <w:color w:val="auto"/>
-      </w:rPr>
-      <w:tblPr>
-        <w:tblStyle w:val="59"/>
-      </w:tblPr>
-      <w:tcPr>
-        <w:shd w:val="solid" w:color="C0C0C0" w:fill="FFFFFF"/>
-      </w:tcPr>
-    </w:tblStylePr>
-    <w:tblStylePr w:type="band2Vert">
-      <w:rPr>
-        <w:color w:val="auto"/>
-      </w:rPr>
-      <w:tblPr>
-        <w:tblStyle w:val="59"/>
-      </w:tblPr>
-      <w:tcPr>
-        <w:shd w:val="pct50" w:color="C0C0C0" w:fill="FFFFFF"/>
-      </w:tcPr>
-    </w:tblStylePr>
-    <w:tblStylePr w:type="band1Horz">
-      <w:tblPr>
-        <w:tblStyle w:val="59"/>
-      </w:tblPr>
-      <w:tcPr>
-        <w:tcBorders>
-          <w:top w:val="single" w:color="808080" w:sz="6" w:space="0"/>
-          <w:left w:val="single" w:color="FFFFFF" w:sz="6" w:space="0"/>
-          <w:bottom w:val="nil"/>
-          <w:right w:val="nil"/>
-          <w:insideH w:val="nil"/>
-          <w:insideV w:val="nil"/>
-          <w:tl2br w:val="nil"/>
-          <w:tr2bl w:val="nil"/>
-        </w:tcBorders>
-      </w:tcPr>
-    </w:tblStylePr>
-    <w:tblStylePr w:type="swCell">
-      <w:rPr>
-        <w:b/>
-        <w:bCs/>
-      </w:rPr>
-      <w:tblPr>
-        <w:tblStyle w:val="59"/>
-      </w:tblPr>
-      <w:tcPr>
-        <w:tcBorders>
-          <w:top w:val="nil"/>
-          <w:left w:val="nil"/>
-          <w:bottom w:val="nil"/>
-          <w:right w:val="nil"/>
-          <w:insideH w:val="nil"/>
-          <w:insideV w:val="nil"/>
-          <w:tl2br w:val="nil"/>
-          <w:tr2bl w:val="nil"/>
-        </w:tcBorders>
-      </w:tcPr>
-    </w:tblStylePr>
-  </w:style>
-  <w:style w:type="table" w:styleId="78">
-    <w:name w:val="Table List 1"/>
-    <w:basedOn w:val="59"/>
-    <w:semiHidden/>
-    <w:uiPriority w:val="0"/>
-    <w:pPr>
-      <w:widowControl w:val="0"/>
-      <w:jc w:val="both"/>
-    </w:pPr>
-    <w:tblPr>
-      <w:tblStyle w:val="59"/>
-      <w:tblStyleRowBandSize w:val="1"/>
       <w:tblBorders>
         <w:top w:val="single" w:color="008080" w:sz="12" w:space="0"/>
         <w:left w:val="single" w:color="008080" w:sz="6" w:space="0"/>
@@ -9889,9 +9618,7 @@
         <w:iCs/>
         <w:color w:val="800000"/>
       </w:rPr>
-      <w:tblPr>
-        <w:tblStyle w:val="59"/>
-      </w:tblPr>
+      <w:tblPr/>
       <w:tcPr>
         <w:tcBorders>
           <w:top w:val="nil"/>
@@ -9907,9 +9634,7 @@
       </w:tcPr>
     </w:tblStylePr>
     <w:tblStylePr w:type="lastRow">
-      <w:tblPr>
-        <w:tblStyle w:val="59"/>
-      </w:tblPr>
+      <w:tblPr/>
       <w:tcPr>
         <w:tcBorders>
           <w:top w:val="single" w:color="000000" w:sz="6" w:space="0"/>
@@ -9927,9 +9652,7 @@
       <w:rPr>
         <w:color w:val="auto"/>
       </w:rPr>
-      <w:tblPr>
-        <w:tblStyle w:val="59"/>
-      </w:tblPr>
+      <w:tblPr/>
       <w:tcPr>
         <w:tcBorders>
           <w:top w:val="nil"/>
@@ -9948,9 +9671,7 @@
       <w:rPr>
         <w:color w:val="auto"/>
       </w:rPr>
-      <w:tblPr>
-        <w:tblStyle w:val="59"/>
-      </w:tblPr>
+      <w:tblPr/>
       <w:tcPr>
         <w:tcBorders>
           <w:top w:val="nil"/>
@@ -9969,9 +9690,7 @@
         <w:b/>
         <w:bCs/>
       </w:rPr>
-      <w:tblPr>
-        <w:tblStyle w:val="59"/>
-      </w:tblPr>
+      <w:tblPr/>
       <w:tcPr>
         <w:tcBorders>
           <w:top w:val="nil"/>
@@ -9996,8 +9715,6 @@
       <w:jc w:val="both"/>
     </w:pPr>
     <w:tblPr>
-      <w:tblStyle w:val="59"/>
-      <w:tblStyleRowBandSize w:val="2"/>
       <w:tblBorders>
         <w:bottom w:val="single" w:color="808080" w:sz="12" w:space="0"/>
       </w:tblBorders>
@@ -10008,9 +9725,7 @@
         <w:bCs/>
         <w:color w:val="FFFFFF"/>
       </w:rPr>
-      <w:tblPr>
-        <w:tblStyle w:val="59"/>
-      </w:tblPr>
+      <w:tblPr/>
       <w:tcPr>
         <w:tcBorders>
           <w:top w:val="nil"/>
@@ -10026,9 +9741,7 @@
       </w:tcPr>
     </w:tblStylePr>
     <w:tblStylePr w:type="lastRow">
-      <w:tblPr>
-        <w:tblStyle w:val="59"/>
-      </w:tblPr>
+      <w:tblPr/>
       <w:tcPr>
         <w:tcBorders>
           <w:top w:val="single" w:color="000000" w:sz="6" w:space="0"/>
@@ -10046,9 +9759,7 @@
       <w:rPr>
         <w:color w:val="auto"/>
       </w:rPr>
-      <w:tblPr>
-        <w:tblStyle w:val="59"/>
-      </w:tblPr>
+      <w:tblPr/>
       <w:tcPr>
         <w:tcBorders>
           <w:top w:val="nil"/>
@@ -10067,9 +9778,7 @@
       <w:rPr>
         <w:color w:val="auto"/>
       </w:rPr>
-      <w:tblPr>
-        <w:tblStyle w:val="59"/>
-      </w:tblPr>
+      <w:tblPr/>
       <w:tcPr>
         <w:tcBorders>
           <w:top w:val="nil"/>
@@ -10088,9 +9797,7 @@
         <w:b/>
         <w:bCs/>
       </w:rPr>
-      <w:tblPr>
-        <w:tblStyle w:val="59"/>
-      </w:tblPr>
+      <w:tblPr/>
       <w:tcPr>
         <w:tcBorders>
           <w:top w:val="nil"/>
@@ -10115,7 +9822,6 @@
       <w:jc w:val="both"/>
     </w:pPr>
     <w:tblPr>
-      <w:tblStyle w:val="59"/>
       <w:tblBorders>
         <w:top w:val="single" w:color="000000" w:sz="12" w:space="0"/>
         <w:bottom w:val="single" w:color="000000" w:sz="12" w:space="0"/>
@@ -10131,9 +9837,7 @@
         <w:bCs/>
         <w:color w:val="000080"/>
       </w:rPr>
-      <w:tblPr>
-        <w:tblStyle w:val="59"/>
-      </w:tblPr>
+      <w:tblPr/>
       <w:tcPr>
         <w:tcBorders>
           <w:top w:val="nil"/>
@@ -10148,9 +9852,7 @@
       </w:tcPr>
     </w:tblStylePr>
     <w:tblStylePr w:type="lastRow">
-      <w:tblPr>
-        <w:tblStyle w:val="59"/>
-      </w:tblPr>
+      <w:tblPr/>
       <w:tcPr>
         <w:tcBorders>
           <w:top w:val="single" w:color="000000" w:sz="12" w:space="0"/>
@@ -10170,9 +9872,7 @@
         <w:iCs/>
         <w:color w:val="000080"/>
       </w:rPr>
-      <w:tblPr>
-        <w:tblStyle w:val="59"/>
-      </w:tblPr>
+      <w:tblPr/>
       <w:tcPr>
         <w:tcBorders>
           <w:top w:val="nil"/>
@@ -10197,7 +9897,6 @@
       <w:jc w:val="both"/>
     </w:pPr>
     <w:tblPr>
-      <w:tblStyle w:val="59"/>
       <w:tblBorders>
         <w:top w:val="single" w:color="000000" w:sz="12" w:space="0"/>
         <w:left w:val="single" w:color="000000" w:sz="12" w:space="0"/>
@@ -10215,9 +9914,7 @@
         <w:bCs/>
         <w:color w:val="FFFFFF"/>
       </w:rPr>
-      <w:tblPr>
-        <w:tblStyle w:val="59"/>
-      </w:tblPr>
+      <w:tblPr/>
       <w:tcPr>
         <w:tcBorders>
           <w:top w:val="nil"/>
@@ -10243,7 +9940,6 @@
       <w:jc w:val="both"/>
     </w:pPr>
     <w:tblPr>
-      <w:tblStyle w:val="59"/>
       <w:tblBorders>
         <w:top w:val="single" w:color="000000" w:sz="6" w:space="0"/>
         <w:left w:val="single" w:color="000000" w:sz="6" w:space="0"/>
@@ -10260,9 +9956,7 @@
         <w:b/>
         <w:bCs/>
       </w:rPr>
-      <w:tblPr>
-        <w:tblStyle w:val="59"/>
-      </w:tblPr>
+      <w:tblPr/>
       <w:tcPr>
         <w:tcBorders>
           <w:top w:val="nil"/>
@@ -10281,9 +9975,7 @@
         <w:b/>
         <w:bCs/>
       </w:rPr>
-      <w:tblPr>
-        <w:tblStyle w:val="59"/>
-      </w:tblPr>
+      <w:tblPr/>
       <w:tcPr>
         <w:tcBorders>
           <w:top w:val="nil"/>
@@ -10308,8 +10000,6 @@
       <w:jc w:val="both"/>
     </w:pPr>
     <w:tblPr>
-      <w:tblStyle w:val="59"/>
-      <w:tblStyleRowBandSize w:val="1"/>
       <w:tblBorders>
         <w:top w:val="single" w:color="000000" w:sz="6" w:space="0"/>
         <w:left w:val="single" w:color="000000" w:sz="6" w:space="0"/>
@@ -10325,9 +10015,7 @@
         <w:b/>
         <w:bCs/>
       </w:rPr>
-      <w:tblPr>
-        <w:tblStyle w:val="59"/>
-      </w:tblPr>
+      <w:tblPr/>
       <w:tcPr>
         <w:tcBorders>
           <w:top w:val="nil"/>
@@ -10346,9 +10034,7 @@
         <w:b/>
         <w:bCs/>
       </w:rPr>
-      <w:tblPr>
-        <w:tblStyle w:val="59"/>
-      </w:tblPr>
+      <w:tblPr/>
       <w:tcPr>
         <w:tcBorders>
           <w:top w:val="nil"/>
@@ -10363,9 +10049,7 @@
       </w:tcPr>
     </w:tblStylePr>
     <w:tblStylePr w:type="band1Horz">
-      <w:tblPr>
-        <w:tblStyle w:val="59"/>
-      </w:tblPr>
+      <w:tblPr/>
       <w:tcPr>
         <w:tcBorders>
           <w:top w:val="nil"/>
@@ -10381,9 +10065,7 @@
       </w:tcPr>
     </w:tblStylePr>
     <w:tblStylePr w:type="nwCell">
-      <w:tblPr>
-        <w:tblStyle w:val="59"/>
-      </w:tblPr>
+      <w:tblPr/>
       <w:tcPr>
         <w:tcBorders>
           <w:top w:val="nil"/>
@@ -10408,8 +10090,6 @@
       <w:jc w:val="both"/>
     </w:pPr>
     <w:tblPr>
-      <w:tblStyle w:val="59"/>
-      <w:tblStyleRowBandSize w:val="1"/>
       <w:tblBorders>
         <w:top w:val="single" w:color="008000" w:sz="12" w:space="0"/>
         <w:left w:val="single" w:color="008000" w:sz="6" w:space="0"/>
@@ -10423,9 +10103,7 @@
         <w:b/>
         <w:bCs/>
       </w:rPr>
-      <w:tblPr>
-        <w:tblStyle w:val="59"/>
-      </w:tblPr>
+      <w:tblPr/>
       <w:tcPr>
         <w:tcBorders>
           <w:top w:val="nil"/>
@@ -10445,9 +10123,7 @@
         <w:b/>
         <w:bCs/>
       </w:rPr>
-      <w:tblPr>
-        <w:tblStyle w:val="59"/>
-      </w:tblPr>
+      <w:tblPr/>
       <w:tcPr>
         <w:tcBorders>
           <w:top w:val="single" w:color="008000" w:sz="12" w:space="0"/>
@@ -10466,9 +10142,7 @@
         <w:b/>
         <w:bCs/>
       </w:rPr>
-      <w:tblPr>
-        <w:tblStyle w:val="59"/>
-      </w:tblPr>
+      <w:tblPr/>
       <w:tcPr>
         <w:tcBorders>
           <w:top w:val="nil"/>
@@ -10487,9 +10161,7 @@
         <w:b/>
         <w:bCs/>
       </w:rPr>
-      <w:tblPr>
-        <w:tblStyle w:val="59"/>
-      </w:tblPr>
+      <w:tblPr/>
       <w:tcPr>
         <w:tcBorders>
           <w:top w:val="nil"/>
@@ -10507,9 +10179,7 @@
       <w:rPr>
         <w:color w:val="auto"/>
       </w:rPr>
-      <w:tblPr>
-        <w:tblStyle w:val="59"/>
-      </w:tblPr>
+      <w:tblPr/>
       <w:tcPr>
         <w:tcBorders>
           <w:top w:val="nil"/>
@@ -10525,9 +10195,7 @@
       </w:tcPr>
     </w:tblStylePr>
     <w:tblStylePr w:type="band2Horz">
-      <w:tblPr>
-        <w:tblStyle w:val="59"/>
-      </w:tblPr>
+      <w:tblPr/>
       <w:tcPr>
         <w:tcBorders>
           <w:top w:val="nil"/>
@@ -10553,8 +10221,6 @@
       <w:jc w:val="both"/>
     </w:pPr>
     <w:tblPr>
-      <w:tblStyle w:val="59"/>
-      <w:tblStyleRowBandSize w:val="1"/>
       <w:tblBorders>
         <w:top w:val="single" w:color="000000" w:sz="6" w:space="0"/>
         <w:left w:val="single" w:color="000000" w:sz="6" w:space="0"/>
@@ -10570,9 +10236,7 @@
         <w:i/>
         <w:iCs/>
       </w:rPr>
-      <w:tblPr>
-        <w:tblStyle w:val="59"/>
-      </w:tblPr>
+      <w:tblPr/>
       <w:tcPr>
         <w:tcBorders>
           <w:top w:val="nil"/>
@@ -10592,9 +10256,7 @@
         <w:b/>
         <w:bCs/>
       </w:rPr>
-      <w:tblPr>
-        <w:tblStyle w:val="59"/>
-      </w:tblPr>
+      <w:tblPr/>
       <w:tcPr>
         <w:tcBorders>
           <w:top w:val="single" w:color="000000" w:sz="6" w:space="0"/>
@@ -10613,9 +10275,7 @@
         <w:b/>
         <w:bCs/>
       </w:rPr>
-      <w:tblPr>
-        <w:tblStyle w:val="59"/>
-      </w:tblPr>
+      <w:tblPr/>
       <w:tcPr>
         <w:tcBorders>
           <w:top w:val="nil"/>
@@ -10634,9 +10294,7 @@
         <w:b/>
         <w:bCs/>
       </w:rPr>
-      <w:tblPr>
-        <w:tblStyle w:val="59"/>
-      </w:tblPr>
+      <w:tblPr/>
       <w:tcPr>
         <w:tcBorders>
           <w:top w:val="nil"/>
@@ -10654,9 +10312,7 @@
       <w:rPr>
         <w:color w:val="auto"/>
       </w:rPr>
-      <w:tblPr>
-        <w:tblStyle w:val="59"/>
-      </w:tblPr>
+      <w:tblPr/>
       <w:tcPr>
         <w:tcBorders>
           <w:top w:val="nil"/>
@@ -10672,9 +10328,7 @@
       </w:tcPr>
     </w:tblStylePr>
     <w:tblStylePr w:type="band2Horz">
-      <w:tblPr>
-        <w:tblStyle w:val="59"/>
-      </w:tblPr>
+      <w:tblPr/>
       <w:tcPr>
         <w:tcBorders>
           <w:top w:val="nil"/>
@@ -10690,9 +10344,7 @@
       </w:tcPr>
     </w:tblStylePr>
     <w:tblStylePr w:type="nwCell">
-      <w:tblPr>
-        <w:tblStyle w:val="59"/>
-      </w:tblPr>
+      <w:tblPr/>
       <w:tcPr>
         <w:tcBorders>
           <w:top w:val="nil"/>
@@ -10717,8 +10369,6 @@
       <w:jc w:val="both"/>
     </w:pPr>
     <w:tblPr>
-      <w:tblStyle w:val="59"/>
-      <w:tblStyleRowBandSize w:val="1"/>
       <w:tblBorders>
         <w:insideH w:val="single" w:color="FFFFFF" w:sz="18" w:space="0"/>
         <w:insideV w:val="single" w:color="FFFFFF" w:sz="18" w:space="0"/>
@@ -10730,9 +10380,7 @@
         <w:bCs/>
         <w:color w:val="auto"/>
       </w:rPr>
-      <w:tblPr>
-        <w:tblStyle w:val="59"/>
-      </w:tblPr>
+      <w:tblPr/>
       <w:tcPr>
         <w:tcBorders>
           <w:top w:val="nil"/>
@@ -10751,9 +10399,7 @@
       <w:rPr>
         <w:color w:val="auto"/>
       </w:rPr>
-      <w:tblPr>
-        <w:tblStyle w:val="59"/>
-      </w:tblPr>
+      <w:tblPr/>
       <w:tcPr>
         <w:tcBorders>
           <w:top w:val="nil"/>
@@ -10772,9 +10418,7 @@
       <w:rPr>
         <w:color w:val="auto"/>
       </w:rPr>
-      <w:tblPr>
-        <w:tblStyle w:val="59"/>
-      </w:tblPr>
+      <w:tblPr/>
       <w:tcPr>
         <w:tcBorders>
           <w:top w:val="nil"/>
@@ -10804,8 +10448,6 @@
       <w:bCs/>
     </w:rPr>
     <w:tblPr>
-      <w:tblStyle w:val="59"/>
-      <w:tblStyleColBandSize w:val="1"/>
       <w:tblBorders>
         <w:top w:val="single" w:color="000000" w:sz="12" w:space="0"/>
         <w:left w:val="single" w:color="000000" w:sz="12" w:space="0"/>
@@ -10818,9 +10460,7 @@
         <w:b w:val="0"/>
         <w:bCs w:val="0"/>
       </w:rPr>
-      <w:tblPr>
-        <w:tblStyle w:val="59"/>
-      </w:tblPr>
+      <w:tblPr/>
       <w:tcPr>
         <w:tcBorders>
           <w:top w:val="nil"/>
@@ -10839,9 +10479,7 @@
         <w:b w:val="0"/>
         <w:bCs w:val="0"/>
       </w:rPr>
-      <w:tblPr>
-        <w:tblStyle w:val="59"/>
-      </w:tblPr>
+      <w:tblPr/>
       <w:tcPr>
         <w:tcBorders>
           <w:top w:val="nil"/>
@@ -10860,9 +10498,7 @@
         <w:b w:val="0"/>
         <w:bCs w:val="0"/>
       </w:rPr>
-      <w:tblPr>
-        <w:tblStyle w:val="59"/>
-      </w:tblPr>
+      <w:tblPr/>
       <w:tcPr>
         <w:tcBorders>
           <w:top w:val="nil"/>
@@ -10881,9 +10517,7 @@
         <w:b w:val="0"/>
         <w:bCs w:val="0"/>
       </w:rPr>
-      <w:tblPr>
-        <w:tblStyle w:val="59"/>
-      </w:tblPr>
+      <w:tblPr/>
       <w:tcPr>
         <w:tcBorders>
           <w:top w:val="nil"/>
@@ -10901,9 +10535,7 @@
       <w:rPr>
         <w:color w:val="auto"/>
       </w:rPr>
-      <w:tblPr>
-        <w:tblStyle w:val="59"/>
-      </w:tblPr>
+      <w:tblPr/>
       <w:tcPr>
         <w:shd w:val="pct25" w:color="000000" w:fill="FFFFFF"/>
       </w:tcPr>
@@ -10912,9 +10544,7 @@
       <w:rPr>
         <w:color w:val="auto"/>
       </w:rPr>
-      <w:tblPr>
-        <w:tblStyle w:val="59"/>
-      </w:tblPr>
+      <w:tblPr/>
       <w:tcPr>
         <w:shd w:val="pct25" w:color="FFFF00" w:fill="FFFFFF"/>
       </w:tcPr>
@@ -10924,9 +10554,7 @@
         <w:b/>
         <w:bCs/>
       </w:rPr>
-      <w:tblPr>
-        <w:tblStyle w:val="59"/>
-      </w:tblPr>
+      <w:tblPr/>
       <w:tcPr>
         <w:tcBorders>
           <w:top w:val="nil"/>
@@ -10945,9 +10573,7 @@
         <w:b/>
         <w:bCs/>
       </w:rPr>
-      <w:tblPr>
-        <w:tblStyle w:val="59"/>
-      </w:tblPr>
+      <w:tblPr/>
       <w:tcPr>
         <w:tcBorders>
           <w:top w:val="nil"/>
@@ -10964,6 +10590,154 @@
   </w:style>
   <w:style w:type="table" w:styleId="88">
     <w:name w:val="Table Columns 2"/>
+    <w:basedOn w:val="59"/>
+    <w:semiHidden/>
+    <w:uiPriority w:val="0"/>
+    <w:pPr>
+      <w:widowControl w:val="0"/>
+      <w:jc w:val="both"/>
+    </w:pPr>
+    <w:rPr>
+      <w:b/>
+      <w:bCs/>
+    </w:rPr>
+    <w:tblPr/>
+    <w:tblStylePr w:type="firstRow">
+      <w:rPr>
+        <w:color w:val="FFFFFF"/>
+      </w:rPr>
+      <w:tblPr/>
+      <w:tcPr>
+        <w:tcBorders>
+          <w:top w:val="nil"/>
+          <w:left w:val="nil"/>
+          <w:bottom w:val="nil"/>
+          <w:right w:val="nil"/>
+          <w:insideH w:val="nil"/>
+          <w:insideV w:val="nil"/>
+          <w:tl2br w:val="nil"/>
+          <w:tr2bl w:val="nil"/>
+        </w:tcBorders>
+        <w:shd w:val="solid" w:color="000080" w:fill="FFFFFF"/>
+      </w:tcPr>
+    </w:tblStylePr>
+    <w:tblStylePr w:type="lastRow">
+      <w:rPr>
+        <w:b w:val="0"/>
+        <w:bCs w:val="0"/>
+      </w:rPr>
+      <w:tblPr/>
+      <w:tcPr>
+        <w:tcBorders>
+          <w:top w:val="nil"/>
+          <w:left w:val="nil"/>
+          <w:bottom w:val="nil"/>
+          <w:right w:val="nil"/>
+          <w:insideH w:val="nil"/>
+          <w:insideV w:val="nil"/>
+          <w:tl2br w:val="nil"/>
+          <w:tr2bl w:val="nil"/>
+        </w:tcBorders>
+      </w:tcPr>
+    </w:tblStylePr>
+    <w:tblStylePr w:type="firstCol">
+      <w:rPr>
+        <w:b w:val="0"/>
+        <w:bCs w:val="0"/>
+        <w:color w:val="000000"/>
+      </w:rPr>
+      <w:tblPr/>
+      <w:tcPr>
+        <w:tcBorders>
+          <w:top w:val="nil"/>
+          <w:left w:val="nil"/>
+          <w:bottom w:val="nil"/>
+          <w:right w:val="nil"/>
+          <w:insideH w:val="nil"/>
+          <w:insideV w:val="nil"/>
+          <w:tl2br w:val="nil"/>
+          <w:tr2bl w:val="nil"/>
+        </w:tcBorders>
+      </w:tcPr>
+    </w:tblStylePr>
+    <w:tblStylePr w:type="lastCol">
+      <w:rPr>
+        <w:b w:val="0"/>
+        <w:bCs w:val="0"/>
+      </w:rPr>
+      <w:tblPr/>
+      <w:tcPr>
+        <w:tcBorders>
+          <w:top w:val="nil"/>
+          <w:left w:val="nil"/>
+          <w:bottom w:val="nil"/>
+          <w:right w:val="nil"/>
+          <w:insideH w:val="nil"/>
+          <w:insideV w:val="nil"/>
+          <w:tl2br w:val="nil"/>
+          <w:tr2bl w:val="nil"/>
+        </w:tcBorders>
+      </w:tcPr>
+    </w:tblStylePr>
+    <w:tblStylePr w:type="band1Vert">
+      <w:rPr>
+        <w:color w:val="auto"/>
+      </w:rPr>
+      <w:tblPr/>
+      <w:tcPr>
+        <w:shd w:val="pct30" w:color="000000" w:fill="FFFFFF"/>
+      </w:tcPr>
+    </w:tblStylePr>
+    <w:tblStylePr w:type="band2Vert">
+      <w:rPr>
+        <w:color w:val="auto"/>
+      </w:rPr>
+      <w:tblPr/>
+      <w:tcPr>
+        <w:shd w:val="pct25" w:color="00FF00" w:fill="FFFFFF"/>
+      </w:tcPr>
+    </w:tblStylePr>
+    <w:tblStylePr w:type="neCell">
+      <w:rPr>
+        <w:b/>
+        <w:bCs/>
+      </w:rPr>
+      <w:tblPr/>
+      <w:tcPr>
+        <w:tcBorders>
+          <w:top w:val="nil"/>
+          <w:left w:val="nil"/>
+          <w:bottom w:val="nil"/>
+          <w:right w:val="nil"/>
+          <w:insideH w:val="nil"/>
+          <w:insideV w:val="nil"/>
+          <w:tl2br w:val="nil"/>
+          <w:tr2bl w:val="nil"/>
+        </w:tcBorders>
+      </w:tcPr>
+    </w:tblStylePr>
+    <w:tblStylePr w:type="swCell">
+      <w:rPr>
+        <w:b/>
+        <w:bCs/>
+      </w:rPr>
+      <w:tblPr/>
+      <w:tcPr>
+        <w:tcBorders>
+          <w:top w:val="nil"/>
+          <w:left w:val="nil"/>
+          <w:bottom w:val="nil"/>
+          <w:right w:val="nil"/>
+          <w:insideH w:val="nil"/>
+          <w:insideV w:val="nil"/>
+          <w:tl2br w:val="nil"/>
+          <w:tr2bl w:val="nil"/>
+        </w:tcBorders>
+      </w:tcPr>
+    </w:tblStylePr>
+  </w:style>
+  <w:style w:type="table" w:styleId="89">
+    <w:name w:val="Table Columns 3"/>
     <w:basedOn w:val="59"/>
     <w:semiHidden/>
     <w:uiPriority w:val="0"/>
@@ -10976,175 +10750,6 @@
       <w:bCs/>
     </w:rPr>
     <w:tblPr>
-      <w:tblStyle w:val="59"/>
-      <w:tblStyleColBandSize w:val="1"/>
-    </w:tblPr>
-    <w:tblStylePr w:type="firstRow">
-      <w:rPr>
-        <w:color w:val="FFFFFF"/>
-      </w:rPr>
-      <w:tblPr>
-        <w:tblStyle w:val="59"/>
-      </w:tblPr>
-      <w:tcPr>
-        <w:tcBorders>
-          <w:top w:val="nil"/>
-          <w:left w:val="nil"/>
-          <w:bottom w:val="nil"/>
-          <w:right w:val="nil"/>
-          <w:insideH w:val="nil"/>
-          <w:insideV w:val="nil"/>
-          <w:tl2br w:val="nil"/>
-          <w:tr2bl w:val="nil"/>
-        </w:tcBorders>
-        <w:shd w:val="solid" w:color="000080" w:fill="FFFFFF"/>
-      </w:tcPr>
-    </w:tblStylePr>
-    <w:tblStylePr w:type="lastRow">
-      <w:rPr>
-        <w:b w:val="0"/>
-        <w:bCs w:val="0"/>
-      </w:rPr>
-      <w:tblPr>
-        <w:tblStyle w:val="59"/>
-      </w:tblPr>
-      <w:tcPr>
-        <w:tcBorders>
-          <w:top w:val="nil"/>
-          <w:left w:val="nil"/>
-          <w:bottom w:val="nil"/>
-          <w:right w:val="nil"/>
-          <w:insideH w:val="nil"/>
-          <w:insideV w:val="nil"/>
-          <w:tl2br w:val="nil"/>
-          <w:tr2bl w:val="nil"/>
-        </w:tcBorders>
-      </w:tcPr>
-    </w:tblStylePr>
-    <w:tblStylePr w:type="firstCol">
-      <w:rPr>
-        <w:b w:val="0"/>
-        <w:bCs w:val="0"/>
-        <w:color w:val="000000"/>
-      </w:rPr>
-      <w:tblPr>
-        <w:tblStyle w:val="59"/>
-      </w:tblPr>
-      <w:tcPr>
-        <w:tcBorders>
-          <w:top w:val="nil"/>
-          <w:left w:val="nil"/>
-          <w:bottom w:val="nil"/>
-          <w:right w:val="nil"/>
-          <w:insideH w:val="nil"/>
-          <w:insideV w:val="nil"/>
-          <w:tl2br w:val="nil"/>
-          <w:tr2bl w:val="nil"/>
-        </w:tcBorders>
-      </w:tcPr>
-    </w:tblStylePr>
-    <w:tblStylePr w:type="lastCol">
-      <w:rPr>
-        <w:b w:val="0"/>
-        <w:bCs w:val="0"/>
-      </w:rPr>
-      <w:tblPr>
-        <w:tblStyle w:val="59"/>
-      </w:tblPr>
-      <w:tcPr>
-        <w:tcBorders>
-          <w:top w:val="nil"/>
-          <w:left w:val="nil"/>
-          <w:bottom w:val="nil"/>
-          <w:right w:val="nil"/>
-          <w:insideH w:val="nil"/>
-          <w:insideV w:val="nil"/>
-          <w:tl2br w:val="nil"/>
-          <w:tr2bl w:val="nil"/>
-        </w:tcBorders>
-      </w:tcPr>
-    </w:tblStylePr>
-    <w:tblStylePr w:type="band1Vert">
-      <w:rPr>
-        <w:color w:val="auto"/>
-      </w:rPr>
-      <w:tblPr>
-        <w:tblStyle w:val="59"/>
-      </w:tblPr>
-      <w:tcPr>
-        <w:shd w:val="pct30" w:color="000000" w:fill="FFFFFF"/>
-      </w:tcPr>
-    </w:tblStylePr>
-    <w:tblStylePr w:type="band2Vert">
-      <w:rPr>
-        <w:color w:val="auto"/>
-      </w:rPr>
-      <w:tblPr>
-        <w:tblStyle w:val="59"/>
-      </w:tblPr>
-      <w:tcPr>
-        <w:shd w:val="pct25" w:color="00FF00" w:fill="FFFFFF"/>
-      </w:tcPr>
-    </w:tblStylePr>
-    <w:tblStylePr w:type="neCell">
-      <w:rPr>
-        <w:b/>
-        <w:bCs/>
-      </w:rPr>
-      <w:tblPr>
-        <w:tblStyle w:val="59"/>
-      </w:tblPr>
-      <w:tcPr>
-        <w:tcBorders>
-          <w:top w:val="nil"/>
-          <w:left w:val="nil"/>
-          <w:bottom w:val="nil"/>
-          <w:right w:val="nil"/>
-          <w:insideH w:val="nil"/>
-          <w:insideV w:val="nil"/>
-          <w:tl2br w:val="nil"/>
-          <w:tr2bl w:val="nil"/>
-        </w:tcBorders>
-      </w:tcPr>
-    </w:tblStylePr>
-    <w:tblStylePr w:type="swCell">
-      <w:rPr>
-        <w:b/>
-        <w:bCs/>
-      </w:rPr>
-      <w:tblPr>
-        <w:tblStyle w:val="59"/>
-      </w:tblPr>
-      <w:tcPr>
-        <w:tcBorders>
-          <w:top w:val="nil"/>
-          <w:left w:val="nil"/>
-          <w:bottom w:val="nil"/>
-          <w:right w:val="nil"/>
-          <w:insideH w:val="nil"/>
-          <w:insideV w:val="nil"/>
-          <w:tl2br w:val="nil"/>
-          <w:tr2bl w:val="nil"/>
-        </w:tcBorders>
-      </w:tcPr>
-    </w:tblStylePr>
-  </w:style>
-  <w:style w:type="table" w:styleId="89">
-    <w:name w:val="Table Columns 3"/>
-    <w:basedOn w:val="59"/>
-    <w:semiHidden/>
-    <w:uiPriority w:val="0"/>
-    <w:pPr>
-      <w:widowControl w:val="0"/>
-      <w:jc w:val="both"/>
-    </w:pPr>
-    <w:rPr>
-      <w:b/>
-      <w:bCs/>
-    </w:rPr>
-    <w:tblPr>
-      <w:tblStyle w:val="59"/>
-      <w:tblStyleColBandSize w:val="1"/>
       <w:tblBorders>
         <w:top w:val="single" w:color="000080" w:sz="6" w:space="0"/>
         <w:left w:val="single" w:color="000080" w:sz="6" w:space="0"/>
@@ -11157,9 +10762,7 @@
       <w:rPr>
         <w:color w:val="FFFFFF"/>
       </w:rPr>
-      <w:tblPr>
-        <w:tblStyle w:val="59"/>
-      </w:tblPr>
+      <w:tblPr/>
       <w:tcPr>
         <w:tcBorders>
           <w:top w:val="nil"/>
@@ -11179,9 +10782,7 @@
         <w:b w:val="0"/>
         <w:bCs w:val="0"/>
       </w:rPr>
-      <w:tblPr>
-        <w:tblStyle w:val="59"/>
-      </w:tblPr>
+      <w:tblPr/>
       <w:tcPr>
         <w:tcBorders>
           <w:top w:val="single" w:color="000080" w:sz="6" w:space="0"/>
@@ -11200,9 +10801,7 @@
         <w:b w:val="0"/>
         <w:bCs w:val="0"/>
       </w:rPr>
-      <w:tblPr>
-        <w:tblStyle w:val="59"/>
-      </w:tblPr>
+      <w:tblPr/>
       <w:tcPr>
         <w:tcBorders>
           <w:top w:val="nil"/>
@@ -11221,9 +10820,7 @@
         <w:b w:val="0"/>
         <w:bCs w:val="0"/>
       </w:rPr>
-      <w:tblPr>
-        <w:tblStyle w:val="59"/>
-      </w:tblPr>
+      <w:tblPr/>
       <w:tcPr>
         <w:tcBorders>
           <w:top w:val="nil"/>
@@ -11241,9 +10838,7 @@
       <w:rPr>
         <w:color w:val="auto"/>
       </w:rPr>
-      <w:tblPr>
-        <w:tblStyle w:val="59"/>
-      </w:tblPr>
+      <w:tblPr/>
       <w:tcPr>
         <w:shd w:val="solid" w:color="C0C0C0" w:fill="FFFFFF"/>
       </w:tcPr>
@@ -11252,9 +10847,7 @@
       <w:rPr>
         <w:color w:val="auto"/>
       </w:rPr>
-      <w:tblPr>
-        <w:tblStyle w:val="59"/>
-      </w:tblPr>
+      <w:tblPr/>
       <w:tcPr>
         <w:shd w:val="pct10" w:color="000000" w:fill="FFFFFF"/>
       </w:tcPr>
@@ -11264,9 +10857,7 @@
         <w:b/>
         <w:bCs/>
       </w:rPr>
-      <w:tblPr>
-        <w:tblStyle w:val="59"/>
-      </w:tblPr>
+      <w:tblPr/>
       <w:tcPr>
         <w:tcBorders>
           <w:top w:val="nil"/>
@@ -11283,6 +10874,92 @@
   </w:style>
   <w:style w:type="table" w:styleId="90">
     <w:name w:val="Table Columns 4"/>
+    <w:basedOn w:val="59"/>
+    <w:semiHidden/>
+    <w:uiPriority w:val="0"/>
+    <w:pPr>
+      <w:widowControl w:val="0"/>
+      <w:jc w:val="both"/>
+    </w:pPr>
+    <w:tblPr/>
+    <w:tblStylePr w:type="firstRow">
+      <w:rPr>
+        <w:color w:val="FFFFFF"/>
+      </w:rPr>
+      <w:tblPr/>
+      <w:tcPr>
+        <w:tcBorders>
+          <w:top w:val="nil"/>
+          <w:left w:val="nil"/>
+          <w:bottom w:val="nil"/>
+          <w:right w:val="nil"/>
+          <w:insideH w:val="nil"/>
+          <w:insideV w:val="nil"/>
+          <w:tl2br w:val="nil"/>
+          <w:tr2bl w:val="nil"/>
+        </w:tcBorders>
+        <w:shd w:val="solid" w:color="000000" w:fill="FFFFFF"/>
+      </w:tcPr>
+    </w:tblStylePr>
+    <w:tblStylePr w:type="lastRow">
+      <w:rPr>
+        <w:b/>
+        <w:bCs/>
+      </w:rPr>
+      <w:tblPr/>
+      <w:tcPr>
+        <w:tcBorders>
+          <w:top w:val="nil"/>
+          <w:left w:val="nil"/>
+          <w:bottom w:val="nil"/>
+          <w:right w:val="nil"/>
+          <w:insideH w:val="nil"/>
+          <w:insideV w:val="nil"/>
+          <w:tl2br w:val="nil"/>
+          <w:tr2bl w:val="nil"/>
+        </w:tcBorders>
+      </w:tcPr>
+    </w:tblStylePr>
+    <w:tblStylePr w:type="lastCol">
+      <w:rPr>
+        <w:b/>
+        <w:bCs/>
+      </w:rPr>
+      <w:tblPr/>
+      <w:tcPr>
+        <w:tcBorders>
+          <w:top w:val="nil"/>
+          <w:left w:val="nil"/>
+          <w:bottom w:val="nil"/>
+          <w:right w:val="nil"/>
+          <w:insideH w:val="nil"/>
+          <w:insideV w:val="nil"/>
+          <w:tl2br w:val="nil"/>
+          <w:tr2bl w:val="nil"/>
+        </w:tcBorders>
+      </w:tcPr>
+    </w:tblStylePr>
+    <w:tblStylePr w:type="band1Vert">
+      <w:rPr>
+        <w:color w:val="auto"/>
+      </w:rPr>
+      <w:tblPr/>
+      <w:tcPr>
+        <w:shd w:val="pct50" w:color="008080" w:fill="FFFFFF"/>
+      </w:tcPr>
+    </w:tblStylePr>
+    <w:tblStylePr w:type="band2Vert">
+      <w:rPr>
+        <w:color w:val="auto"/>
+      </w:rPr>
+      <w:tblPr/>
+      <w:tcPr>
+        <w:shd w:val="pct10" w:color="000000" w:fill="FFFFFF"/>
+      </w:tcPr>
+    </w:tblStylePr>
+  </w:style>
+  <w:style w:type="table" w:styleId="91">
+    <w:name w:val="Table Columns 5"/>
     <w:basedOn w:val="59"/>
     <w:semiHidden/>
     <w:uiPriority w:val="0"/>
@@ -11291,107 +10968,6 @@
       <w:jc w:val="both"/>
     </w:pPr>
     <w:tblPr>
-      <w:tblStyle w:val="59"/>
-      <w:tblStyleColBandSize w:val="1"/>
-    </w:tblPr>
-    <w:tblStylePr w:type="firstRow">
-      <w:rPr>
-        <w:color w:val="FFFFFF"/>
-      </w:rPr>
-      <w:tblPr>
-        <w:tblStyle w:val="59"/>
-      </w:tblPr>
-      <w:tcPr>
-        <w:tcBorders>
-          <w:top w:val="nil"/>
-          <w:left w:val="nil"/>
-          <w:bottom w:val="nil"/>
-          <w:right w:val="nil"/>
-          <w:insideH w:val="nil"/>
-          <w:insideV w:val="nil"/>
-          <w:tl2br w:val="nil"/>
-          <w:tr2bl w:val="nil"/>
-        </w:tcBorders>
-        <w:shd w:val="solid" w:color="000000" w:fill="FFFFFF"/>
-      </w:tcPr>
-    </w:tblStylePr>
-    <w:tblStylePr w:type="lastRow">
-      <w:rPr>
-        <w:b/>
-        <w:bCs/>
-      </w:rPr>
-      <w:tblPr>
-        <w:tblStyle w:val="59"/>
-      </w:tblPr>
-      <w:tcPr>
-        <w:tcBorders>
-          <w:top w:val="nil"/>
-          <w:left w:val="nil"/>
-          <w:bottom w:val="nil"/>
-          <w:right w:val="nil"/>
-          <w:insideH w:val="nil"/>
-          <w:insideV w:val="nil"/>
-          <w:tl2br w:val="nil"/>
-          <w:tr2bl w:val="nil"/>
-        </w:tcBorders>
-      </w:tcPr>
-    </w:tblStylePr>
-    <w:tblStylePr w:type="lastCol">
-      <w:rPr>
-        <w:b/>
-        <w:bCs/>
-      </w:rPr>
-      <w:tblPr>
-        <w:tblStyle w:val="59"/>
-      </w:tblPr>
-      <w:tcPr>
-        <w:tcBorders>
-          <w:top w:val="nil"/>
-          <w:left w:val="nil"/>
-          <w:bottom w:val="nil"/>
-          <w:right w:val="nil"/>
-          <w:insideH w:val="nil"/>
-          <w:insideV w:val="nil"/>
-          <w:tl2br w:val="nil"/>
-          <w:tr2bl w:val="nil"/>
-        </w:tcBorders>
-      </w:tcPr>
-    </w:tblStylePr>
-    <w:tblStylePr w:type="band1Vert">
-      <w:rPr>
-        <w:color w:val="auto"/>
-      </w:rPr>
-      <w:tblPr>
-        <w:tblStyle w:val="59"/>
-      </w:tblPr>
-      <w:tcPr>
-        <w:shd w:val="pct50" w:color="008080" w:fill="FFFFFF"/>
-      </w:tcPr>
-    </w:tblStylePr>
-    <w:tblStylePr w:type="band2Vert">
-      <w:rPr>
-        <w:color w:val="auto"/>
-      </w:rPr>
-      <w:tblPr>
-        <w:tblStyle w:val="59"/>
-      </w:tblPr>
-      <w:tcPr>
-        <w:shd w:val="pct10" w:color="000000" w:fill="FFFFFF"/>
-      </w:tcPr>
-    </w:tblStylePr>
-  </w:style>
-  <w:style w:type="table" w:styleId="91">
-    <w:name w:val="Table Columns 5"/>
-    <w:basedOn w:val="59"/>
-    <w:semiHidden/>
-    <w:uiPriority w:val="0"/>
-    <w:pPr>
-      <w:widowControl w:val="0"/>
-      <w:jc w:val="both"/>
-    </w:pPr>
-    <w:tblPr>
-      <w:tblStyle w:val="59"/>
-      <w:tblStyleColBandSize w:val="1"/>
       <w:tblBorders>
         <w:top w:val="single" w:color="808080" w:sz="12" w:space="0"/>
         <w:left w:val="single" w:color="808080" w:sz="12" w:space="0"/>
@@ -11407,9 +10983,7 @@
         <w:i/>
         <w:iCs/>
       </w:rPr>
-      <w:tblPr>
-        <w:tblStyle w:val="59"/>
-      </w:tblPr>
+      <w:tblPr/>
       <w:tcPr>
         <w:tcBorders>
           <w:top w:val="nil"/>
@@ -11428,9 +11002,7 @@
         <w:b/>
         <w:bCs/>
       </w:rPr>
-      <w:tblPr>
-        <w:tblStyle w:val="59"/>
-      </w:tblPr>
+      <w:tblPr/>
       <w:tcPr>
         <w:tcBorders>
           <w:top w:val="single" w:color="808080" w:sz="6" w:space="0"/>
@@ -11449,9 +11021,7 @@
         <w:b/>
         <w:bCs/>
       </w:rPr>
-      <w:tblPr>
-        <w:tblStyle w:val="59"/>
-      </w:tblPr>
+      <w:tblPr/>
       <w:tcPr>
         <w:tcBorders>
           <w:top w:val="nil"/>
@@ -11470,9 +11040,7 @@
         <w:b/>
         <w:bCs/>
       </w:rPr>
-      <w:tblPr>
-        <w:tblStyle w:val="59"/>
-      </w:tblPr>
+      <w:tblPr/>
       <w:tcPr>
         <w:tcBorders>
           <w:top w:val="nil"/>
@@ -11490,9 +11058,7 @@
       <w:rPr>
         <w:color w:val="auto"/>
       </w:rPr>
-      <w:tblPr>
-        <w:tblStyle w:val="59"/>
-      </w:tblPr>
+      <w:tblPr/>
       <w:tcPr>
         <w:shd w:val="solid" w:color="C0C0C0" w:fill="FFFFFF"/>
       </w:tcPr>
@@ -11513,7 +11079,6 @@
       <w:jc w:val="both"/>
     </w:pPr>
     <w:tblPr>
-      <w:tblStyle w:val="59"/>
       <w:tblBorders>
         <w:top w:val="single" w:color="000000" w:sz="6" w:space="0"/>
         <w:left w:val="single" w:color="000000" w:sz="6" w:space="0"/>
@@ -11531,9 +11096,7 @@
         <w:i/>
         <w:iCs/>
       </w:rPr>
-      <w:tblPr>
-        <w:tblStyle w:val="59"/>
-      </w:tblPr>
+      <w:tblPr/>
       <w:tcPr>
         <w:tcBorders>
           <w:top w:val="nil"/>
@@ -11552,9 +11115,7 @@
         <w:i/>
         <w:iCs/>
       </w:rPr>
-      <w:tblPr>
-        <w:tblStyle w:val="59"/>
-      </w:tblPr>
+      <w:tblPr/>
       <w:tcPr>
         <w:tcBorders>
           <w:top w:val="nil"/>
@@ -11569,9 +11130,7 @@
       </w:tcPr>
     </w:tblStylePr>
     <w:tblStylePr w:type="nwCell">
-      <w:tblPr>
-        <w:tblStyle w:val="59"/>
-      </w:tblPr>
+      <w:tblPr/>
       <w:tcPr>
         <w:tcBorders>
           <w:top w:val="nil"/>
@@ -11596,7 +11155,6 @@
       <w:jc w:val="both"/>
     </w:pPr>
     <w:tblPr>
-      <w:tblStyle w:val="59"/>
       <w:tblBorders>
         <w:insideH w:val="single" w:color="000000" w:sz="6" w:space="0"/>
         <w:insideV w:val="single" w:color="000000" w:sz="6" w:space="0"/>
@@ -11610,9 +11168,7 @@
         <w:b/>
         <w:bCs/>
       </w:rPr>
-      <w:tblPr>
-        <w:tblStyle w:val="59"/>
-      </w:tblPr>
+      <w:tblPr/>
       <w:tcPr>
         <w:tcBorders>
           <w:top w:val="nil"/>
@@ -11631,9 +11187,7 @@
         <w:b/>
         <w:bCs/>
       </w:rPr>
-      <w:tblPr>
-        <w:tblStyle w:val="59"/>
-      </w:tblPr>
+      <w:tblPr/>
       <w:tcPr>
         <w:tcBorders>
           <w:top w:val="single" w:color="000000" w:sz="6" w:space="0"/>
@@ -11652,9 +11206,7 @@
         <w:b/>
         <w:bCs/>
       </w:rPr>
-      <w:tblPr>
-        <w:tblStyle w:val="59"/>
-      </w:tblPr>
+      <w:tblPr/>
       <w:tcPr>
         <w:tcBorders>
           <w:top w:val="nil"/>
@@ -11673,9 +11225,7 @@
         <w:b/>
         <w:bCs/>
       </w:rPr>
-      <w:tblPr>
-        <w:tblStyle w:val="59"/>
-      </w:tblPr>
+      <w:tblPr/>
       <w:tcPr>
         <w:tcBorders>
           <w:top w:val="nil"/>
@@ -11700,7 +11250,6 @@
       <w:jc w:val="both"/>
     </w:pPr>
     <w:tblPr>
-      <w:tblStyle w:val="59"/>
       <w:tblBorders>
         <w:top w:val="single" w:color="000000" w:sz="6" w:space="0"/>
         <w:left w:val="single" w:color="000000" w:sz="12" w:space="0"/>
@@ -11713,9 +11262,7 @@
       <w:shd w:val="clear" w:color="auto" w:fill="auto"/>
     </w:tcPr>
     <w:tblStylePr w:type="firstRow">
-      <w:tblPr>
-        <w:tblStyle w:val="59"/>
-      </w:tblPr>
+      <w:tblPr/>
       <w:tcPr>
         <w:tcBorders>
           <w:top w:val="nil"/>
@@ -11735,9 +11282,7 @@
         <w:b/>
         <w:bCs/>
       </w:rPr>
-      <w:tblPr>
-        <w:tblStyle w:val="59"/>
-      </w:tblPr>
+      <w:tblPr/>
       <w:tcPr>
         <w:tcBorders>
           <w:top w:val="nil"/>
@@ -11756,9 +11301,7 @@
         <w:b/>
         <w:bCs/>
       </w:rPr>
-      <w:tblPr>
-        <w:tblStyle w:val="59"/>
-      </w:tblPr>
+      <w:tblPr/>
       <w:tcPr>
         <w:tcBorders>
           <w:top w:val="nil"/>
@@ -11773,9 +11316,7 @@
       </w:tcPr>
     </w:tblStylePr>
     <w:tblStylePr w:type="nwCell">
-      <w:tblPr>
-        <w:tblStyle w:val="59"/>
-      </w:tblPr>
+      <w:tblPr/>
       <w:tcPr>
         <w:tcBorders>
           <w:top w:val="nil"/>
@@ -11800,7 +11341,6 @@
       <w:jc w:val="both"/>
     </w:pPr>
     <w:tblPr>
-      <w:tblStyle w:val="59"/>
       <w:tblBorders>
         <w:left w:val="single" w:color="000000" w:sz="12" w:space="0"/>
         <w:right w:val="single" w:color="000000" w:sz="12" w:space="0"/>
@@ -11815,9 +11355,7 @@
       <w:rPr>
         <w:color w:val="auto"/>
       </w:rPr>
-      <w:tblPr>
-        <w:tblStyle w:val="59"/>
-      </w:tblPr>
+      <w:tblPr/>
       <w:tcPr>
         <w:tcBorders>
           <w:top w:val="nil"/>
@@ -11838,9 +11376,7 @@
         <w:bCs/>
         <w:color w:val="auto"/>
       </w:rPr>
-      <w:tblPr>
-        <w:tblStyle w:val="59"/>
-      </w:tblPr>
+      <w:tblPr/>
       <w:tcPr>
         <w:tcBorders>
           <w:top w:val="single" w:color="000000" w:sz="6" w:space="0"/>
@@ -11861,9 +11397,7 @@
         <w:bCs/>
         <w:color w:val="auto"/>
       </w:rPr>
-      <w:tblPr>
-        <w:tblStyle w:val="59"/>
-      </w:tblPr>
+      <w:tblPr/>
       <w:tcPr>
         <w:tcBorders>
           <w:top w:val="nil"/>
@@ -11888,7 +11422,6 @@
       <w:jc w:val="both"/>
     </w:pPr>
     <w:tblPr>
-      <w:tblStyle w:val="59"/>
       <w:tblBorders>
         <w:top w:val="single" w:color="000000" w:sz="12" w:space="0"/>
         <w:left w:val="single" w:color="000000" w:sz="12" w:space="0"/>
@@ -11902,9 +11435,7 @@
       <w:shd w:val="clear" w:color="auto" w:fill="auto"/>
     </w:tcPr>
     <w:tblStylePr w:type="firstRow">
-      <w:tblPr>
-        <w:tblStyle w:val="59"/>
-      </w:tblPr>
+      <w:tblPr/>
       <w:tcPr>
         <w:tcBorders>
           <w:top w:val="nil"/>
@@ -11923,9 +11454,7 @@
         <w:b/>
         <w:bCs/>
       </w:rPr>
-      <w:tblPr>
-        <w:tblStyle w:val="59"/>
-      </w:tblPr>
+      <w:tblPr/>
       <w:tcPr>
         <w:tcBorders>
           <w:top w:val="nil"/>
@@ -11944,9 +11473,7 @@
         <w:b/>
         <w:bCs/>
       </w:rPr>
-      <w:tblPr>
-        <w:tblStyle w:val="59"/>
-      </w:tblPr>
+      <w:tblPr/>
       <w:tcPr>
         <w:tcBorders>
           <w:top w:val="nil"/>
@@ -11961,9 +11488,7 @@
       </w:tcPr>
     </w:tblStylePr>
     <w:tblStylePr w:type="nwCell">
-      <w:tblPr>
-        <w:tblStyle w:val="59"/>
-      </w:tblPr>
+      <w:tblPr/>
       <w:tcPr>
         <w:tcBorders>
           <w:top w:val="nil"/>
@@ -11988,7 +11513,6 @@
       <w:jc w:val="both"/>
     </w:pPr>
     <w:tblPr>
-      <w:tblStyle w:val="59"/>
       <w:tblBorders>
         <w:top w:val="single" w:color="000000" w:sz="12" w:space="0"/>
         <w:left w:val="single" w:color="000000" w:sz="12" w:space="0"/>
@@ -12005,9 +11529,7 @@
         <w:b/>
         <w:bCs/>
       </w:rPr>
-      <w:tblPr>
-        <w:tblStyle w:val="59"/>
-      </w:tblPr>
+      <w:tblPr/>
       <w:tcPr>
         <w:tcBorders>
           <w:top w:val="nil"/>
@@ -12025,9 +11547,7 @@
       <w:rPr>
         <w:color w:val="auto"/>
       </w:rPr>
-      <w:tblPr>
-        <w:tblStyle w:val="59"/>
-      </w:tblPr>
+      <w:tblPr/>
       <w:tcPr>
         <w:tcBorders>
           <w:top w:val="single" w:color="000000" w:sz="6" w:space="0"/>
@@ -12046,9 +11566,7 @@
         <w:b/>
         <w:bCs/>
       </w:rPr>
-      <w:tblPr>
-        <w:tblStyle w:val="59"/>
-      </w:tblPr>
+      <w:tblPr/>
       <w:tcPr>
         <w:tcBorders>
           <w:top w:val="nil"/>
@@ -12063,9 +11581,7 @@
       </w:tcPr>
     </w:tblStylePr>
     <w:tblStylePr w:type="nwCell">
-      <w:tblPr>
-        <w:tblStyle w:val="59"/>
-      </w:tblPr>
+      <w:tblPr/>
       <w:tcPr>
         <w:tcBorders>
           <w:top w:val="nil"/>
@@ -12094,7 +11610,6 @@
       <w:bCs/>
     </w:rPr>
     <w:tblPr>
-      <w:tblStyle w:val="59"/>
       <w:tblBorders>
         <w:top w:val="single" w:color="000000" w:sz="12" w:space="0"/>
         <w:left w:val="single" w:color="000000" w:sz="12" w:space="0"/>
@@ -12112,9 +11627,7 @@
         <w:b w:val="0"/>
         <w:bCs w:val="0"/>
       </w:rPr>
-      <w:tblPr>
-        <w:tblStyle w:val="59"/>
-      </w:tblPr>
+      <w:tblPr/>
       <w:tcPr>
         <w:tcBorders>
           <w:top w:val="nil"/>
@@ -12133,9 +11646,7 @@
         <w:b w:val="0"/>
         <w:bCs w:val="0"/>
       </w:rPr>
-      <w:tblPr>
-        <w:tblStyle w:val="59"/>
-      </w:tblPr>
+      <w:tblPr/>
       <w:tcPr>
         <w:tcBorders>
           <w:top w:val="single" w:color="000000" w:sz="6" w:space="0"/>
@@ -12154,9 +11665,7 @@
         <w:b w:val="0"/>
         <w:bCs w:val="0"/>
       </w:rPr>
-      <w:tblPr>
-        <w:tblStyle w:val="59"/>
-      </w:tblPr>
+      <w:tblPr/>
       <w:tcPr>
         <w:tcBorders>
           <w:top w:val="nil"/>
@@ -12175,9 +11684,7 @@
         <w:b w:val="0"/>
         <w:bCs w:val="0"/>
       </w:rPr>
-      <w:tblPr>
-        <w:tblStyle w:val="59"/>
-      </w:tblPr>
+      <w:tblPr/>
       <w:tcPr>
         <w:tcBorders>
           <w:top w:val="nil"/>
@@ -12192,9 +11699,7 @@
       </w:tcPr>
     </w:tblStylePr>
     <w:tblStylePr w:type="nwCell">
-      <w:tblPr>
-        <w:tblStyle w:val="59"/>
-      </w:tblPr>
+      <w:tblPr/>
       <w:tcPr>
         <w:tcBorders>
           <w:top w:val="nil"/>
@@ -12219,7 +11724,6 @@
       <w:jc w:val="both"/>
     </w:pPr>
     <w:tblPr>
-      <w:tblStyle w:val="59"/>
       <w:tblBorders>
         <w:top w:val="single" w:color="000080" w:sz="6" w:space="0"/>
         <w:left w:val="single" w:color="000080" w:sz="6" w:space="0"/>
@@ -12238,9 +11742,7 @@
         <w:bCs/>
         <w:color w:val="FFFFFF"/>
       </w:rPr>
-      <w:tblPr>
-        <w:tblStyle w:val="59"/>
-      </w:tblPr>
+      <w:tblPr/>
       <w:tcPr>
         <w:tcBorders>
           <w:top w:val="nil"/>
@@ -12261,9 +11763,7 @@
         <w:bCs/>
         <w:color w:val="auto"/>
       </w:rPr>
-      <w:tblPr>
-        <w:tblStyle w:val="59"/>
-      </w:tblPr>
+      <w:tblPr/>
       <w:tcPr>
         <w:tcBorders>
           <w:top w:val="nil"/>
@@ -12283,9 +11783,7 @@
         <w:bCs/>
         <w:color w:val="auto"/>
       </w:rPr>
-      <w:tblPr>
-        <w:tblStyle w:val="59"/>
-      </w:tblPr>
+      <w:tblPr/>
       <w:tcPr>
         <w:tcBorders>
           <w:top w:val="nil"/>
@@ -12310,7 +11808,6 @@
       <w:jc w:val="both"/>
     </w:pPr>
     <w:tblPr>
-      <w:tblStyle w:val="59"/>
       <w:tblCellSpacing w:w="20" w:type="dxa"/>
       <w:tblBorders>
         <w:top w:val="outset" w:color="auto" w:sz="6" w:space="0"/>
@@ -12331,9 +11828,7 @@
       <w:rPr>
         <w:color w:val="auto"/>
       </w:rPr>
-      <w:tblPr>
-        <w:tblStyle w:val="59"/>
-      </w:tblPr>
+      <w:tblPr/>
       <w:tcPr>
         <w:tcBorders>
           <w:top w:val="nil"/>
@@ -12358,7 +11853,6 @@
       <w:jc w:val="both"/>
     </w:pPr>
     <w:tblPr>
-      <w:tblStyle w:val="59"/>
       <w:tblCellSpacing w:w="20" w:type="dxa"/>
       <w:tblBorders>
         <w:top w:val="inset" w:color="auto" w:sz="6" w:space="0"/>
@@ -12379,9 +11873,7 @@
       <w:rPr>
         <w:color w:val="auto"/>
       </w:rPr>
-      <w:tblPr>
-        <w:tblStyle w:val="59"/>
-      </w:tblPr>
+      <w:tblPr/>
       <w:tcPr>
         <w:tcBorders>
           <w:top w:val="nil"/>
@@ -12406,7 +11898,6 @@
       <w:jc w:val="both"/>
     </w:pPr>
     <w:tblPr>
-      <w:tblStyle w:val="59"/>
       <w:tblCellSpacing w:w="20" w:type="dxa"/>
       <w:tblBorders>
         <w:top w:val="outset" w:color="auto" w:sz="24" w:space="0"/>
@@ -12427,9 +11918,7 @@
       <w:rPr>
         <w:color w:val="auto"/>
       </w:rPr>
-      <w:tblPr>
-        <w:tblStyle w:val="59"/>
-      </w:tblPr>
+      <w:tblPr/>
       <w:tcPr>
         <w:tcBorders>
           <w:top w:val="nil"/>
@@ -12454,7 +11943,6 @@
       <w:jc w:val="both"/>
     </w:pPr>
     <w:tblPr>
-      <w:tblStyle w:val="59"/>
       <w:tblBorders>
         <w:top w:val="single" w:color="000000" w:sz="6" w:space="0"/>
         <w:left w:val="single" w:color="000000" w:sz="6" w:space="0"/>
@@ -12473,9 +11961,7 @@
         <w:bCs/>
         <w:color w:val="auto"/>
       </w:rPr>
-      <w:tblPr>
-        <w:tblStyle w:val="59"/>
-      </w:tblPr>
+      <w:tblPr/>
       <w:tcPr>
         <w:tcBorders>
           <w:top w:val="nil"/>

</xml_diff>